<commit_message>
Update TDKT version 1.0 build 2026.03.04.
</commit_message>
<xml_diff>
--- a/articles/TuDoKinhTe.docx
+++ b/articles/TuDoKinhTe.docx
@@ -260,7 +260,6 @@
           <w:id w:val="42177861"/>
           <w:citation/>
         </w:sdtPr>
-        <w:sdtEndPr/>
         <w:sdtContent>
           <w:r>
             <w:fldChar w:fldCharType="begin"/>
@@ -317,7 +316,6 @@
           <w:id w:val="-395967604"/>
           <w:citation/>
         </w:sdtPr>
-        <w:sdtEndPr/>
         <w:sdtContent>
           <w:r>
             <w:fldChar w:fldCharType="begin"/>
@@ -385,7 +383,6 @@
           <w:id w:val="1744067340"/>
           <w:citation/>
         </w:sdtPr>
-        <w:sdtEndPr/>
         <w:sdtContent>
           <w:r>
             <w:fldChar w:fldCharType="begin"/>
@@ -515,7 +512,6 @@
           <w:id w:val="-329215548"/>
           <w:citation/>
         </w:sdtPr>
-        <w:sdtEndPr/>
         <w:sdtContent>
           <w:r>
             <w:fldChar w:fldCharType="begin"/>
@@ -645,7 +641,6 @@
           <w:id w:val="-904222501"/>
           <w:citation/>
         </w:sdtPr>
-        <w:sdtEndPr/>
         <w:sdtContent>
           <w:r>
             <w:fldChar w:fldCharType="begin"/>
@@ -1207,7 +1202,6 @@
           <w:id w:val="-345332193"/>
           <w:citation/>
         </w:sdtPr>
-        <w:sdtEndPr/>
         <w:sdtContent>
           <w:r>
             <w:fldChar w:fldCharType="begin"/>
@@ -1369,7 +1363,6 @@
           <w:id w:val="1618031275"/>
           <w:citation/>
         </w:sdtPr>
-        <w:sdtEndPr/>
         <w:sdtContent>
           <w:r>
             <w:fldChar w:fldCharType="begin"/>
@@ -1485,7 +1478,6 @@
           <w:id w:val="1335890707"/>
           <w:citation/>
         </w:sdtPr>
-        <w:sdtEndPr/>
         <w:sdtContent>
           <w:r>
             <w:fldChar w:fldCharType="begin"/>
@@ -1674,7 +1666,6 @@
           <w:id w:val="212092317"/>
           <w:citation/>
         </w:sdtPr>
-        <w:sdtEndPr/>
         <w:sdtContent>
           <w:r>
             <w:fldChar w:fldCharType="begin"/>
@@ -1825,7 +1816,6 @@
           <w:id w:val="-915240487"/>
           <w:citation/>
         </w:sdtPr>
-        <w:sdtEndPr/>
         <w:sdtContent>
           <w:r>
             <w:fldChar w:fldCharType="begin"/>
@@ -1890,7 +1880,6 @@
           <w:id w:val="1155032337"/>
           <w:citation/>
         </w:sdtPr>
-        <w:sdtEndPr/>
         <w:sdtContent>
           <w:r>
             <w:fldChar w:fldCharType="begin"/>
@@ -1985,7 +1974,6 @@
           <w:id w:val="-844630650"/>
           <w:citation/>
         </w:sdtPr>
-        <w:sdtEndPr/>
         <w:sdtContent>
           <w:r>
             <w:fldChar w:fldCharType="begin"/>
@@ -2388,7 +2376,16 @@
         <w:t>giá trị của đồng tiền</w:t>
       </w:r>
       <w:r>
-        <w:t xml:space="preserve"> (quốc gia) để lượng tiền luôn được đặt trong ngữ cảnh giá trị của đồng tiền.</w:t>
+        <w:t xml:space="preserve"> [</w:t>
+      </w:r>
+      <w:r>
+        <w:t>quốc gia</w:t>
+      </w:r>
+      <w:r>
+        <w:t>]</w:t>
+      </w:r>
+      <w:r>
+        <w:t xml:space="preserve"> để lượng tiền luôn được đặt trong ngữ cảnh giá trị của đồng tiền.</w:t>
       </w:r>
       <w:r>
         <w:t xml:space="preserve"> Một cách chính xác, theo Gemini 2025, giá trị của đồng tiền được xác định bởi sự cân bằng giữa cung </w:t>
@@ -2790,7 +2787,15 @@
         <w:t xml:space="preserve">nguyên vật liệu, </w:t>
       </w:r>
       <w:r>
-        <w:t xml:space="preserve">nhà xưởng, máy móc,…) </w:t>
+        <w:t xml:space="preserve">nhà xưởng, máy </w:t>
+      </w:r>
+      <w:proofErr w:type="gramStart"/>
+      <w:r>
+        <w:t>móc,…</w:t>
+      </w:r>
+      <w:proofErr w:type="gramEnd"/>
+      <w:r>
+        <w:t xml:space="preserve">) </w:t>
       </w:r>
       <w:r>
         <w:t xml:space="preserve">được sử dụng trong sản xuất ngoài tiền công và ngoài chi phí cho bên thứ ba, </w:t>
@@ -3199,12 +3204,7 @@
         <w:t xml:space="preserve">Nhà tư bản còn có những vốn (thế năng) khác tuy vô hình nhưng cực kỳ có giá trị như nắm bắt nhu cầu, đi đầu chuỗi cung ứng. </w:t>
       </w:r>
       <w:r>
-        <w:t xml:space="preserve">Ghi chú &amp; lưu ý: tỉ suất lợi nhuận không tuyến tính với vốn mà thường đi theo hàm số phi tuyến, ví dụ, 10 đồng vốn cho 2 đồng lời tối đa nên 20 đồng cho 4 đồng lời (tuyến tính) nhưng 30 đồng </w:t>
-      </w:r>
-      <w:bookmarkStart w:id="6" w:name="_GoBack"/>
-      <w:bookmarkEnd w:id="6"/>
-      <w:r>
-        <w:t xml:space="preserve">có thể cho nhiều hơn 6 đồng lời (phi tuyến) vì bóc lột và/hoặc kỹ năng sản xuất </w:t>
+        <w:t xml:space="preserve">Ghi chú &amp; lưu ý: tỉ suất lợi nhuận không tuyến tính với vốn mà thường đi theo hàm số phi tuyến, ví dụ, 10 đồng vốn cho 2 đồng lời tối đa nên 20 đồng cho 4 đồng lời (tuyến tính) nhưng 30 đồng có thể cho nhiều hơn 6 đồng lời (phi tuyến) vì bóc lột và/hoặc kỹ năng sản xuất </w:t>
       </w:r>
       <w:r>
         <w:rPr>
@@ -3422,11 +3422,16 @@
         <w:t>,</w:t>
       </w:r>
       <w:r>
-        <w:t xml:space="preserve"> sở hữu trí tuệ</w:t>
+        <w:t xml:space="preserve"> sở hữu trí </w:t>
+      </w:r>
+      <w:proofErr w:type="gramStart"/>
+      <w:r>
+        <w:t>tuệ</w:t>
       </w:r>
       <w:r>
         <w:t>,…</w:t>
       </w:r>
+      <w:proofErr w:type="gramEnd"/>
       <w:r>
         <w:t xml:space="preserve"> thuộc trình độ sản xuất</w:t>
       </w:r>
@@ -3513,7 +3518,6 @@
           <w:id w:val="-928275484"/>
           <w:citation/>
         </w:sdtPr>
-        <w:sdtEndPr/>
         <w:sdtContent>
           <w:r>
             <w:fldChar w:fldCharType="begin"/>
@@ -3567,7 +3571,6 @@
           <w:id w:val="-1437976585"/>
           <w:citation/>
         </w:sdtPr>
-        <w:sdtEndPr/>
         <w:sdtContent>
           <w:r>
             <w:fldChar w:fldCharType="begin"/>
@@ -3629,7 +3632,16 @@
         <w:t>tiền công</w:t>
       </w:r>
       <w:r>
-        <w:t xml:space="preserve"> trong giá cả tự nhiên cũng như nhân lực trong nền kinh tế, một yếu tố sống còn.</w:t>
+        <w:t xml:space="preserve"> trong giá cả tự nhiên cũng như nhân lực trong nền kinh tế, </w:t>
+      </w:r>
+      <w:r>
+        <w:rPr>
+          <w:i/>
+        </w:rPr>
+        <w:t>một yếu tố sống còn</w:t>
+      </w:r>
+      <w:r>
+        <w:t>.</w:t>
       </w:r>
       <w:r>
         <w:t xml:space="preserve"> </w:t>
@@ -3642,7 +3654,6 @@
           <w:id w:val="858865724"/>
           <w:citation/>
         </w:sdtPr>
-        <w:sdtEndPr/>
         <w:sdtContent>
           <w:r>
             <w:fldChar w:fldCharType="begin"/>
@@ -4305,7 +4316,15 @@
         <w:t xml:space="preserve">lượng tiền, </w:t>
       </w:r>
       <w:r>
-        <w:t>lượng lao động, lượng thỏa mãn, trình độ sản xuất,… nhưng vốn tổng quát hơn hàng hóa mà vẫn cụ thể như hàng hóa</w:t>
+        <w:t xml:space="preserve">lượng lao động, lượng thỏa mãn, trình độ sản </w:t>
+      </w:r>
+      <w:proofErr w:type="gramStart"/>
+      <w:r>
+        <w:t>xuất,…</w:t>
+      </w:r>
+      <w:proofErr w:type="gramEnd"/>
+      <w:r>
+        <w:t xml:space="preserve"> nhưng vốn tổng quát hơn hàng hóa mà vẫn cụ thể như hàng hóa</w:t>
       </w:r>
       <w:r>
         <w:t>. Vốn không hoàn toàn cố định như nhà xưởng đất đai và cũng không hoàn toàn lưu động như chi thường xuyên</w:t>
@@ -4394,7 +4413,15 @@
         <w:t>vốn</w:t>
       </w:r>
       <w:r>
-        <w:t xml:space="preserve"> cố định (nhà xưởng, máy móc,…) với biến số </w:t>
+        <w:t xml:space="preserve"> cố định (nhà xưởng, máy </w:t>
+      </w:r>
+      <w:proofErr w:type="gramStart"/>
+      <w:r>
+        <w:t>móc,…</w:t>
+      </w:r>
+      <w:proofErr w:type="gramEnd"/>
+      <w:r>
+        <w:t xml:space="preserve">) với biến số </w:t>
       </w:r>
       <w:r>
         <w:rPr>
@@ -4625,6 +4652,7 @@
       <w:r>
         <w:t xml:space="preserve">Giá sử </w:t>
       </w:r>
+      <w:proofErr w:type="gramStart"/>
       <w:r>
         <w:rPr>
           <w:i/>
@@ -4634,6 +4662,7 @@
       <w:r>
         <w:t>(</w:t>
       </w:r>
+      <w:proofErr w:type="gramEnd"/>
       <w:r>
         <w:rPr>
           <w:i/>
@@ -8088,6 +8117,7 @@
       <w:r>
         <w:t xml:space="preserve">Biểu thức (1 + </w:t>
       </w:r>
+      <w:proofErr w:type="gramStart"/>
       <w:r>
         <w:rPr>
           <w:i/>
@@ -8105,6 +8135,7 @@
         </w:rPr>
         <w:t>θ</w:t>
       </w:r>
+      <w:proofErr w:type="gramEnd"/>
       <w:r>
         <w:t xml:space="preserve"> quan trọng nhất trong công thức trên vì biến đổi hàm TNTĐSX thành hàm mũ phi tuyến, dẫn đến lợi nhuận tăng vượt bậc nhờ vào tham số trình độ sản xuất </w:t>
       </w:r>
@@ -8410,7 +8441,6 @@
           <w:id w:val="-830607386"/>
           <w:citation/>
         </w:sdtPr>
-        <w:sdtEndPr/>
         <w:sdtContent>
           <w:r>
             <w:fldChar w:fldCharType="begin"/>
@@ -8665,7 +8695,6 @@
           <w:id w:val="1016192634"/>
           <w:citation/>
         </w:sdtPr>
-        <w:sdtEndPr/>
         <w:sdtContent>
           <w:r>
             <w:fldChar w:fldCharType="begin"/>
@@ -8707,7 +8736,6 @@
           <w:id w:val="-537596091"/>
           <w:citation/>
         </w:sdtPr>
-        <w:sdtEndPr/>
         <w:sdtContent>
           <w:r>
             <w:fldChar w:fldCharType="begin"/>
@@ -8743,7 +8771,6 @@
           <w:id w:val="-237867708"/>
           <w:citation/>
         </w:sdtPr>
-        <w:sdtEndPr/>
         <w:sdtContent>
           <w:r>
             <w:fldChar w:fldCharType="begin"/>
@@ -8794,7 +8821,6 @@
           <w:id w:val="818621990"/>
           <w:citation/>
         </w:sdtPr>
-        <w:sdtEndPr/>
         <w:sdtContent>
           <w:r>
             <w:fldChar w:fldCharType="begin"/>
@@ -8971,7 +8997,6 @@
           <w:id w:val="94758853"/>
           <w:citation/>
         </w:sdtPr>
-        <w:sdtEndPr/>
         <w:sdtContent>
           <w:r>
             <w:fldChar w:fldCharType="begin"/>
@@ -9085,7 +9110,6 @@
           <w:id w:val="1750545302"/>
           <w:citation/>
         </w:sdtPr>
-        <w:sdtEndPr/>
         <w:sdtContent>
           <w:r>
             <w:fldChar w:fldCharType="begin"/>
@@ -9118,7 +9142,6 @@
           <w:id w:val="1019284471"/>
           <w:citation/>
         </w:sdtPr>
-        <w:sdtEndPr/>
         <w:sdtContent>
           <w:r>
             <w:fldChar w:fldCharType="begin"/>
@@ -9465,6 +9488,9 @@
         <w:t xml:space="preserve">. </w:t>
       </w:r>
       <w:r>
+        <w:rPr>
+          <w:i/>
+        </w:rPr>
         <w:t>GDP tạm thời là độ đo lượng của cải của nền kinh tế</w:t>
       </w:r>
       <w:r>
@@ -9610,7 +9636,6 @@
           <w:id w:val="-1807149233"/>
           <w:citation/>
         </w:sdtPr>
-        <w:sdtEndPr/>
         <w:sdtContent>
           <w:r>
             <w:fldChar w:fldCharType="begin"/>
@@ -9646,7 +9671,6 @@
           <w:id w:val="-1754665230"/>
           <w:citation/>
         </w:sdtPr>
-        <w:sdtEndPr/>
         <w:sdtContent>
           <w:r>
             <w:fldChar w:fldCharType="begin"/>
@@ -9793,7 +9817,6 @@
           <w:id w:val="-1729362216"/>
           <w:citation/>
         </w:sdtPr>
-        <w:sdtEndPr/>
         <w:sdtContent>
           <w:r>
             <w:fldChar w:fldCharType="begin"/>
@@ -9859,7 +9882,6 @@
           <w:id w:val="275537392"/>
           <w:citation/>
         </w:sdtPr>
-        <w:sdtEndPr/>
         <w:sdtContent>
           <w:r>
             <w:fldChar w:fldCharType="begin"/>
@@ -10168,7 +10190,6 @@
           <w:id w:val="-292298351"/>
           <w:citation/>
         </w:sdtPr>
-        <w:sdtEndPr/>
         <w:sdtContent>
           <w:r>
             <w:fldChar w:fldCharType="begin"/>
@@ -10339,7 +10360,6 @@
           <w:id w:val="1939103453"/>
           <w:citation/>
         </w:sdtPr>
-        <w:sdtEndPr/>
         <w:sdtContent>
           <w:r>
             <w:fldChar w:fldCharType="begin"/>
@@ -10387,7 +10407,6 @@
           <w:id w:val="-1639101798"/>
           <w:citation/>
         </w:sdtPr>
-        <w:sdtEndPr/>
         <w:sdtContent>
           <w:r>
             <w:fldChar w:fldCharType="begin"/>
@@ -10426,7 +10445,6 @@
           <w:id w:val="-1427492754"/>
           <w:citation/>
         </w:sdtPr>
-        <w:sdtEndPr/>
         <w:sdtContent>
           <w:r>
             <w:fldChar w:fldCharType="begin"/>
@@ -10584,7 +10602,6 @@
           <w:id w:val="505012827"/>
           <w:citation/>
         </w:sdtPr>
-        <w:sdtEndPr/>
         <w:sdtContent>
           <w:r>
             <w:fldChar w:fldCharType="begin"/>
@@ -10671,7 +10688,6 @@
           <w:id w:val="-1076973253"/>
           <w:citation/>
         </w:sdtPr>
-        <w:sdtEndPr/>
         <w:sdtContent>
           <w:r>
             <w:fldChar w:fldCharType="begin"/>
@@ -10761,7 +10777,6 @@
           <w:id w:val="-29260260"/>
           <w:citation/>
         </w:sdtPr>
-        <w:sdtEndPr/>
         <w:sdtContent>
           <w:r>
             <w:fldChar w:fldCharType="begin"/>
@@ -10886,7 +10901,6 @@
           <w:id w:val="-1835298185"/>
           <w:citation/>
         </w:sdtPr>
-        <w:sdtEndPr/>
         <w:sdtContent>
           <w:r>
             <w:fldChar w:fldCharType="begin"/>
@@ -11154,7 +11168,6 @@
           <w:id w:val="-804161269"/>
           <w:citation/>
         </w:sdtPr>
-        <w:sdtEndPr/>
         <w:sdtContent>
           <w:r>
             <w:fldChar w:fldCharType="begin"/>
@@ -11193,7 +11206,6 @@
           <w:id w:val="1191729591"/>
           <w:citation/>
         </w:sdtPr>
-        <w:sdtEndPr/>
         <w:sdtContent>
           <w:r>
             <w:fldChar w:fldCharType="begin"/>
@@ -11225,10 +11237,25 @@
         <w:t xml:space="preserve">. </w:t>
       </w:r>
       <w:r>
-        <w:t>Adam Smith đề cập vấn đề tay nghề nông dân ở nông thôn phức tạp hơn tay nghề công nhân ở thành thị và hơn nữa, không có nhiều hướng dẫn về một số nghề nông nghiệp, tuy nhiên thực tế này là một số đặc thù, sản phẩm nông nghiệp thuần túy từ nuôi trồng chăn thả</w:t>
-      </w:r>
-      <w:r>
+        <w:t xml:space="preserve">Adam Smith đề cập vấn đề tay nghề nông dân ở nông thôn phức tạp hơn tay nghề công nhân ở thành thị và hơn nữa, không có nhiều hướng dẫn về một số nghề nông nghiệp, tuy nhiên thực tế này là một số đặc thù, sản phẩm nông nghiệp thuần túy từ </w:t>
+      </w:r>
+      <w:r>
+        <w:t>“</w:t>
+      </w:r>
+      <w:r>
+        <w:rPr>
+          <w:i/>
+        </w:rPr>
+        <w:t>nuôi trồng chăn thả</w:t>
+      </w:r>
+      <w:r>
+        <w:rPr>
+          <w:i/>
+        </w:rPr>
         <w:t xml:space="preserve"> đánh bắt</w:t>
+      </w:r>
+      <w:r>
+        <w:t>”</w:t>
       </w:r>
       <w:r>
         <w:t xml:space="preserve"> không thể phức tạp hơn sản phẩm công nghiệp như chi tiết máy móc nhưng vì tiến trình phân công lao động ở thành thị diễn ra chặt chẽ hơn, quy trình phân định đến chi tiết giúp người thợ chỉ tập trung vào một kỹ thuật đơn giản. Tuy nhiên phân công lao động lỏng lẻo ở nông thôn và công việc đa năng của nông dân là một thế mạnh trong tiến trình cân bằng nông thôn và thành thị, ghì lại sức hút của cực tăng trưởng, mà bản thân sự lỏng lẻo này nằm trong một tiến trình phân công lao động rộng hơn, phân công lao động giữa nông thôn và thành thị.</w:t>
@@ -11254,7 +11281,15 @@
         <w:t>vốn</w:t>
       </w:r>
       <w:r>
-        <w:t xml:space="preserve"> của nhà tư bản bao gồm nguồn lực (nhà xưởng, máy móc,…) được sử dụng trong sản xuất ngoài tiền công và ngoài chi phí cho bên thứ ba, 3) </w:t>
+        <w:t xml:space="preserve"> của nhà tư bản bao gồm nguồn lực (nhà xưởng, máy </w:t>
+      </w:r>
+      <w:proofErr w:type="gramStart"/>
+      <w:r>
+        <w:t>móc,…</w:t>
+      </w:r>
+      <w:proofErr w:type="gramEnd"/>
+      <w:r>
+        <w:t xml:space="preserve">) được sử dụng trong sản xuất ngoài tiền công và ngoài chi phí cho bên thứ ba, 3) </w:t>
       </w:r>
       <w:r>
         <w:t>chi phí cho bên thứ ba</w:t>
@@ -11327,7 +11362,6 @@
           <w:id w:val="-1831432882"/>
           <w:citation/>
         </w:sdtPr>
-        <w:sdtEndPr/>
         <w:sdtContent>
           <w:r>
             <w:fldChar w:fldCharType="begin"/>
@@ -11357,7 +11391,6 @@
           <w:id w:val="-315653010"/>
           <w:citation/>
         </w:sdtPr>
-        <w:sdtEndPr/>
         <w:sdtContent>
           <w:r>
             <w:fldChar w:fldCharType="begin"/>
@@ -11387,7 +11420,6 @@
           <w:id w:val="1161807158"/>
           <w:citation/>
         </w:sdtPr>
-        <w:sdtEndPr/>
         <w:sdtContent>
           <w:r>
             <w:fldChar w:fldCharType="begin"/>
@@ -11582,7 +11614,6 @@
           <w:id w:val="-1282495917"/>
           <w:citation/>
         </w:sdtPr>
-        <w:sdtEndPr/>
         <w:sdtContent>
           <w:r>
             <w:fldChar w:fldCharType="begin"/>
@@ -11786,7 +11817,6 @@
           <w:id w:val="2068990673"/>
           <w:citation/>
         </w:sdtPr>
-        <w:sdtEndPr/>
         <w:sdtContent>
           <w:r>
             <w:fldChar w:fldCharType="begin"/>
@@ -11825,7 +11855,6 @@
           <w:id w:val="1892689785"/>
           <w:citation/>
         </w:sdtPr>
-        <w:sdtEndPr/>
         <w:sdtContent>
           <w:r>
             <w:fldChar w:fldCharType="begin"/>
@@ -11885,7 +11914,6 @@
           <w:id w:val="-1492091520"/>
           <w:citation/>
         </w:sdtPr>
-        <w:sdtEndPr/>
         <w:sdtContent>
           <w:r>
             <w:fldChar w:fldCharType="begin"/>
@@ -11935,7 +11963,6 @@
           <w:id w:val="-840154466"/>
           <w:citation/>
         </w:sdtPr>
-        <w:sdtEndPr/>
         <w:sdtContent>
           <w:r>
             <w:fldChar w:fldCharType="begin"/>
@@ -12090,7 +12117,6 @@
           <w:id w:val="-1640722338"/>
           <w:citation/>
         </w:sdtPr>
-        <w:sdtEndPr/>
         <w:sdtContent>
           <w:r>
             <w:fldChar w:fldCharType="begin"/>
@@ -12256,7 +12282,6 @@
           <w:id w:val="-207333475"/>
           <w:citation/>
         </w:sdtPr>
-        <w:sdtEndPr/>
         <w:sdtContent>
           <w:r>
             <w:fldChar w:fldCharType="begin"/>
@@ -12330,7 +12355,6 @@
           <w:id w:val="1833021705"/>
           <w:citation/>
         </w:sdtPr>
-        <w:sdtEndPr/>
         <w:sdtContent>
           <w:r>
             <w:fldChar w:fldCharType="begin"/>
@@ -12393,7 +12417,6 @@
           <w:id w:val="985585609"/>
           <w:citation/>
         </w:sdtPr>
-        <w:sdtEndPr/>
         <w:sdtContent>
           <w:r>
             <w:fldChar w:fldCharType="begin"/>
@@ -12432,7 +12455,6 @@
           <w:id w:val="33317548"/>
           <w:citation/>
         </w:sdtPr>
-        <w:sdtEndPr/>
         <w:sdtContent>
           <w:r>
             <w:fldChar w:fldCharType="begin"/>
@@ -12462,7 +12484,6 @@
           <w:id w:val="-1761738413"/>
           <w:citation/>
         </w:sdtPr>
-        <w:sdtEndPr/>
         <w:sdtContent>
           <w:r>
             <w:fldChar w:fldCharType="begin"/>
@@ -12542,11 +12563,11 @@
           <w:b w:val="0"/>
         </w:rPr>
       </w:pPr>
-      <w:bookmarkStart w:id="7" w:name="_Toc208604147"/>
+      <w:bookmarkStart w:id="6" w:name="_Toc208604147"/>
       <w:r>
         <w:t>Hệ thống tiền tệ</w:t>
       </w:r>
-      <w:bookmarkEnd w:id="7"/>
+      <w:bookmarkEnd w:id="6"/>
     </w:p>
     <w:p>
       <w:r>
@@ -12723,7 +12744,13 @@
         <w:t xml:space="preserve">dự trữ ngoại hối. </w:t>
       </w:r>
       <w:r>
-        <w:t xml:space="preserve">Tỉ giá hối đoái chính là giá trị trao đổi này của đồng tiền trên thị trường ngoại hối nên năm yếu tố này tất nhiên ảnh hưởng đến tỉ </w:t>
+        <w:rPr>
+          <w:i/>
+        </w:rPr>
+        <w:t>Tỉ giá hối đoái chính là giá trị trao đổi này của đồng tiền</w:t>
+      </w:r>
+      <w:r>
+        <w:t xml:space="preserve"> trên thị trường ngoại hối nên năm yếu tố này tất nhiên ảnh hưởng đến tỉ </w:t>
       </w:r>
       <w:r>
         <w:lastRenderedPageBreak/>
@@ -13532,11 +13559,11 @@
           <w:b w:val="0"/>
         </w:rPr>
       </w:pPr>
-      <w:bookmarkStart w:id="8" w:name="_Toc208604148"/>
+      <w:bookmarkStart w:id="7" w:name="_Toc208604148"/>
       <w:r>
         <w:t>Tích lũy vốn</w:t>
       </w:r>
-      <w:bookmarkEnd w:id="8"/>
+      <w:bookmarkEnd w:id="7"/>
     </w:p>
     <w:p>
       <w:r>
@@ -13568,7 +13595,6 @@
           <w:id w:val="1544018608"/>
           <w:citation/>
         </w:sdtPr>
-        <w:sdtEndPr/>
         <w:sdtContent>
           <w:r>
             <w:fldChar w:fldCharType="begin"/>
@@ -13652,7 +13678,6 @@
           <w:id w:val="-1295828161"/>
           <w:citation/>
         </w:sdtPr>
-        <w:sdtEndPr/>
         <w:sdtContent>
           <w:r>
             <w:fldChar w:fldCharType="begin"/>
@@ -13682,7 +13707,6 @@
           <w:id w:val="-1767534310"/>
           <w:citation/>
         </w:sdtPr>
-        <w:sdtEndPr/>
         <w:sdtContent>
           <w:r>
             <w:fldChar w:fldCharType="begin"/>
@@ -13753,7 +13777,15 @@
         <w:t>vốn</w:t>
       </w:r>
       <w:r>
-        <w:t xml:space="preserve"> cố định (nhà xưởng, máy móc,…) với biến số </w:t>
+        <w:t xml:space="preserve"> cố định (nhà xưởng, máy </w:t>
+      </w:r>
+      <w:proofErr w:type="gramStart"/>
+      <w:r>
+        <w:t>móc,…</w:t>
+      </w:r>
+      <w:proofErr w:type="gramEnd"/>
+      <w:r>
+        <w:t xml:space="preserve">) với biến số </w:t>
       </w:r>
       <w:r>
         <w:rPr>
@@ -14167,6 +14199,7 @@
       <w:r>
         <w:t xml:space="preserve"> với biểu thức (1 + </w:t>
       </w:r>
+      <w:proofErr w:type="gramStart"/>
       <w:r>
         <w:rPr>
           <w:i/>
@@ -14184,6 +14217,7 @@
         </w:rPr>
         <w:t>θ</w:t>
       </w:r>
+      <w:proofErr w:type="gramEnd"/>
       <w:r>
         <w:rPr>
           <w:rFonts w:cs="Times New Roman"/>
@@ -14426,7 +14460,6 @@
           <w:id w:val="-1989388936"/>
           <w:citation/>
         </w:sdtPr>
-        <w:sdtEndPr/>
         <w:sdtContent>
           <w:r>
             <w:rPr>
@@ -14876,7 +14909,6 @@
           <w:id w:val="737217112"/>
           <w:citation/>
         </w:sdtPr>
-        <w:sdtEndPr/>
         <w:sdtContent>
           <w:r>
             <w:rPr>
@@ -14986,7 +15018,6 @@
           <w:id w:val="1653100629"/>
           <w:citation/>
         </w:sdtPr>
-        <w:sdtEndPr/>
         <w:sdtContent>
           <w:r>
             <w:rPr>
@@ -15236,17 +15267,2405 @@
       <w:r>
         <w:t>rằng hoạt động kinh doanh của kinh tế nhà nước gần như thao tác hành chính “sản xuất” sản phẩm dịch vụ “phân bổ nguồn lực”.</w:t>
       </w:r>
+      <w:r>
+        <w:rPr>
+          <w:rFonts w:cs="Times New Roman"/>
+        </w:rPr>
+        <w:t xml:space="preserve"> </w:t>
+      </w:r>
+      <w:r>
+        <w:rPr>
+          <w:rFonts w:cs="Times New Roman"/>
+        </w:rPr>
+        <w:t>Tóm lại, sự khác biệt cơ bản giữa vốn cố định và vốn lưu động rằng vốn lưu động chỉ mang lại lợi nhuận thông qua luân chuyển (chuyển quyền sở hữu) và thay đổi hình thái (từ tiền sang hàng hóa và ngược lại), trong khi đó, vốn cố định có thể tạo ra lợi nhuận mà không cần luân chuyển (Google 2025).</w:t>
+      </w:r>
     </w:p>
     <w:p>
       <w:pPr>
         <w:ind w:firstLine="360"/>
       </w:pPr>
       <w:r>
-        <w:t>[Phân tích khác biệt giữa GDP và tổng vốn quốc gia theo Smith]</w:t>
+        <w:t xml:space="preserve">Smith định nghĩa </w:t>
+      </w:r>
+      <w:r>
+        <w:rPr>
+          <w:i/>
+        </w:rPr>
+        <w:t>tổng thu nhập xã hội</w:t>
+      </w:r>
+      <w:r>
+        <w:t xml:space="preserve"> </w:t>
+      </w:r>
+      <w:r>
+        <w:t>(</w:t>
+      </w:r>
+      <w:r>
+        <w:rPr>
+          <w:i/>
+        </w:rPr>
+        <w:t>tổng thu nhập Smith</w:t>
+      </w:r>
+      <w:r>
+        <w:t xml:space="preserve">) </w:t>
+      </w:r>
+      <w:r>
+        <w:t xml:space="preserve">là tổng toàn bộ hàng hóa sản phẩm hàng năm từ lao động và đất đai theo công thức </w:t>
+      </w:r>
+      <w:r>
+        <w:rPr>
+          <w:rFonts w:cs="Times New Roman"/>
+        </w:rPr>
+        <w:t xml:space="preserve">công thức “giá cả hàng hóa = tiền công + tiền thuê đất + lợi nhuận” và </w:t>
+      </w:r>
+      <w:r>
+        <w:rPr>
+          <w:rFonts w:cs="Times New Roman"/>
+          <w:i/>
+        </w:rPr>
+        <w:t>thu nhập ròng xã hội</w:t>
+      </w:r>
+      <w:r>
+        <w:rPr>
+          <w:rFonts w:cs="Times New Roman"/>
+        </w:rPr>
+        <w:t xml:space="preserve"> </w:t>
+      </w:r>
+      <w:r>
+        <w:rPr>
+          <w:rFonts w:cs="Times New Roman"/>
+        </w:rPr>
+        <w:t>(</w:t>
+      </w:r>
+      <w:r>
+        <w:rPr>
+          <w:rFonts w:cs="Times New Roman"/>
+          <w:i/>
+        </w:rPr>
+        <w:t>thu nhập ròng Smith</w:t>
+      </w:r>
+      <w:r>
+        <w:rPr>
+          <w:rFonts w:cs="Times New Roman"/>
+        </w:rPr>
+        <w:t xml:space="preserve">) </w:t>
+      </w:r>
+      <w:r>
+        <w:rPr>
+          <w:rFonts w:cs="Times New Roman"/>
+        </w:rPr>
+        <w:t>là tổng thu nhập trừ khấu hao vốn cố định lẫn khấu hao vốn luân chuyển và phí tổn sinh hoạt của mọi cá nhân</w:t>
+      </w:r>
+      <w:sdt>
+        <w:sdtPr>
+          <w:rPr>
+            <w:rFonts w:cs="Times New Roman"/>
+          </w:rPr>
+          <w:id w:val="510348843"/>
+          <w:citation/>
+        </w:sdtPr>
+        <w:sdtContent>
+          <w:r>
+            <w:rPr>
+              <w:rFonts w:cs="Times New Roman"/>
+            </w:rPr>
+            <w:fldChar w:fldCharType="begin"/>
+          </w:r>
+          <w:r>
+            <w:rPr>
+              <w:rFonts w:cs="Times New Roman"/>
+            </w:rPr>
+            <w:instrText xml:space="preserve">CITATION Smith1776Wealth \p 212-213 \l 1033 </w:instrText>
+          </w:r>
+          <w:r>
+            <w:rPr>
+              <w:rFonts w:cs="Times New Roman"/>
+            </w:rPr>
+            <w:fldChar w:fldCharType="separate"/>
+          </w:r>
+          <w:r>
+            <w:rPr>
+              <w:rFonts w:cs="Times New Roman"/>
+              <w:noProof/>
+            </w:rPr>
+            <w:t xml:space="preserve"> </w:t>
+          </w:r>
+          <w:r>
+            <w:rPr>
+              <w:rFonts w:cs="Times New Roman"/>
+              <w:noProof/>
+            </w:rPr>
+            <w:t>(Smith, 1776, pp. 212-213)</w:t>
+          </w:r>
+          <w:r>
+            <w:rPr>
+              <w:rFonts w:cs="Times New Roman"/>
+            </w:rPr>
+            <w:fldChar w:fldCharType="end"/>
+          </w:r>
+        </w:sdtContent>
+      </w:sdt>
+      <w:r>
+        <w:rPr>
+          <w:rFonts w:cs="Times New Roman"/>
+        </w:rPr>
+        <w:t xml:space="preserve">. Rõ ràng thu nhập ròng xã hội được cụ thể hóa thành GDP (tổng thu nhập quốc nội – </w:t>
+      </w:r>
+      <w:r>
+        <w:t>gross domestic product</w:t>
+      </w:r>
+      <w:r>
+        <w:rPr>
+          <w:rFonts w:cs="Times New Roman"/>
+        </w:rPr>
+        <w:t xml:space="preserve">) với lưu ý </w:t>
+      </w:r>
+      <w:r>
+        <w:t xml:space="preserve">GDP tính theo phương pháp thu nhập bằng tổng thu nhập lao động tiền lương của người lao động (1), thu nhập từ sở hữu (2) gồm lợi nhuận của doanh nghiệp &amp; tiền lãi từ các khoản cho vay &amp; tiền cho thuê tài sản, thuế sản xuất ròng (3) tức thuế gián thu như thuế giá trị gia tăng và thuế tiêu thụ đặc biệt trừ đi trợ cấp chính phủ cho sản xuất, cộng với chi phí khấu hao tài sản cố định (4) (Google 2025). Chi phí khấu hao tài sản cố định được cộng vào GDP chứ không phải trừ đi do vốn phải chuyển thành tài sản mới được tính vào GDP và chi phí khấu hao tức tu bổ tài sản cố định tương đương mua mới một lượng tài sản cố định. Tuy nhiên </w:t>
+      </w:r>
+      <w:r>
+        <w:t xml:space="preserve">không </w:t>
+      </w:r>
+      <w:r>
+        <w:t xml:space="preserve">có khác biệt </w:t>
+      </w:r>
+      <w:r>
+        <w:t xml:space="preserve">nhiều </w:t>
+      </w:r>
+      <w:r>
+        <w:t xml:space="preserve">giữa </w:t>
+      </w:r>
+      <w:r>
+        <w:rPr>
+          <w:i/>
+        </w:rPr>
+        <w:t>thu nhập ròng Smith</w:t>
+      </w:r>
+      <w:r>
+        <w:t xml:space="preserve"> (theo Smith) và GDP khi vốn được chia thành vốn cố định và vốn lưu động, theo đó thu nhập ròng Smith chủ yếu đề cập đến tiền công, tiền thuê đất và lợi nhuận nghĩa là </w:t>
+      </w:r>
+      <w:r>
+        <w:t xml:space="preserve">tập trung vào </w:t>
+      </w:r>
+      <w:r>
+        <w:t>lượng của cải tăng lên. Vốn cố định như nhà xưởng, máy móc là phương tiện sản xuất tạo ra thu nhập nhưng không phải là thu nhập, theo Smith. Ngược lại tài sản cố định như cơ sở hạ tầng đóng góp lớn vào GDP vì tài sản cố định được đặt tương ứng với tổng thu nhập lao động tiền lương của người lao động (1) và vốn nguyên khởi phải được chuyển hóa. Để rõ nghĩa vấn đề này, ta cần tìm hiểu GDP tính theo phương pháp sản xuất bằng tổng giá trị của hàng hóa và dịch vụ của sản xuất (1), trừ đi chi phí trung gian trong quá trình sản xuất (2) (chi phí trung gian còn được gọi tiêu dùng trung gian là chi phí nguyên vật liệu và dịch vụ mua ngoài), cộng với thuế sản phẩm (3), trừ trợ cấp sản phẩm (4) (trợ cấp sản phẩm là khoản hỗ trợ của chính phủ cho sản xuất) (Google 2025). Theo đó, tài sản cố định (vốn cố định) nằm trong tổng giá trị của hàng hóa và dịch vụ của sản xuất (1).</w:t>
+      </w:r>
+      <w:r>
+        <w:t xml:space="preserve"> </w:t>
+      </w:r>
+      <w:r>
+        <w:t>Vốn lưu động gồm bốn thành phầ</w:t>
+      </w:r>
+      <w:r>
+        <w:t xml:space="preserve">n như </w:t>
+      </w:r>
+      <w:r>
+        <w:rPr>
+          <w:i/>
+        </w:rPr>
+        <w:t xml:space="preserve">tiền </w:t>
+      </w:r>
+      <w:r>
+        <w:rPr>
+          <w:i/>
+        </w:rPr>
+        <w:t>luân</w:t>
+      </w:r>
+      <w:r>
+        <w:rPr>
+          <w:i/>
+        </w:rPr>
+        <w:t xml:space="preserve"> chuyển, lương thực để sinh hoạt, nguyên vật liệu và thành phẩ</w:t>
+      </w:r>
+      <w:r>
+        <w:rPr>
+          <w:i/>
+        </w:rPr>
+        <w:t>m</w:t>
+      </w:r>
+      <w:r>
+        <w:t>,</w:t>
+      </w:r>
+      <w:r>
+        <w:t xml:space="preserve"> tuy cũng chỉ là phương tiện tạo ra thu nhập nhưng nguyên vật liệu và thành phẩm là thu nhập trong tổng thể xã hội mặc dù chúng không phải thu nhập của từng cá nhân</w:t>
+      </w:r>
+      <w:sdt>
+        <w:sdtPr>
+          <w:id w:val="-472606303"/>
+          <w:citation/>
+        </w:sdtPr>
+        <w:sdtContent>
+          <w:r>
+            <w:fldChar w:fldCharType="begin"/>
+          </w:r>
+          <w:r>
+            <w:instrText xml:space="preserve">CITATION Smith1776Wealth \p 214 \l 1033 </w:instrText>
+          </w:r>
+          <w:r>
+            <w:fldChar w:fldCharType="separate"/>
+          </w:r>
+          <w:r>
+            <w:rPr>
+              <w:noProof/>
+            </w:rPr>
+            <w:t xml:space="preserve"> (Smith, 1776, p. 214)</w:t>
+          </w:r>
+          <w:r>
+            <w:fldChar w:fldCharType="end"/>
+          </w:r>
+        </w:sdtContent>
+      </w:sdt>
+      <w:r>
+        <w:t xml:space="preserve">. Lý do rất đơn giản, nguyên vật liệu đầu vào của cá nhân này là sản phẩm đầu ra của cá nhân khác, lượng tiền của người mua là lợi nhuận của người bán. Smith cũng khấu trừ tiền luân chuyển của vốn lưu động khỏi thu nhập ròng, điều này chưa hẳn đúng vì tiền luân chuyển góp phần tạo thế năng tài chính tức mức chênh lệch tạo lợi nhuận. </w:t>
+      </w:r>
+      <w:r>
+        <w:rPr>
+          <w:i/>
+        </w:rPr>
+        <w:t>Tiền luân chuyển</w:t>
+      </w:r>
+      <w:r>
+        <w:t xml:space="preserve"> tức </w:t>
+      </w:r>
+      <w:r>
+        <w:rPr>
+          <w:i/>
+        </w:rPr>
+        <w:t>tiền lưu thông</w:t>
+      </w:r>
+      <w:r>
+        <w:t xml:space="preserve"> khởi phát từ hoạt động trao </w:t>
+      </w:r>
+      <w:r>
+        <w:lastRenderedPageBreak/>
+        <w:t>đổi hàng hóa là nguồn gốc của dòng tiền &amp; hoạt động ngân hàng và như ta cũng biết rằng thuộc tính trao đổi là nguồn gốc của phân công lao động và phân công lao động là nguồn gốc của tự do kinh tế.</w:t>
+      </w:r>
+      <w:r>
+        <w:t xml:space="preserve"> Từ phân tích của Smith, ta có một suy luận thú vị </w:t>
+      </w:r>
+      <w:r>
+        <w:t xml:space="preserve">rằng </w:t>
+      </w:r>
+      <w:r>
+        <w:t>tích lũy vốn góp phần vào hoạt động ngân hàng.</w:t>
+      </w:r>
+      <w:r>
+        <w:t xml:space="preserve"> Thuộc tính trao đổi hàng hóa là nguồn gốc của mọi thứ trong kinh tế nói chung và kinh tế tự do nói riêng, mặc dù ta luôn nhấn mạnh tầm quan trọng của hoạt động sản xuất trong mối tương hỗ với hoạt động thương mại như “</w:t>
+      </w:r>
+      <w:r>
+        <w:t>thương mại là vệt màu nhập nhòe giữa sản xuất và tài chính</w:t>
+      </w:r>
+      <w:r>
+        <w:t>”, nhưng hãy lưu ý bản chất của thương mại là trao đổi, ngữ nghĩa này mạnh hơn nhiều so với mối liên hệ giữa trao đổi và sản xuất phải thông qua phân công lao động</w:t>
+      </w:r>
+      <w:r>
+        <w:t xml:space="preserve"> – hoạt động sản xuất chỉ có ý nghĩa với phân công lao động mặc dù trao đổi là nguồn gốc của phân công lao động, trong khi đó ta có thể nói thương mại “là” trao đổi</w:t>
+      </w:r>
+      <w:r>
+        <w:t>.</w:t>
+      </w:r>
+      <w:r>
+        <w:t xml:space="preserve"> Nếu nghiêng về sản xuất và tách thành tố chi phí vận chuyển khỏi giá thành sản phẩm thì thương mại là hoạt động sản xuất tạo ra sản phẩm dịch vụ và khi đó chi phí vận chuyển nhập vào giá thành của dịch vụ “thương mại”.</w:t>
+      </w:r>
+      <w:r>
+        <w:t xml:space="preserve"> Rốt cuộc giữa thuộc tính trao đổi và thuộc tính sinh sôi nảy nở thì cái nào quan trọng nhất đối với </w:t>
+      </w:r>
+      <w:r>
+        <w:t xml:space="preserve">nền </w:t>
+      </w:r>
+      <w:r>
+        <w:t>kinh tế</w:t>
+      </w:r>
+      <w:r>
+        <w:t xml:space="preserve">? Bản thân câu hỏi này chưa đúng vì cần điều chỉnh lại rằng sinh sôi nảy nở là bản chất (essence) của nền kinh tế </w:t>
+      </w:r>
+      <w:r>
+        <w:t xml:space="preserve">với vai trò bản thể hay sinh thể </w:t>
+      </w:r>
+      <w:r>
+        <w:t>có thuộc tính quan trọng nhất là trao đổi</w:t>
+      </w:r>
+      <w:r>
+        <w:t xml:space="preserve"> và trao đổi là hoạt động “giao hợp” của sinh thể kinh tế để sinh sôi của cải</w:t>
+      </w:r>
+      <w:r>
+        <w:t xml:space="preserve">. Bất luận thế nào </w:t>
+      </w:r>
+      <w:r>
+        <w:t xml:space="preserve">nền </w:t>
+      </w:r>
+      <w:r>
+        <w:t>kinh tế phải tăng trưởng – tạo ra càng nhiều của cải càng tốt với phương tiện cơ bản là trao đổi</w:t>
+      </w:r>
+      <w:r>
+        <w:t>, và như thế, tất cả mọi hoạt động kinh tế đều có thể quy về sản xuất</w:t>
+      </w:r>
+      <w:r>
+        <w:t xml:space="preserve"> tức sinh sôi nảy nở</w:t>
+      </w:r>
+      <w:r>
+        <w:t>.</w:t>
+      </w:r>
+      <w:r>
+        <w:t xml:space="preserve"> Lưu ý, tổng thu nhập xã hội và thu nhập ròng xã hội đều là vốn </w:t>
+      </w:r>
+      <w:r>
+        <w:t xml:space="preserve">(cố định + lưu động) </w:t>
+      </w:r>
+      <w:r>
+        <w:t xml:space="preserve">nhưng </w:t>
+      </w:r>
+      <w:r>
+        <w:t>thể hiện sự gia tăng của vốn tức tích lũy vốn</w:t>
+      </w:r>
+      <w:r>
+        <w:t xml:space="preserve">, do đó </w:t>
+      </w:r>
+      <w:r>
+        <w:rPr>
+          <w:i/>
+        </w:rPr>
+        <w:t>GDP cũng là vốn thể hiện sự tích lũy vốn</w:t>
+      </w:r>
+      <w:r>
+        <w:t>, hơn nữa, tổng thu nhập xã hội (Smith) cũng nhỏ hơn GDP.</w:t>
+      </w:r>
+    </w:p>
+    <w:p>
+      <w:pPr>
+        <w:ind w:firstLine="360"/>
+      </w:pPr>
+      <w:r>
+        <w:t xml:space="preserve">Lượng tiền lưu thông trong xã hội tuy phản ánh thu nhập xã hội nhưng bản thân lượng tiền này không phải thu nhập ròng Smith vì nó có vai trò là </w:t>
+      </w:r>
+      <w:r>
+        <w:rPr>
+          <w:i/>
+        </w:rPr>
+        <w:t>phương tiện thanh toán</w:t>
+      </w:r>
+      <w:r>
+        <w:t xml:space="preserve"> mà dường như Smith cho rằng nó gần như là tài sản cố định – cần phải có một hệ thống để duy trì nó</w:t>
+      </w:r>
+      <w:sdt>
+        <w:sdtPr>
+          <w:id w:val="1166443572"/>
+          <w:citation/>
+        </w:sdtPr>
+        <w:sdtContent>
+          <w:r>
+            <w:fldChar w:fldCharType="begin"/>
+          </w:r>
+          <w:r>
+            <w:instrText xml:space="preserve">CITATION Smith1776Wealth \p 214 \l 1033 </w:instrText>
+          </w:r>
+          <w:r>
+            <w:fldChar w:fldCharType="separate"/>
+          </w:r>
+          <w:r>
+            <w:rPr>
+              <w:noProof/>
+            </w:rPr>
+            <w:t xml:space="preserve"> (Smith, 1776, p. 214)</w:t>
+          </w:r>
+          <w:r>
+            <w:fldChar w:fldCharType="end"/>
+          </w:r>
+        </w:sdtContent>
+      </w:sdt>
+      <w:r>
+        <w:t xml:space="preserve">. </w:t>
+      </w:r>
+      <w:r>
+        <w:t xml:space="preserve">Ghi chú, </w:t>
+      </w:r>
+      <w:r>
+        <w:t>tiền lưu thông</w:t>
+      </w:r>
+      <w:r>
+        <w:t xml:space="preserve"> </w:t>
+      </w:r>
+      <w:r>
+        <w:t xml:space="preserve">có thể được hiểu </w:t>
+      </w:r>
+      <w:r>
+        <w:t>là tiền tệ</w:t>
+      </w:r>
+      <w:r>
+        <w:t xml:space="preserve"> </w:t>
+      </w:r>
+      <w:r>
+        <w:t xml:space="preserve">tức đồng tiền </w:t>
+      </w:r>
+      <w:r>
+        <w:t>hay nói cách khác tiền tệ chỉ được luân chuyển giữa các cá nhân mà không bị tiêu thụ (như sản phẩm) nhưng tôi nghĩ điều này chưa hẳn đúng</w:t>
+      </w:r>
+      <w:r>
+        <w:t xml:space="preserve">. </w:t>
+      </w:r>
+      <w:r>
+        <w:t>Tuy nhiên, bất luận thế nào, vai trò lưu thông của tiền tệ hay tiền lưu thông luôn thiết yếu</w:t>
+      </w:r>
+      <w:r>
+        <w:t xml:space="preserve"> và tất nhiên, tiền lưu thông là một thành phần của vốn lưu động bên cạnh </w:t>
+      </w:r>
+      <w:r>
+        <w:t>lương thực để sinh hoạt, nguyên vật liệu và thành phẩm</w:t>
+      </w:r>
+      <w:r>
+        <w:t xml:space="preserve"> mặc dù nguyên vật liệu và thành phẩm sẽ tạo ra lợi nhuận khi chuyển luân chuyển sở hữu hoặc thay đổi hình thái với lưu ý rằng sức lao động</w:t>
+      </w:r>
+      <w:r>
+        <w:t xml:space="preserve"> </w:t>
+      </w:r>
+      <w:r>
+        <w:t>và vốn cố định đóng góp vào thành phẩm</w:t>
+      </w:r>
+      <w:r>
+        <w:t xml:space="preserve"> </w:t>
+      </w:r>
+      <w:r>
+        <w:t xml:space="preserve">– </w:t>
+      </w:r>
+      <w:r>
+        <w:t>tiền thuê đất đóng góp vào thành phẩm</w:t>
+      </w:r>
+      <w:r>
+        <w:t xml:space="preserve"> tuy tiền thuê đất là hậu quả của giá thành</w:t>
+      </w:r>
+      <w:r>
+        <w:t xml:space="preserve">. </w:t>
+      </w:r>
+      <w:r>
+        <w:t>Thu nhập một người với tiền công và lợi nhuận được lượng hóa bằng một lượng tiền và được cá nhân chi tiêu trong tiền lưu thông nhưng thu nhập này không phải là tiền lưu thông</w:t>
+      </w:r>
+      <w:sdt>
+        <w:sdtPr>
+          <w:id w:val="-1702161430"/>
+          <w:citation/>
+        </w:sdtPr>
+        <w:sdtContent>
+          <w:r>
+            <w:fldChar w:fldCharType="begin"/>
+          </w:r>
+          <w:r>
+            <w:instrText xml:space="preserve">CITATION Smith1776Wealth \p 115 \l 1033 </w:instrText>
+          </w:r>
+          <w:r>
+            <w:fldChar w:fldCharType="separate"/>
+          </w:r>
+          <w:r>
+            <w:rPr>
+              <w:noProof/>
+            </w:rPr>
+            <w:t xml:space="preserve"> (Smith, 1776, p. 115)</w:t>
+          </w:r>
+          <w:r>
+            <w:fldChar w:fldCharType="end"/>
+          </w:r>
+        </w:sdtContent>
+      </w:sdt>
+      <w:r>
+        <w:t>.</w:t>
+      </w:r>
+      <w:r>
+        <w:t xml:space="preserve"> Ví dụ khi </w:t>
+      </w:r>
+      <w:r>
+        <w:t>một người</w:t>
+      </w:r>
+      <w:r>
+        <w:t xml:space="preserve"> được trả công bằng 1$ thì tờ tiền 1$ mà </w:t>
+      </w:r>
+      <w:r>
+        <w:t>họ</w:t>
+      </w:r>
+      <w:r>
+        <w:t xml:space="preserve"> cầm trên tay là tiền lưu thông nhưng thu nhập của </w:t>
+      </w:r>
+      <w:r>
+        <w:t>người đó</w:t>
+      </w:r>
+      <w:r>
+        <w:t xml:space="preserve"> chính là lượng lao động có giá tiền 1$</w:t>
+      </w:r>
+      <w:r>
+        <w:t xml:space="preserve"> và GDP được tích lũy với lượng lao động 1$ này. Tuy nhiên tiền lưu thông (</w:t>
+      </w:r>
+      <w:r>
+        <w:t xml:space="preserve">tờ tiền </w:t>
+      </w:r>
+      <w:r>
+        <w:t xml:space="preserve">1$) không phải </w:t>
+      </w:r>
+      <w:r>
+        <w:t>không</w:t>
+      </w:r>
+      <w:r>
+        <w:t xml:space="preserve"> có giá trị trao đổi</w:t>
+      </w:r>
+      <w:r>
+        <w:t xml:space="preserve"> </w:t>
+      </w:r>
+      <w:r>
+        <w:t>và</w:t>
+      </w:r>
+      <w:r>
+        <w:t xml:space="preserve"> người đọc </w:t>
+      </w:r>
+      <w:r>
+        <w:t>vui lòng phân biệt với giá trị quy ước của 1$</w:t>
+      </w:r>
+      <w:r>
+        <w:t>.</w:t>
+      </w:r>
+      <w:r>
+        <w:t xml:space="preserve"> Tiền công 1$ tức thu nhập 1$ </w:t>
+      </w:r>
+      <w:r>
+        <w:t xml:space="preserve">tức lượng của cải 1$ </w:t>
+      </w:r>
+      <w:r>
+        <w:t xml:space="preserve">chỉ có ý nghĩa khi một người mua </w:t>
+      </w:r>
+      <w:r>
+        <w:t xml:space="preserve">được </w:t>
+      </w:r>
+      <w:r>
+        <w:t>hàng hóa khác với 1$ này tức trao đổi với hàng hóa khác có lượng lao động tương đương 1$</w:t>
+      </w:r>
+      <w:r>
+        <w:t xml:space="preserve">, hay nói cách khác, thu nhập 1$ là </w:t>
+      </w:r>
+      <w:r>
+        <w:rPr>
+          <w:i/>
+        </w:rPr>
+        <w:t>sức mua</w:t>
+      </w:r>
+      <w:r>
+        <w:t xml:space="preserve"> của tờ tiền 1$</w:t>
+      </w:r>
+      <w:r>
+        <w:t>.</w:t>
+      </w:r>
+      <w:r>
+        <w:t xml:space="preserve"> Tuy nhiên tỉ giá hối đoái của đồng tiền tức giá trị trao đổi của đồng tiền được tính trên tờ tiền 1$ chứ không phải </w:t>
+      </w:r>
+      <w:r>
+        <w:t xml:space="preserve">trên </w:t>
+      </w:r>
+      <w:r>
+        <w:t>thu nhập – lượng lao động 1$ ngay cả khi tờ tiền 1$ không còn được thay bằng thỏi bạc 1$ thời Smith.</w:t>
+      </w:r>
+      <w:r>
+        <w:t xml:space="preserve"> Một cách chính xác rằng có sự thống nhất giữa giá trị trao đổi (giá trị quy ước) của tiền tệ và giá trị trao đổi của lượng lao động (hàng hóa).</w:t>
+      </w:r>
+      <w:r>
+        <w:t xml:space="preserve"> Lượng tiền lưu thông trên thị trường phải </w:t>
+      </w:r>
+      <w:r>
+        <w:t>tương ứng</w:t>
+      </w:r>
+      <w:r>
+        <w:t xml:space="preserve"> tổng giá trị trao đổi của hàng hóa trên thị trường, thể hiện rõ ràng sự thống nhất này, và cũng là nguyên lý của việc kềm chế lạm phát lẫn giảm phát.</w:t>
+      </w:r>
+      <w:r>
+        <w:t xml:space="preserve"> Nhưng tương ứng như thế nào? Ta cần tìm hiểu phân tích của Smith để thấu đáo vấn đề này.</w:t>
+      </w:r>
+      <w:r>
+        <w:t xml:space="preserve"> Theo một ví dụ của Smith</w:t>
+      </w:r>
+      <w:sdt>
+        <w:sdtPr>
+          <w:id w:val="-1148740909"/>
+          <w:citation/>
+        </w:sdtPr>
+        <w:sdtContent>
+          <w:r>
+            <w:fldChar w:fldCharType="begin"/>
+          </w:r>
+          <w:r>
+            <w:instrText xml:space="preserve">CITATION Smith1776Wealth \p 117 \l 1033 </w:instrText>
+          </w:r>
+          <w:r>
+            <w:fldChar w:fldCharType="separate"/>
+          </w:r>
+          <w:r>
+            <w:rPr>
+              <w:noProof/>
+            </w:rPr>
+            <w:t xml:space="preserve"> (Smith, 1776, p. 117)</w:t>
+          </w:r>
+          <w:r>
+            <w:fldChar w:fldCharType="end"/>
+          </w:r>
+        </w:sdtContent>
+      </w:sdt>
+      <w:r>
+        <w:t xml:space="preserve"> (</w:t>
+      </w:r>
+      <w:r>
+        <w:t>Google</w:t>
+      </w:r>
+      <w:r>
+        <w:t xml:space="preserve"> 2026), giả sử thu nhập ròng Smith là 1,000,000 lượng giá tiền trong hệ thống kim bản vị cần 1,000,000 đồng tiền vàng là tiền lưu thông cho thu nhập ròng 1,000,000 lượng giá tiền. Lượng tiền lưu thông 1,000,000 </w:t>
+      </w:r>
+      <w:r>
+        <w:lastRenderedPageBreak/>
+        <w:t xml:space="preserve">đồng tiền vàng cũng là tài sản </w:t>
+      </w:r>
+      <w:r>
+        <w:t xml:space="preserve">ở dạng tiềm năng cần được đốt cháy giải phóng năng lượng hữu ích – đúng nghĩa tài sản thực thụ </w:t>
+      </w:r>
+      <w:r>
+        <w:t xml:space="preserve">và để </w:t>
+      </w:r>
+      <w:r>
+        <w:t>đốt cháy “nhiên liệu”</w:t>
+      </w:r>
+      <w:r>
+        <w:t xml:space="preserve"> </w:t>
+      </w:r>
+      <w:r>
+        <w:t xml:space="preserve">vàng </w:t>
+      </w:r>
+      <w:r>
+        <w:t>này, ngân hàng phát hành 800,000 tiền giấy như dạng tín phiếu chưa phải tiền pháp định với bản vị pháp định và giữ lại 200,000 đồng tiền vàng trong ngân khố để người dân có thể đổi tiền giấy để rút đồng tiền vàng. Vai trò của tiền lưu thông (800,000 tiền giấy) hữu ích đến nỗi có ít người đổi tiền giấy để rút đồng tiền vàng nên 200,000 đồng tiền vàng</w:t>
+      </w:r>
+      <w:r>
+        <w:t xml:space="preserve"> đủ để bảo đảm bản vị. Sau một thời gian người dân hoàn toàn dùng 800,000 tiền giấy để trao đổi hàng hóa và tất nhiên ngân hàng thu hồi 800,000 đồng tiền vàng tương ứng với 800,000 tiền giấy lưu thông. </w:t>
+      </w:r>
+      <w:r>
+        <w:t>Lúc</w:t>
+      </w:r>
+      <w:r>
+        <w:t xml:space="preserve"> đó lượng 800,000 đồng tiền vàng </w:t>
+      </w:r>
+      <w:r>
+        <w:t xml:space="preserve">dôi dư </w:t>
+      </w:r>
+      <w:r>
+        <w:t>được đem ra nước ngoài để đầu tư như mua công cụ sản xuất, mua nguyên vật liệu, thậm chí cho vay để sản xuất nhiều của cải hơn</w:t>
+      </w:r>
+      <w:r>
+        <w:t xml:space="preserve">, đây là quá trình tích lũy vốn thông qua </w:t>
+      </w:r>
+      <w:r>
+        <w:t xml:space="preserve">vai trò </w:t>
+      </w:r>
+      <w:r>
+        <w:t xml:space="preserve">giải phóng nguồn lực </w:t>
+      </w:r>
+      <w:r>
+        <w:t xml:space="preserve">(đốt cháy “nhiên liệu” vàng) </w:t>
+      </w:r>
+      <w:r>
+        <w:t>của tiền lưu thông – tích lũy vốn trở lại với 800,000 đồng tiền vàng</w:t>
+      </w:r>
+      <w:r>
+        <w:t>. Như vậy 800,000 tiền giấy lưu thông giải phóng 800,000 đồng tiền vàng vì đồng tiền vàng còn là tài sản được chấp nhận ở nước ngoài</w:t>
+      </w:r>
+      <w:r>
+        <w:t xml:space="preserve"> trong khi tiền giấy chỉ có giá trị </w:t>
+      </w:r>
+      <w:r>
+        <w:t>trong một quốc gia</w:t>
+      </w:r>
+      <w:r>
+        <w:t xml:space="preserve">. Hơn nữa 800,000 tiền giấy lưu thông </w:t>
+      </w:r>
+      <w:r>
+        <w:t xml:space="preserve">nội tại </w:t>
+      </w:r>
+      <w:r>
+        <w:t xml:space="preserve">tương ứng với </w:t>
+      </w:r>
+      <w:r>
+        <w:t xml:space="preserve">1,000,000 </w:t>
+      </w:r>
+      <w:r>
+        <w:t xml:space="preserve">tổng thu nhập </w:t>
+      </w:r>
+      <w:r>
+        <w:t>xã hội</w:t>
+      </w:r>
+      <w:r>
+        <w:t xml:space="preserve"> </w:t>
+      </w:r>
+      <w:r>
+        <w:t>với tỉ lệ 4/5</w:t>
+      </w:r>
+      <w:r>
+        <w:t xml:space="preserve"> </w:t>
+      </w:r>
+      <w:r>
+        <w:t xml:space="preserve">= 800,000 / 1,000,000 </w:t>
+      </w:r>
+      <w:r>
+        <w:t xml:space="preserve">và giả sử </w:t>
+      </w:r>
+      <w:r>
+        <w:rPr>
+          <w:i/>
+        </w:rPr>
+        <w:t xml:space="preserve">tỉ lệ </w:t>
+      </w:r>
+      <w:r>
+        <w:rPr>
+          <w:i/>
+        </w:rPr>
+        <w:t>tương ứng tiền tệ</w:t>
+      </w:r>
+      <w:r>
+        <w:t xml:space="preserve"> </w:t>
+      </w:r>
+      <w:r>
+        <w:t xml:space="preserve">4/5 này vừa đủ, nếu tỉ lệ tiền giấy lớn hơn 4/5 là lạm phát và nhỏ hơn </w:t>
+      </w:r>
+      <w:r>
+        <w:t>4</w:t>
+      </w:r>
+      <w:r>
+        <w:t>/5 là giảm phát</w:t>
+      </w:r>
+      <w:r>
+        <w:t xml:space="preserve">. Ghi chú, Smith dùng thuật ngữ “sụt giảm giá trị tiền tệ” </w:t>
+      </w:r>
+      <w:r>
+        <w:t xml:space="preserve">khi </w:t>
+      </w:r>
+      <w:r>
+        <w:t>đề cập lạm phát.</w:t>
+      </w:r>
+      <w:r>
+        <w:t xml:space="preserve"> </w:t>
+      </w:r>
+      <w:r>
+        <w:t>Tiền giấy lưu thông nội tại tương ứng với tổng thu nhập theo một tỉ lệ nhỏ hơn 1, chứ không phải ngang bằng 1:1 vì lượng tiền lưu thông luôn nhỏ hơn tổng thu nhập do chuyển quyền sở hữu và sự thuận tiện.</w:t>
+      </w:r>
+      <w:r>
+        <w:t xml:space="preserve"> Tuy nhiên khi đồng tiền vàng được thay bằng tiền pháp định, vấn đề trở nên phức tạp </w:t>
+      </w:r>
+      <w:r>
+        <w:t xml:space="preserve">một chút </w:t>
+      </w:r>
+      <w:r>
+        <w:t>vì dạng vật lý của tiền pháp định là tiền giấy</w:t>
+      </w:r>
+      <w:r>
+        <w:t xml:space="preserve"> nhưng giá trị trao đổi </w:t>
+      </w:r>
+      <w:r>
+        <w:t xml:space="preserve">của </w:t>
+      </w:r>
+      <w:r>
+        <w:t>tiền pháp định là tỉ giá hối đoái.</w:t>
+      </w:r>
+      <w:r>
+        <w:t xml:space="preserve"> Nếu 800,000 tiền pháp định như tài sản đem đầu tư ra nước ngoài thì giá trị sẽ tăng hay giảm </w:t>
+      </w:r>
+      <w:r>
+        <w:t xml:space="preserve">tại nước ngoài (nước sở tại) </w:t>
+      </w:r>
+      <w:r>
+        <w:t xml:space="preserve">tùy theo tỉ giá hối đoái giữa </w:t>
+      </w:r>
+      <w:r>
+        <w:t xml:space="preserve">các </w:t>
+      </w:r>
+      <w:r>
+        <w:t>đồng tiền hai quốc gia</w:t>
+      </w:r>
+      <w:r>
+        <w:t>.</w:t>
+      </w:r>
+      <w:r>
+        <w:t xml:space="preserve"> </w:t>
+      </w:r>
+      <w:r>
+        <w:t>Quá trình phát hành tiền giấy không khác bao nhiêu hoạt động cho vay tín dụng của ngân hàng mà lợi nhuận của phát hành tiền giấy là lợi nhuận từ việc giải phóng nguồn vốn để đầ</w:t>
+      </w:r>
+      <w:r>
+        <w:t>u tư. D</w:t>
+      </w:r>
+      <w:r>
+        <w:t xml:space="preserve">o </w:t>
+      </w:r>
+      <w:r>
+        <w:t>vậy</w:t>
+      </w:r>
+      <w:r>
+        <w:t xml:space="preserve"> tờ tiền vật lý 1$ có một giá trị riêng bởi một loạt hoạt động đầu tư tạo lợi nhuận sau đó và tiền pháp định có giá trị trao đổi là tỉ giá hối đoái dựa trên sức mạnh cứng của quốc gia.</w:t>
+      </w:r>
+    </w:p>
+    <w:p>
+      <w:pPr>
+        <w:ind w:firstLine="360"/>
+      </w:pPr>
+      <w:r>
+        <w:t xml:space="preserve">Trở lại vấn đề lạm phát tức sụt giảm giá trị tiền tệ khi mà lượng tiền giấy phát hành vượt tỉ lệ tương ứng tiền tệ, một số hậu quả tiêu cực xảy ra như sau: 1) lúc này do lượng cung tiền nhiều hơn nhu cầu lưu thông nên người dân có xu hướng mang lượng tiền </w:t>
+      </w:r>
+      <w:r>
+        <w:t xml:space="preserve">giấy </w:t>
+      </w:r>
+      <w:r>
+        <w:t xml:space="preserve">dôi dư đổi tiền đồng vàng như mua tài sản gây áp lực lên ngân hàng </w:t>
+      </w:r>
+      <w:r>
+        <w:t xml:space="preserve">khiến ngân hàng cạn kiệt khả năng thanh toán vàng hoặc </w:t>
+      </w:r>
+      <w:r>
+        <w:t xml:space="preserve">buộc phải vay nguồn vốn khác để mua vàng và việc trả lãi làm suy giảm nguồn vốn quốc gia (Google 2026), 2) hàng hóa tự động cần nhiều tiền hơn để trao đổi một cách tự nhiên do lượng </w:t>
+      </w:r>
+      <w:r>
+        <w:t xml:space="preserve">tiền giấy </w:t>
+      </w:r>
+      <w:r>
+        <w:t xml:space="preserve">dôi dư khiến vật giá leo thang, 3) </w:t>
+      </w:r>
+      <w:r>
+        <w:t xml:space="preserve">lượng tiền </w:t>
+      </w:r>
+      <w:r>
+        <w:t xml:space="preserve">giấy </w:t>
+      </w:r>
+      <w:r>
+        <w:t xml:space="preserve">dôi dư trào ra không thể tiêu thụ ra nước ngoài nên tự động đẩy một lượng </w:t>
+      </w:r>
+      <w:r>
+        <w:t xml:space="preserve">tài sản </w:t>
+      </w:r>
+      <w:r>
+        <w:t>vàng ra nước ngoài mà không tạo ra gia trị gia tăng như đầu tư</w:t>
+      </w:r>
+      <w:r>
+        <w:t xml:space="preserve"> (Google 2026)</w:t>
+      </w:r>
+      <w:r>
+        <w:t>.</w:t>
+      </w:r>
+      <w:r>
+        <w:t xml:space="preserve"> </w:t>
+      </w:r>
+      <w:r>
+        <w:t>Smith đề ra nguyên tắc vàng để kềm chế lạm phát tức kềm chế sự sụt giảm giá trị tiền tệ vào thời của ông như sau “lượng tiền giấy phát hành không vượt quá lượng tiền đồng vàng cần thiết để lưu thông”</w:t>
+      </w:r>
+      <w:r>
+        <w:t xml:space="preserve"> (Google 2026)</w:t>
+      </w:r>
+      <w:r>
+        <w:t>, theo ví dụ trên thì lượng tiền giấy không vượt quá 800,000 cần thiết để lưu thông.</w:t>
+      </w:r>
+      <w:r>
+        <w:t xml:space="preserve"> Ngày nay với hệ thống tiền tệ pháp định, tỉ lệ lạm phát thay cho tỉ lệ tương ứng tiền tệ và tỉ lệ lạm phát được xác định bằng phần trăm chênh lệch giữa giá của hai giỏ hàng vào hai thời điểm với </w:t>
+      </w:r>
+      <w:r>
+        <w:rPr>
+          <w:i/>
+        </w:rPr>
+        <w:t>giỏ hàng</w:t>
+      </w:r>
+      <w:r>
+        <w:t xml:space="preserve"> bao gồm các mặt hàng/dịch vụ thiết yếu, đây là cách xác định theo </w:t>
+      </w:r>
+      <w:r>
+        <w:rPr>
+          <w:i/>
+        </w:rPr>
+        <w:t>chỉ số giá tiêu dùng</w:t>
+      </w:r>
+      <w:r>
+        <w:t xml:space="preserve"> (</w:t>
+      </w:r>
+      <w:r>
+        <w:t>c</w:t>
+      </w:r>
+      <w:r>
+        <w:t xml:space="preserve">onsumer </w:t>
+      </w:r>
+      <w:r>
+        <w:t>p</w:t>
+      </w:r>
+      <w:r>
+        <w:t xml:space="preserve">rice </w:t>
+      </w:r>
+      <w:r>
+        <w:t>i</w:t>
+      </w:r>
+      <w:r>
+        <w:t xml:space="preserve">ndex </w:t>
+      </w:r>
+      <w:r>
+        <w:t xml:space="preserve">– </w:t>
+      </w:r>
+      <w:r>
+        <w:t>CPI) dựa trên sức mua và sự tương ứng giữa tiền và hàng hóa/dịch vụ</w:t>
+      </w:r>
+      <w:r>
+        <w:t xml:space="preserve"> (Google 2026)</w:t>
+      </w:r>
+      <w:r>
+        <w:t>.</w:t>
+      </w:r>
+      <w:r>
+        <w:t xml:space="preserve"> </w:t>
+      </w:r>
+      <w:r>
+        <w:t>N</w:t>
+      </w:r>
+      <w:r>
+        <w:t>guyên tắc vàng của Smith về sự tương ứng giữa hàng hóa và tiền lưu thông luôn đúng</w:t>
+      </w:r>
+      <w:r>
+        <w:t>,</w:t>
+      </w:r>
+      <w:r>
+        <w:t xml:space="preserve"> ngay cả với công thức của </w:t>
+      </w:r>
+      <w:r>
+        <w:rPr>
+          <w:i/>
+        </w:rPr>
+        <w:t>thuyết số lượng tiền tệ</w:t>
+      </w:r>
+      <w:r>
+        <w:t xml:space="preserve">: </w:t>
+      </w:r>
+      <w:r>
+        <w:rPr>
+          <w:i/>
+        </w:rPr>
+        <w:t>M</w:t>
+      </w:r>
+      <w:r>
+        <w:t>*</w:t>
+      </w:r>
+      <w:r>
+        <w:rPr>
+          <w:i/>
+        </w:rPr>
+        <w:t>V</w:t>
+      </w:r>
+      <w:r>
+        <w:t xml:space="preserve"> = </w:t>
+      </w:r>
+      <w:r>
+        <w:rPr>
+          <w:i/>
+        </w:rPr>
+        <w:t>P</w:t>
+      </w:r>
+      <w:r>
+        <w:t>*</w:t>
+      </w:r>
+      <w:r>
+        <w:rPr>
+          <w:i/>
+        </w:rPr>
+        <w:t>Q</w:t>
+      </w:r>
+      <w:r>
+        <w:t xml:space="preserve">, trong đó </w:t>
+      </w:r>
+      <w:r>
+        <w:rPr>
+          <w:i/>
+        </w:rPr>
+        <w:t>M</w:t>
+      </w:r>
+      <w:r>
+        <w:t xml:space="preserve"> là lượng cung tiền do ngân hàng trung ương in</w:t>
+      </w:r>
+      <w:r>
+        <w:t xml:space="preserve"> và điều chỉnh</w:t>
+      </w:r>
+      <w:r>
+        <w:t xml:space="preserve">, </w:t>
+      </w:r>
+      <w:r>
+        <w:rPr>
+          <w:i/>
+        </w:rPr>
+        <w:t>V</w:t>
+      </w:r>
+      <w:r>
+        <w:t xml:space="preserve"> là tốc độ lưu thông tiền tệ tức số lần mà một đơn vị tiền tệ được sử dụng để mua hàng hóa dịch vụ trong một khoảng thời gian, </w:t>
+      </w:r>
+      <w:r>
+        <w:rPr>
+          <w:i/>
+        </w:rPr>
+        <w:t>P</w:t>
+      </w:r>
+      <w:r>
+        <w:t xml:space="preserve"> là mức giá chung tức giá tiền trung bình của </w:t>
+      </w:r>
+      <w:r>
+        <w:t>mỗi</w:t>
+      </w:r>
+      <w:r>
+        <w:t xml:space="preserve"> hàng hóa dịch vụ và </w:t>
+      </w:r>
+      <w:r>
+        <w:rPr>
+          <w:i/>
+        </w:rPr>
+        <w:t>Q</w:t>
+      </w:r>
+      <w:r>
+        <w:t xml:space="preserve"> là tổng sản lượng hàng hóa dịch vụ.</w:t>
+      </w:r>
+      <w:r>
+        <w:t xml:space="preserve"> Công thức nay được viết lại như sau: </w:t>
+      </w:r>
+      <w:r>
+        <w:rPr>
+          <w:i/>
+        </w:rPr>
+        <w:t>P</w:t>
+      </w:r>
+      <w:r>
+        <w:t xml:space="preserve"> = </w:t>
+      </w:r>
+      <w:r>
+        <w:rPr>
+          <w:i/>
+        </w:rPr>
+        <w:t>M</w:t>
+      </w:r>
+      <w:r>
+        <w:t xml:space="preserve"> *</w:t>
+      </w:r>
+      <w:r>
+        <w:rPr>
+          <w:i/>
+        </w:rPr>
+        <w:t>V</w:t>
+      </w:r>
+      <w:r>
+        <w:t xml:space="preserve"> / </w:t>
+      </w:r>
+      <w:r>
+        <w:rPr>
+          <w:i/>
+        </w:rPr>
+        <w:t>Q</w:t>
+      </w:r>
+      <w:r>
+        <w:t xml:space="preserve"> và lúc này </w:t>
+      </w:r>
+      <w:r>
+        <w:rPr>
+          <w:i/>
+        </w:rPr>
+        <w:t>P</w:t>
+      </w:r>
+      <w:r>
+        <w:t xml:space="preserve"> là </w:t>
+      </w:r>
+      <w:r>
+        <w:t>giá tiền trung bình của mỗi mặt hàng trong giỏ hàng</w:t>
+      </w:r>
+      <w:r>
+        <w:t xml:space="preserve">. Lượng cung tiền được xác định bằng tác vụ in tiền của ngân hàng và </w:t>
+      </w:r>
+      <w:r>
+        <w:lastRenderedPageBreak/>
+        <w:t xml:space="preserve">lượng cung này cũng được điều chỉnh bằng những công cụ tài chính như lãi suất, nghiệp vụ ngân hàng </w:t>
+      </w:r>
+      <w:proofErr w:type="gramStart"/>
+      <w:r>
+        <w:t>mở,…</w:t>
+      </w:r>
+      <w:proofErr w:type="gramEnd"/>
+      <w:r>
+        <w:t xml:space="preserve"> </w:t>
+      </w:r>
+      <w:r>
+        <w:t xml:space="preserve">Một cách đơn giản lượng cung tiền được in </w:t>
+      </w:r>
+      <w:r>
+        <w:rPr>
+          <w:i/>
+        </w:rPr>
+        <w:t>M</w:t>
+      </w:r>
+      <w:r>
+        <w:t xml:space="preserve"> = </w:t>
+      </w:r>
+      <w:r>
+        <w:rPr>
+          <w:i/>
+        </w:rPr>
+        <w:t>P</w:t>
+      </w:r>
+      <w:r>
+        <w:t>*</w:t>
+      </w:r>
+      <w:r>
+        <w:rPr>
+          <w:i/>
+        </w:rPr>
+        <w:t>Q</w:t>
+      </w:r>
+      <w:r>
+        <w:t xml:space="preserve"> / </w:t>
+      </w:r>
+      <w:r>
+        <w:rPr>
+          <w:i/>
+        </w:rPr>
+        <w:t>V</w:t>
+      </w:r>
+      <w:r>
+        <w:t xml:space="preserve"> được xác định dựa trên ước lượng </w:t>
+      </w:r>
+      <w:r>
+        <w:rPr>
+          <w:i/>
+        </w:rPr>
+        <w:t>P</w:t>
+      </w:r>
+      <w:r>
+        <w:t xml:space="preserve"> bởi </w:t>
+      </w:r>
+      <w:r>
+        <w:t>giá tiền trung bình của mỗi mặt hàng trong</w:t>
+      </w:r>
+      <w:r>
+        <w:t xml:space="preserve"> giỏ hàng </w:t>
+      </w:r>
+      <w:r>
+        <w:t>sản phẩm thiết yếu</w:t>
+      </w:r>
+      <w:r>
+        <w:t xml:space="preserve">. </w:t>
+      </w:r>
+      <w:r>
+        <w:t>T</w:t>
+      </w:r>
+      <w:r>
+        <w:t xml:space="preserve">ốc độ </w:t>
+      </w:r>
+      <w:r>
+        <w:rPr>
+          <w:i/>
+        </w:rPr>
+        <w:t>V</w:t>
+      </w:r>
+      <w:r>
+        <w:t xml:space="preserve"> khiến lượng tiền lưu thông bao giờ cũng nhỏ hơn tổng thu nhập xã hội và tích </w:t>
+      </w:r>
+      <w:r>
+        <w:rPr>
+          <w:i/>
+        </w:rPr>
+        <w:t>P</w:t>
+      </w:r>
+      <w:r>
+        <w:t>*</w:t>
+      </w:r>
+      <w:r>
+        <w:rPr>
+          <w:i/>
+        </w:rPr>
+        <w:t>Q</w:t>
+      </w:r>
+      <w:r>
+        <w:t xml:space="preserve"> </w:t>
+      </w:r>
+      <w:r>
+        <w:t>thể hiện</w:t>
+      </w:r>
+      <w:r>
+        <w:t xml:space="preserve"> tổng thu nhập xã hội</w:t>
+      </w:r>
+      <w:r>
+        <w:t>.</w:t>
+      </w:r>
+      <w:r>
+        <w:t xml:space="preserve"> </w:t>
+      </w:r>
+      <w:r>
+        <w:t xml:space="preserve">Lưu ý, tốc độ </w:t>
+      </w:r>
+      <w:r>
+        <w:rPr>
+          <w:i/>
+        </w:rPr>
+        <w:t>V</w:t>
+      </w:r>
+      <w:r>
+        <w:t xml:space="preserve"> </w:t>
+      </w:r>
+      <w:r>
+        <w:t>phản ánh việc chuyển quyền sở hữu tiền tệ và sự thuận tiện trong lưu thông tiền tệ</w:t>
+      </w:r>
+      <w:r>
+        <w:t>.</w:t>
+      </w:r>
+      <w:r>
+        <w:t xml:space="preserve"> Từ đây ta có thể suy ra mối liên hệ của tốc độ </w:t>
+      </w:r>
+      <w:r>
+        <w:rPr>
+          <w:i/>
+        </w:rPr>
+        <w:t>V</w:t>
+      </w:r>
+      <w:r>
+        <w:t xml:space="preserve"> và thuộc tính sinh sôi nảy nở của nền kinh tế thu nhỏ đến cấp độ vi mô. Hơn nữa tốc độ </w:t>
+      </w:r>
+      <w:r>
+        <w:rPr>
+          <w:i/>
+        </w:rPr>
+        <w:t>V</w:t>
+      </w:r>
+      <w:r>
+        <w:t xml:space="preserve"> này cũng phản ánh chu kỳ vòng quay vốn </w:t>
+      </w:r>
+      <w:r>
+        <w:rPr>
+          <w:rFonts w:cs="Times New Roman"/>
+          <w:i/>
+        </w:rPr>
+        <w:t>θ</w:t>
+      </w:r>
+      <w:r>
+        <w:t xml:space="preserve"> tức tham số của hàm thế năng trình độ sản xuất </w:t>
+      </w:r>
+      <w:proofErr w:type="gramStart"/>
+      <w:r>
+        <w:rPr>
+          <w:i/>
+        </w:rPr>
+        <w:t>f</w:t>
+      </w:r>
+      <w:r>
+        <w:t>(</w:t>
+      </w:r>
+      <w:proofErr w:type="gramEnd"/>
+      <w:r>
+        <w:rPr>
+          <w:i/>
+        </w:rPr>
+        <w:t>a</w:t>
+      </w:r>
+      <w:r>
+        <w:rPr>
+          <w:vertAlign w:val="subscript"/>
+        </w:rPr>
+        <w:t>1</w:t>
+      </w:r>
+      <w:r>
+        <w:t xml:space="preserve">, </w:t>
+      </w:r>
+      <w:r>
+        <w:rPr>
+          <w:i/>
+        </w:rPr>
+        <w:t>a</w:t>
+      </w:r>
+      <w:r>
+        <w:rPr>
+          <w:vertAlign w:val="subscript"/>
+        </w:rPr>
+        <w:t>2</w:t>
+      </w:r>
+      <w:r>
+        <w:t xml:space="preserve">, </w:t>
+      </w:r>
+      <w:r>
+        <w:rPr>
+          <w:i/>
+        </w:rPr>
+        <w:t>a</w:t>
+      </w:r>
+      <w:r>
+        <w:rPr>
+          <w:vertAlign w:val="subscript"/>
+        </w:rPr>
+        <w:t>3</w:t>
+      </w:r>
+      <w:r>
+        <w:t xml:space="preserve">, </w:t>
+      </w:r>
+      <w:r>
+        <w:rPr>
+          <w:i/>
+        </w:rPr>
+        <w:t>a</w:t>
+      </w:r>
+      <w:r>
+        <w:rPr>
+          <w:vertAlign w:val="subscript"/>
+        </w:rPr>
+        <w:t>4</w:t>
+      </w:r>
+      <w:r>
+        <w:t xml:space="preserve"> | </w:t>
+      </w:r>
+      <w:r>
+        <w:rPr>
+          <w:i/>
+        </w:rPr>
+        <w:t>d</w:t>
+      </w:r>
+      <w:r>
+        <w:t xml:space="preserve">, </w:t>
+      </w:r>
+      <w:r>
+        <w:rPr>
+          <w:rFonts w:cs="Times New Roman"/>
+          <w:i/>
+        </w:rPr>
+        <w:t>θ</w:t>
+      </w:r>
+      <w:r>
+        <w:t>) – lý giải quá trình tích lũy vốn:</w:t>
+      </w:r>
+    </w:p>
+    <w:p>
+      <m:oMathPara>
+        <m:oMath>
+          <m:r>
+            <w:rPr>
+              <w:rFonts w:ascii="Cambria Math" w:hAnsi="Cambria Math"/>
+            </w:rPr>
+            <m:t>f</m:t>
+          </m:r>
+          <m:d>
+            <m:dPr>
+              <m:ctrlPr>
+                <w:rPr>
+                  <w:rFonts w:ascii="Cambria Math" w:hAnsi="Cambria Math"/>
+                  <w:i/>
+                </w:rPr>
+              </m:ctrlPr>
+            </m:dPr>
+            <m:e>
+              <m:sSub>
+                <m:sSubPr>
+                  <m:ctrlPr>
+                    <w:rPr>
+                      <w:rFonts w:ascii="Cambria Math" w:hAnsi="Cambria Math"/>
+                      <w:i/>
+                    </w:rPr>
+                  </m:ctrlPr>
+                </m:sSubPr>
+                <m:e>
+                  <m:r>
+                    <w:rPr>
+                      <w:rFonts w:ascii="Cambria Math" w:hAnsi="Cambria Math"/>
+                    </w:rPr>
+                    <m:t>a</m:t>
+                  </m:r>
+                </m:e>
+                <m:sub>
+                  <m:r>
+                    <w:rPr>
+                      <w:rFonts w:ascii="Cambria Math" w:hAnsi="Cambria Math"/>
+                    </w:rPr>
+                    <m:t>1</m:t>
+                  </m:r>
+                </m:sub>
+              </m:sSub>
+              <m:r>
+                <w:rPr>
+                  <w:rFonts w:ascii="Cambria Math" w:hAnsi="Cambria Math"/>
+                </w:rPr>
+                <m:t>,</m:t>
+              </m:r>
+              <m:sSub>
+                <m:sSubPr>
+                  <m:ctrlPr>
+                    <w:rPr>
+                      <w:rFonts w:ascii="Cambria Math" w:hAnsi="Cambria Math"/>
+                      <w:i/>
+                    </w:rPr>
+                  </m:ctrlPr>
+                </m:sSubPr>
+                <m:e>
+                  <m:r>
+                    <w:rPr>
+                      <w:rFonts w:ascii="Cambria Math" w:hAnsi="Cambria Math"/>
+                    </w:rPr>
+                    <m:t>a</m:t>
+                  </m:r>
+                </m:e>
+                <m:sub>
+                  <m:r>
+                    <w:rPr>
+                      <w:rFonts w:ascii="Cambria Math" w:hAnsi="Cambria Math"/>
+                    </w:rPr>
+                    <m:t>2</m:t>
+                  </m:r>
+                </m:sub>
+              </m:sSub>
+              <m:r>
+                <w:rPr>
+                  <w:rFonts w:ascii="Cambria Math" w:hAnsi="Cambria Math"/>
+                </w:rPr>
+                <m:t>,</m:t>
+              </m:r>
+              <m:sSub>
+                <m:sSubPr>
+                  <m:ctrlPr>
+                    <w:rPr>
+                      <w:rFonts w:ascii="Cambria Math" w:hAnsi="Cambria Math"/>
+                      <w:i/>
+                    </w:rPr>
+                  </m:ctrlPr>
+                </m:sSubPr>
+                <m:e>
+                  <m:r>
+                    <w:rPr>
+                      <w:rFonts w:ascii="Cambria Math" w:hAnsi="Cambria Math"/>
+                    </w:rPr>
+                    <m:t>a</m:t>
+                  </m:r>
+                </m:e>
+                <m:sub>
+                  <m:r>
+                    <w:rPr>
+                      <w:rFonts w:ascii="Cambria Math" w:hAnsi="Cambria Math"/>
+                    </w:rPr>
+                    <m:t>3</m:t>
+                  </m:r>
+                </m:sub>
+              </m:sSub>
+              <m:r>
+                <w:rPr>
+                  <w:rFonts w:ascii="Cambria Math" w:hAnsi="Cambria Math"/>
+                </w:rPr>
+                <m:t>,</m:t>
+              </m:r>
+              <m:sSub>
+                <m:sSubPr>
+                  <m:ctrlPr>
+                    <w:rPr>
+                      <w:rFonts w:ascii="Cambria Math" w:hAnsi="Cambria Math"/>
+                      <w:i/>
+                    </w:rPr>
+                  </m:ctrlPr>
+                </m:sSubPr>
+                <m:e>
+                  <m:r>
+                    <w:rPr>
+                      <w:rFonts w:ascii="Cambria Math" w:hAnsi="Cambria Math"/>
+                    </w:rPr>
+                    <m:t>a</m:t>
+                  </m:r>
+                </m:e>
+                <m:sub>
+                  <m:r>
+                    <w:rPr>
+                      <w:rFonts w:ascii="Cambria Math" w:hAnsi="Cambria Math"/>
+                    </w:rPr>
+                    <m:t>4</m:t>
+                  </m:r>
+                </m:sub>
+              </m:sSub>
+            </m:e>
+            <m:e>
+              <m:r>
+                <w:rPr>
+                  <w:rFonts w:ascii="Cambria Math" w:hAnsi="Cambria Math"/>
+                </w:rPr>
+                <m:t>d,θ</m:t>
+              </m:r>
+            </m:e>
+          </m:d>
+          <m:r>
+            <w:rPr>
+              <w:rFonts w:ascii="Cambria Math" w:hAnsi="Cambria Math"/>
+            </w:rPr>
+            <m:t>=</m:t>
+          </m:r>
+          <m:d>
+            <m:dPr>
+              <m:ctrlPr>
+                <w:rPr>
+                  <w:rFonts w:ascii="Cambria Math" w:hAnsi="Cambria Math"/>
+                  <w:i/>
+                </w:rPr>
+              </m:ctrlPr>
+            </m:dPr>
+            <m:e>
+              <m:r>
+                <w:rPr>
+                  <w:rFonts w:ascii="Cambria Math" w:hAnsi="Cambria Math"/>
+                </w:rPr>
+                <m:t>d+</m:t>
+              </m:r>
+              <m:nary>
+                <m:naryPr>
+                  <m:chr m:val="∑"/>
+                  <m:limLoc m:val="undOvr"/>
+                  <m:ctrlPr>
+                    <w:rPr>
+                      <w:rFonts w:ascii="Cambria Math" w:hAnsi="Cambria Math"/>
+                      <w:i/>
+                    </w:rPr>
+                  </m:ctrlPr>
+                </m:naryPr>
+                <m:sub>
+                  <m:r>
+                    <w:rPr>
+                      <w:rFonts w:ascii="Cambria Math" w:hAnsi="Cambria Math"/>
+                    </w:rPr>
+                    <m:t>i=1</m:t>
+                  </m:r>
+                </m:sub>
+                <m:sup>
+                  <m:r>
+                    <w:rPr>
+                      <w:rFonts w:ascii="Cambria Math" w:hAnsi="Cambria Math"/>
+                    </w:rPr>
+                    <m:t>4</m:t>
+                  </m:r>
+                </m:sup>
+                <m:e>
+                  <m:sSub>
+                    <m:sSubPr>
+                      <m:ctrlPr>
+                        <w:rPr>
+                          <w:rFonts w:ascii="Cambria Math" w:hAnsi="Cambria Math"/>
+                          <w:i/>
+                        </w:rPr>
+                      </m:ctrlPr>
+                    </m:sSubPr>
+                    <m:e>
+                      <m:r>
+                        <w:rPr>
+                          <w:rFonts w:ascii="Cambria Math" w:hAnsi="Cambria Math"/>
+                        </w:rPr>
+                        <m:t>a</m:t>
+                      </m:r>
+                    </m:e>
+                    <m:sub>
+                      <m:r>
+                        <w:rPr>
+                          <w:rFonts w:ascii="Cambria Math" w:hAnsi="Cambria Math"/>
+                        </w:rPr>
+                        <m:t>i</m:t>
+                      </m:r>
+                    </m:sub>
+                  </m:sSub>
+                </m:e>
+              </m:nary>
+            </m:e>
+          </m:d>
+          <m:sSup>
+            <m:sSupPr>
+              <m:ctrlPr>
+                <w:rPr>
+                  <w:rFonts w:ascii="Cambria Math" w:hAnsi="Cambria Math"/>
+                  <w:i/>
+                </w:rPr>
+              </m:ctrlPr>
+            </m:sSupPr>
+            <m:e>
+              <m:d>
+                <m:dPr>
+                  <m:ctrlPr>
+                    <w:rPr>
+                      <w:rFonts w:ascii="Cambria Math" w:hAnsi="Cambria Math"/>
+                      <w:i/>
+                    </w:rPr>
+                  </m:ctrlPr>
+                </m:dPr>
+                <m:e>
+                  <m:r>
+                    <w:rPr>
+                      <w:rFonts w:ascii="Cambria Math" w:hAnsi="Cambria Math"/>
+                    </w:rPr>
+                    <m:t>1+r</m:t>
+                  </m:r>
+                </m:e>
+              </m:d>
+            </m:e>
+            <m:sup>
+              <m:r>
+                <w:rPr>
+                  <w:rFonts w:ascii="Cambria Math" w:hAnsi="Cambria Math"/>
+                </w:rPr>
+                <m:t>θ</m:t>
+              </m:r>
+            </m:sup>
+          </m:sSup>
+        </m:oMath>
+      </m:oMathPara>
+    </w:p>
+    <w:p>
+      <w:r>
+        <w:t xml:space="preserve">Nhắc lại, giá cả tự nhiên của hàng hóa được định nghĩa tổng quát bao gồm: 1) </w:t>
+      </w:r>
+      <w:r>
+        <w:t>tiền công</w:t>
+      </w:r>
+      <w:r>
+        <w:t xml:space="preserve"> với biến số </w:t>
+      </w:r>
+      <w:r>
+        <w:rPr>
+          <w:i/>
+        </w:rPr>
+        <w:t>a</w:t>
+      </w:r>
+      <w:r>
+        <w:rPr>
+          <w:vertAlign w:val="subscript"/>
+        </w:rPr>
+        <w:t>1</w:t>
+      </w:r>
+      <w:r>
+        <w:t xml:space="preserve">, 2) </w:t>
+      </w:r>
+      <w:r>
+        <w:t>vốn</w:t>
+      </w:r>
+      <w:r>
+        <w:t xml:space="preserve"> cố định với biến số </w:t>
+      </w:r>
+      <w:r>
+        <w:rPr>
+          <w:i/>
+        </w:rPr>
+        <w:t>a</w:t>
+      </w:r>
+      <w:r>
+        <w:rPr>
+          <w:vertAlign w:val="subscript"/>
+        </w:rPr>
+        <w:t>2</w:t>
+      </w:r>
+      <w:r>
+        <w:t xml:space="preserve">, 3) </w:t>
+      </w:r>
+      <w:r>
+        <w:t>chi phí cho bên thứ ba</w:t>
+      </w:r>
+      <w:r>
+        <w:t xml:space="preserve"> với biến số </w:t>
+      </w:r>
+      <w:r>
+        <w:rPr>
+          <w:i/>
+        </w:rPr>
+        <w:t>a</w:t>
+      </w:r>
+      <w:r>
+        <w:rPr>
+          <w:vertAlign w:val="subscript"/>
+        </w:rPr>
+        <w:t>3</w:t>
+      </w:r>
+      <w:r>
+        <w:t xml:space="preserve">, và 4) </w:t>
+      </w:r>
+      <w:r>
+        <w:t>chi phí vận chuyển</w:t>
+      </w:r>
+      <w:r>
+        <w:t xml:space="preserve"> với biến số </w:t>
+      </w:r>
+      <w:r>
+        <w:rPr>
+          <w:i/>
+        </w:rPr>
+        <w:t>a</w:t>
+      </w:r>
+      <w:r>
+        <w:rPr>
+          <w:vertAlign w:val="subscript"/>
+        </w:rPr>
+        <w:t>4</w:t>
+      </w:r>
+      <w:r>
+        <w:t>. T</w:t>
+      </w:r>
+      <w:r>
+        <w:t xml:space="preserve">rong khi đó </w:t>
+      </w:r>
+      <w:r>
+        <w:rPr>
+          <w:i/>
+        </w:rPr>
+        <w:t>d</w:t>
+      </w:r>
+      <w:r>
+        <w:t xml:space="preserve"> là biến số lượng bóc lột</w:t>
+      </w:r>
+      <w:r>
+        <w:t xml:space="preserve"> và </w:t>
+      </w:r>
+      <w:r>
+        <w:rPr>
+          <w:i/>
+        </w:rPr>
+        <w:t>r</w:t>
+      </w:r>
+      <w:r>
+        <w:t xml:space="preserve"> là tỉ suất lợi nhuận</w:t>
+      </w:r>
+      <w:r>
+        <w:t>.</w:t>
+      </w:r>
+      <w:r>
+        <w:t xml:space="preserve"> Như vậy chu kỳ vòng quay vốn liên quan đến chuyển quyền sở hữu tiền tệ, nghĩa là độ hoạt tác trong </w:t>
+      </w:r>
+      <w:r>
+        <w:t xml:space="preserve">quan </w:t>
+      </w:r>
+      <w:r>
+        <w:t xml:space="preserve">năng lưu thông tiền tệ thúc đẩy tăng lợi nhuận – tích lũy vốn và chính thuộc tính trao đổi hàng hóa và phân công lao động, một lần nữa, thúc đẩy </w:t>
+      </w:r>
+      <w:r>
+        <w:t xml:space="preserve">quan </w:t>
+      </w:r>
+      <w:r>
+        <w:t>năng lưu thông này.</w:t>
+      </w:r>
+      <w:r>
+        <w:t xml:space="preserve"> Lưu thông cũng quan trọng như sản xuất.</w:t>
+      </w:r>
+      <w:r>
+        <w:t xml:space="preserve"> </w:t>
+      </w:r>
+      <w:r>
+        <w:t>Thuyết số lượng tiền tệ là một phương thức đặt tương ứng gián tiếp giữa tổng thu nhập xã hội tức tổng vốn xã hội với tiền lưu thông, nghĩa là cũng đặt tương ứng giữa GDP và tiền lưu thông.</w:t>
+      </w:r>
+      <w:r>
+        <w:t xml:space="preserve"> Tỉ lệ lạm phát không </w:t>
+      </w:r>
+      <w:r>
+        <w:t>thể</w:t>
+      </w:r>
+      <w:r>
+        <w:t xml:space="preserve"> 0 tức không </w:t>
+      </w:r>
+      <w:r>
+        <w:t>thể</w:t>
+      </w:r>
+      <w:r>
+        <w:t xml:space="preserve"> đặt tương ứng 1:1 giữa tổng thu nhập và tiền lưu thông vì </w:t>
+      </w:r>
+      <w:r>
+        <w:t>ba</w:t>
+      </w:r>
+      <w:r>
+        <w:t xml:space="preserve"> lý do sau: 1) kích thích người dân tiêu dùng vì tiền mặt sẽ mất giá trong một khoảng thời gian</w:t>
+      </w:r>
+      <w:r>
+        <w:t>,</w:t>
+      </w:r>
+      <w:r>
+        <w:t xml:space="preserve"> 2) nếu nền kinh có dấu hiệu suy thoái thì ngân hàng trung ương sẽ thi hành chính sách tiền tệ mở rộng giảm lãi suất tín dụng khiến tăng tỉ lệ lạm phát đến mức mà nền kinh tế có thể chống chịu và nếu nền kinh tế có dấu hiệu tăng trưởng nóng thì ngân hàng trung ương sẽ thi hành chính sách tiền tệ thắt chặt tăng lãi suất tín dụng mà vẫn còn dư địa để </w:t>
+      </w:r>
+      <w:r>
+        <w:t xml:space="preserve">giảm </w:t>
+      </w:r>
+      <w:r>
+        <w:t>tỉ lệ lạm phát</w:t>
+      </w:r>
+      <w:r>
+        <w:t xml:space="preserve"> (Google 2026)</w:t>
+      </w:r>
+      <w:r>
+        <w:t>, và 3) tỉ lệ lạm phát 0 tức tương ứng 1:1 giữa tổng thu nhập và tiền lưu thông không thể kích phát nguồn lực dôi dư vào đầu tư</w:t>
+      </w:r>
+      <w:r>
+        <w:t xml:space="preserve">. Tất nhiên tỉ lệ lạm phát </w:t>
+      </w:r>
+      <w:r>
+        <w:t xml:space="preserve">nên </w:t>
+      </w:r>
+      <w:r>
+        <w:t>ở mức vừa phải, thông thường khoảng 2%.</w:t>
+      </w:r>
+    </w:p>
+    <w:p>
+      <w:pPr>
+        <w:ind w:firstLine="360"/>
+      </w:pPr>
+      <w:r>
+        <w:t xml:space="preserve">Trong công </w:t>
+      </w:r>
+      <w:r>
+        <w:t xml:space="preserve">thức tính số lượng tiền tệ </w:t>
+      </w:r>
+      <w:r>
+        <w:rPr>
+          <w:i/>
+        </w:rPr>
+        <w:t>M</w:t>
+      </w:r>
+      <w:r>
+        <w:t>*</w:t>
+      </w:r>
+      <w:r>
+        <w:rPr>
+          <w:i/>
+        </w:rPr>
+        <w:t>V</w:t>
+      </w:r>
+      <w:r>
+        <w:t xml:space="preserve"> = </w:t>
+      </w:r>
+      <w:r>
+        <w:rPr>
+          <w:i/>
+        </w:rPr>
+        <w:t>P</w:t>
+      </w:r>
+      <w:r>
+        <w:t>*</w:t>
+      </w:r>
+      <w:r>
+        <w:rPr>
+          <w:i/>
+        </w:rPr>
+        <w:t>Q</w:t>
+      </w:r>
+      <w:r>
+        <w:t xml:space="preserve">, khi </w:t>
+      </w:r>
+      <w:r>
+        <w:rPr>
+          <w:i/>
+        </w:rPr>
+        <w:t>P</w:t>
+      </w:r>
+      <w:r>
+        <w:t xml:space="preserve"> là </w:t>
+      </w:r>
+      <w:r>
+        <w:rPr>
+          <w:i/>
+        </w:rPr>
+        <w:t>mức giá chung</w:t>
+      </w:r>
+      <w:r>
+        <w:t xml:space="preserve"> </w:t>
+      </w:r>
+      <w:r>
+        <w:t xml:space="preserve">(mức giá cả chung) </w:t>
+      </w:r>
+      <w:r>
+        <w:t>của toàn nền kinh tế</w:t>
+      </w:r>
+      <w:r>
+        <w:t xml:space="preserve"> </w:t>
+      </w:r>
+      <w:r>
+        <w:t>thì</w:t>
+      </w:r>
+      <w:r>
+        <w:t xml:space="preserve"> tích </w:t>
+      </w:r>
+      <w:r>
+        <w:rPr>
+          <w:i/>
+        </w:rPr>
+        <w:t>P</w:t>
+      </w:r>
+      <w:r>
+        <w:t>*</w:t>
+      </w:r>
+      <w:r>
+        <w:rPr>
+          <w:i/>
+        </w:rPr>
+        <w:t>Q</w:t>
+      </w:r>
+      <w:r>
+        <w:t xml:space="preserve"> là GDP danh nghĩa </w:t>
+      </w:r>
+      <w:r>
+        <w:t>với</w:t>
+      </w:r>
+      <w:r>
+        <w:t xml:space="preserve"> </w:t>
+      </w:r>
+      <w:r>
+        <w:rPr>
+          <w:i/>
+        </w:rPr>
+        <w:t>P</w:t>
+      </w:r>
+      <w:r>
+        <w:t xml:space="preserve"> (năm nay) và </w:t>
+      </w:r>
+      <w:r>
+        <w:rPr>
+          <w:i/>
+        </w:rPr>
+        <w:t>Q</w:t>
+      </w:r>
+      <w:r>
+        <w:t xml:space="preserve"> (năm nay) được tính trong cùng một thời điểm, </w:t>
+      </w:r>
+      <w:r>
+        <w:t>và</w:t>
+      </w:r>
+      <w:r>
+        <w:t xml:space="preserve"> GDP danh nghĩa không quan tâm đến lạm phát. </w:t>
+      </w:r>
+      <w:r>
+        <w:t xml:space="preserve">Lưu ý, tích </w:t>
+      </w:r>
+      <w:r>
+        <w:rPr>
+          <w:i/>
+        </w:rPr>
+        <w:t>P</w:t>
+      </w:r>
+      <w:r>
+        <w:t>*</w:t>
+      </w:r>
+      <w:r>
+        <w:rPr>
+          <w:i/>
+        </w:rPr>
+        <w:t>Q</w:t>
+      </w:r>
+      <w:r>
+        <w:t xml:space="preserve"> </w:t>
+      </w:r>
+      <w:r>
+        <w:t xml:space="preserve">là tổng thu nhập Smith hay thu nhập ròng Smith được lượng giá tương đương với GDP danh nghĩa. </w:t>
+      </w:r>
+      <w:proofErr w:type="gramStart"/>
+      <w:r>
+        <w:t>Tuy</w:t>
+      </w:r>
+      <w:proofErr w:type="gramEnd"/>
+      <w:r>
+        <w:t xml:space="preserve"> nhiên với GDP thực </w:t>
+      </w:r>
+      <w:r>
+        <w:t>thì</w:t>
+      </w:r>
+      <w:r>
+        <w:t xml:space="preserve"> tích </w:t>
+      </w:r>
+      <w:r>
+        <w:rPr>
+          <w:i/>
+        </w:rPr>
+        <w:t>P</w:t>
+      </w:r>
+      <w:r>
+        <w:t>*</w:t>
+      </w:r>
+      <w:r>
+        <w:rPr>
+          <w:i/>
+        </w:rPr>
+        <w:t>Q</w:t>
+      </w:r>
+      <w:r>
+        <w:t xml:space="preserve"> được tính với </w:t>
+      </w:r>
+      <w:r>
+        <w:rPr>
+          <w:i/>
+        </w:rPr>
+        <w:t>P</w:t>
+      </w:r>
+      <w:r>
+        <w:t xml:space="preserve"> năm gốc và </w:t>
+      </w:r>
+      <w:r>
+        <w:rPr>
+          <w:i/>
+        </w:rPr>
+        <w:t>Q</w:t>
+      </w:r>
+      <w:r>
+        <w:t xml:space="preserve"> năm nay, nên quan tâm đến lạm phát</w:t>
+      </w:r>
+      <w:r>
+        <w:t xml:space="preserve"> (Google 2026)</w:t>
+      </w:r>
+      <w:r>
+        <w:t xml:space="preserve">. Tỉ số giữa GDP danh nghĩa và GDP thực được gọi là </w:t>
+      </w:r>
+      <w:r>
+        <w:rPr>
+          <w:i/>
+        </w:rPr>
+        <w:t>chỉ số khử lạm phát</w:t>
+      </w:r>
+      <w:r>
+        <w:t xml:space="preserve"> </w:t>
+      </w:r>
+      <w:r>
+        <w:t>/ chỉ số giảm phát GDP (</w:t>
+      </w:r>
+      <w:r>
+        <w:t xml:space="preserve">GDP </w:t>
+      </w:r>
+      <w:r>
+        <w:t>d</w:t>
+      </w:r>
+      <w:r>
+        <w:t>eflator</w:t>
+      </w:r>
+      <w:r>
+        <w:t xml:space="preserve">) </w:t>
+      </w:r>
+      <w:r>
+        <w:t>cho biết bao nhiêu phần trăm trong tăng trưởng GDP do giá cả tăng</w:t>
+      </w:r>
+      <w:r>
+        <w:t xml:space="preserve"> chứ không phải do sản xuất tăng</w:t>
+      </w:r>
+      <w:r>
+        <w:t xml:space="preserve"> (Google 2026)</w:t>
+      </w:r>
+      <w:r>
+        <w:t>. Như vậy ta có hai cách hiểu tương đương về lạm phát: 1) lạm phát là lượng tiền lưu thông nhiều hơn lượng hàng hóa trên thị trường, một cách chính xác, lượng tiền lưu thông quá mức cần thiết để hàng hóa trên thị trường trao đổi, 2)</w:t>
+      </w:r>
+      <w:r>
+        <w:t xml:space="preserve"> lạm phát là hiện tượng mà mức giá chung của hàng hóa dịch vụ tăng lên</w:t>
+      </w:r>
+      <w:r>
+        <w:t xml:space="preserve"> liên tục, kéo theo sụt giảm sức mua của đồng tiền (sự sụt giảm giá trị tiền tệ) (Google 2026). </w:t>
+      </w:r>
+      <w:r>
+        <w:t xml:space="preserve">Hai cách hiểu này tương đương vì giá cả tăng vọt đòi hỏi lượng tiền lưu thông nhiều hơn cần thiết. </w:t>
+      </w:r>
+      <w:r>
+        <w:t>Có ba nguyên nhân chính dẫn đến lạm phát: 1) lạm phát do cầu kéo cầu vượt quá cung khiến giá cả leo thang, 2) lạm phát do chi phí đẩy do chi phí nguyên vật liệu tăng thường khi khan hiếm khiến doanh nghiệp tăng giá sản phẩm, 3) lượng tiền tung ra thị trường nhiều hơn nhu cầu.</w:t>
+      </w:r>
+      <w:r>
+        <w:t xml:space="preserve"> </w:t>
+      </w:r>
+      <w:r>
+        <w:t xml:space="preserve">Vì mức giá chung </w:t>
+      </w:r>
+      <w:r>
+        <w:rPr>
+          <w:i/>
+        </w:rPr>
+        <w:t>P</w:t>
+      </w:r>
+      <w:r>
+        <w:t xml:space="preserve"> khó xác định nên </w:t>
+      </w:r>
+      <w:r>
+        <w:rPr>
+          <w:i/>
+        </w:rPr>
+        <w:t>P</w:t>
+      </w:r>
+      <w:r>
+        <w:t xml:space="preserve"> được đại diện bởi giá bình quân gia quyền </w:t>
+      </w:r>
+      <w:r>
+        <w:t xml:space="preserve">/ trung bình đơn giản </w:t>
+      </w:r>
+      <w:r>
+        <w:t>của giỏ hàng hoặc chỉ số khử lạm phát.</w:t>
+      </w:r>
+      <w:r>
+        <w:t xml:space="preserve"> Trong trường hợp chỉ số khử lạm phát được áp dụng ta có: </w:t>
+      </w:r>
+      <w:r>
+        <w:rPr>
+          <w:i/>
+        </w:rPr>
+        <w:t>M</w:t>
+      </w:r>
+      <w:r>
+        <w:t>*</w:t>
+      </w:r>
+      <w:r>
+        <w:rPr>
+          <w:i/>
+        </w:rPr>
+        <w:t>V</w:t>
+      </w:r>
+      <w:r>
+        <w:t xml:space="preserve"> = chỉ số khử lạm phát * GDP thực, bởi vì chỉ số </w:t>
+      </w:r>
+      <w:r>
+        <w:t xml:space="preserve">khử </w:t>
+      </w:r>
+      <w:r>
+        <w:t xml:space="preserve">lạm phát = GDP danh nghĩa / GDP thực nên ta có: </w:t>
+      </w:r>
+      <w:r>
+        <w:rPr>
+          <w:i/>
+        </w:rPr>
+        <w:t>M</w:t>
+      </w:r>
+      <w:r>
+        <w:t>*</w:t>
+      </w:r>
+      <w:r>
+        <w:rPr>
+          <w:i/>
+        </w:rPr>
+        <w:t>V</w:t>
+      </w:r>
+      <w:r>
+        <w:t xml:space="preserve"> = </w:t>
+      </w:r>
+      <w:r>
+        <w:rPr>
+          <w:i/>
+        </w:rPr>
+        <w:t>P</w:t>
+      </w:r>
+      <w:r>
+        <w:t>*</w:t>
+      </w:r>
+      <w:r>
+        <w:rPr>
+          <w:i/>
+        </w:rPr>
+        <w:t>Q</w:t>
+      </w:r>
+      <w:r>
+        <w:t xml:space="preserve"> = </w:t>
+      </w:r>
+      <w:r>
+        <w:t>GDP danh nghĩa.</w:t>
+      </w:r>
+      <w:r>
+        <w:t xml:space="preserve"> Lúc này GDP danh nghĩa và GDP thực được tính bởi phương pháp khác như </w:t>
+      </w:r>
+      <w:r>
+        <w:t>phương pháp chi tiêu</w:t>
+      </w:r>
+      <w:r>
+        <w:t xml:space="preserve"> </w:t>
+      </w:r>
+      <w:r>
+        <w:lastRenderedPageBreak/>
+        <w:t>với sự khác biệt nhỏ rằng GDP danh nghĩa dùng giá tại thời điểm hiện hành và GDP thực dùng giá tại thời điểm gốc trước đó.</w:t>
+      </w:r>
+      <w:r>
+        <w:t xml:space="preserve"> </w:t>
+      </w:r>
+      <w:r>
+        <w:t>Ghi chú,</w:t>
+      </w:r>
+      <w:r>
+        <w:t xml:space="preserve"> với một giỏ hàng gồm </w:t>
+      </w:r>
+      <w:r>
+        <w:rPr>
+          <w:i/>
+        </w:rPr>
+        <w:t>n</w:t>
+      </w:r>
+      <w:r>
+        <w:t xml:space="preserve"> mặt hàng thiết yếu có tổng giá là </w:t>
+      </w:r>
+      <w:r>
+        <w:rPr>
+          <w:i/>
+        </w:rPr>
+        <w:t>P</w:t>
+      </w:r>
+      <w:r>
+        <w:rPr>
+          <w:vertAlign w:val="subscript"/>
+        </w:rPr>
+        <w:t>1</w:t>
+      </w:r>
+      <w:r>
+        <w:t xml:space="preserve"> năm </w:t>
+      </w:r>
+      <w:r>
+        <w:t>gốc</w:t>
+      </w:r>
+      <w:r>
+        <w:t xml:space="preserve"> và </w:t>
+      </w:r>
+      <w:r>
+        <w:rPr>
+          <w:i/>
+        </w:rPr>
+        <w:t>P</w:t>
+      </w:r>
+      <w:r>
+        <w:rPr>
+          <w:vertAlign w:val="subscript"/>
+        </w:rPr>
+        <w:t>2</w:t>
+      </w:r>
+      <w:r>
+        <w:t xml:space="preserve"> năm nay thì </w:t>
+      </w:r>
+      <w:r>
+        <w:t xml:space="preserve">ta có </w:t>
+      </w:r>
+      <w:r>
+        <w:t xml:space="preserve">chỉ số giá tiêu dùng </w:t>
+      </w:r>
+      <w:r>
+        <w:t xml:space="preserve">năm nay </w:t>
+      </w:r>
+      <w:r>
+        <w:t>(CPI</w:t>
+      </w:r>
+      <w:r>
+        <w:t xml:space="preserve"> năm nay</w:t>
+      </w:r>
+      <w:r>
+        <w:t xml:space="preserve">) = </w:t>
+      </w:r>
+      <w:r>
+        <w:rPr>
+          <w:i/>
+        </w:rPr>
+        <w:t>P</w:t>
+      </w:r>
+      <w:r>
+        <w:rPr>
+          <w:vertAlign w:val="subscript"/>
+        </w:rPr>
+        <w:t>1</w:t>
+      </w:r>
+      <w:r>
+        <w:t xml:space="preserve"> / </w:t>
+      </w:r>
+      <w:r>
+        <w:rPr>
+          <w:i/>
+        </w:rPr>
+        <w:t>P</w:t>
+      </w:r>
+      <w:r>
+        <w:rPr>
+          <w:vertAlign w:val="subscript"/>
+        </w:rPr>
+        <w:t>2</w:t>
+      </w:r>
+      <w:r>
+        <w:t>, chỉ số lạm phát = (CPI năm</w:t>
+      </w:r>
+      <w:r>
+        <w:t xml:space="preserve"> nay </w:t>
+      </w:r>
+      <w:r>
+        <w:t xml:space="preserve">– </w:t>
+      </w:r>
+      <w:r>
+        <w:t>CPI năm gốc</w:t>
+      </w:r>
+      <w:r>
+        <w:t xml:space="preserve">) / </w:t>
+      </w:r>
+      <w:r>
+        <w:t>CPI năm gốc</w:t>
+      </w:r>
+      <w:r>
+        <w:t xml:space="preserve"> = (</w:t>
+      </w:r>
+      <w:r>
+        <w:rPr>
+          <w:i/>
+        </w:rPr>
+        <w:t>P</w:t>
+      </w:r>
+      <w:r>
+        <w:rPr>
+          <w:vertAlign w:val="subscript"/>
+        </w:rPr>
+        <w:t>2</w:t>
+      </w:r>
+      <w:r>
+        <w:t xml:space="preserve"> – </w:t>
+      </w:r>
+      <w:r>
+        <w:rPr>
+          <w:i/>
+        </w:rPr>
+        <w:t>P</w:t>
+      </w:r>
+      <w:r>
+        <w:rPr>
+          <w:vertAlign w:val="subscript"/>
+        </w:rPr>
+        <w:t>1</w:t>
+      </w:r>
+      <w:r>
+        <w:t xml:space="preserve">) / </w:t>
+      </w:r>
+      <w:r>
+        <w:rPr>
+          <w:i/>
+        </w:rPr>
+        <w:t>P</w:t>
+      </w:r>
+      <w:r>
+        <w:rPr>
+          <w:vertAlign w:val="subscript"/>
+        </w:rPr>
+        <w:t>1</w:t>
+      </w:r>
+      <w:r>
+        <w:t xml:space="preserve">, </w:t>
+      </w:r>
+      <w:r>
+        <w:t xml:space="preserve">và </w:t>
+      </w:r>
+      <w:r>
+        <w:t xml:space="preserve">mức giá chung </w:t>
+      </w:r>
+      <w:r>
+        <w:t xml:space="preserve">năm nay </w:t>
+      </w:r>
+      <w:r>
+        <w:t>(</w:t>
+      </w:r>
+      <w:r>
+        <w:rPr>
+          <w:i/>
+        </w:rPr>
+        <w:t>P</w:t>
+      </w:r>
+      <w:r>
+        <w:t xml:space="preserve">) = </w:t>
+      </w:r>
+      <w:r>
+        <w:rPr>
+          <w:i/>
+        </w:rPr>
+        <w:t>P</w:t>
+      </w:r>
+      <w:r>
+        <w:rPr>
+          <w:vertAlign w:val="subscript"/>
+        </w:rPr>
+        <w:t>2</w:t>
+      </w:r>
+      <w:r>
+        <w:t>/</w:t>
+      </w:r>
+      <w:r>
+        <w:rPr>
+          <w:i/>
+        </w:rPr>
+        <w:t>n</w:t>
+      </w:r>
+      <w:r>
+        <w:t>.</w:t>
       </w:r>
     </w:p>
     <w:p/>
-    <w:p/>
+    <w:p>
+      <w:bookmarkStart w:id="8" w:name="_GoBack"/>
+      <w:bookmarkEnd w:id="8"/>
+    </w:p>
     <w:p>
       <w:pPr>
         <w:pStyle w:val="Heading1"/>
@@ -15954,7 +18373,7 @@
           <w:rPr>
             <w:noProof/>
           </w:rPr>
-          <w:t>20</w:t>
+          <w:t>35</w:t>
         </w:r>
         <w:r>
           <w:rPr>
@@ -17073,7 +19492,7 @@
 </file>
 
 <file path=customXml/itemProps1.xml><?xml version="1.0" encoding="utf-8"?>
-<ds:datastoreItem xmlns:ds="http://schemas.openxmlformats.org/officeDocument/2006/customXml" ds:itemID="{35249547-ECC3-430D-9D59-B284DD721C79}">
+<ds:datastoreItem xmlns:ds="http://schemas.openxmlformats.org/officeDocument/2006/customXml" ds:itemID="{ADAB598A-3163-467A-A3D4-D6874045D006}">
   <ds:schemaRefs>
     <ds:schemaRef ds:uri="http://schemas.openxmlformats.org/officeDocument/2006/bibliography"/>
   </ds:schemaRefs>

</xml_diff>

<commit_message>
Update TDKT version 1.0 build 2026.04.10.
</commit_message>
<xml_diff>
--- a/articles/TuDoKinhTe.docx
+++ b/articles/TuDoKinhTe.docx
@@ -14498,7 +14498,19 @@
         <w:t>tín dụng</w:t>
       </w:r>
       <w:r>
-        <w:t xml:space="preserve"> là thuật ngữ chỉ lượng tiền cho vay hoặc vay.</w:t>
+        <w:t xml:space="preserve"> </w:t>
+      </w:r>
+      <w:r>
+        <w:t xml:space="preserve">(credit) </w:t>
+      </w:r>
+      <w:r>
+        <w:t>là thuật ngữ chỉ lượng tiền cho vay hoặc vay</w:t>
+      </w:r>
+      <w:r>
+        <w:t xml:space="preserve"> và lượng tiền bút toán phát hành qua ngân hàng có thể được hiểu như tín dụng</w:t>
+      </w:r>
+      <w:r>
+        <w:t>.</w:t>
       </w:r>
       <w:r>
         <w:rPr>
@@ -14736,261 +14748,262 @@
         <w:t>L</w:t>
       </w:r>
       <w:r>
-        <w:t xml:space="preserve">úc này nếu ngân hàng trung ương mua trở lại nội tệ bằng ngoại hối (USD) thì sẽ làm sụt giảm nguồn dự trữ ngoại hối ảnh hưởng nghiêm trọng đến vùng đệm thanh </w:t>
-      </w:r>
-      <w:proofErr w:type="gramStart"/>
-      <w:r>
-        <w:t>khoản</w:t>
+        <w:t>úc này nếu ngân hàng trung ương mua trở lại nội tệ bằng ngoại hối (USD) thì sẽ làm sụt giảm nguồn dự trữ ngoại hối ảnh hưởng nghiêm trọng đến vùng đệm thanh khoản</w:t>
+      </w:r>
+      <w:r>
+        <w:t xml:space="preserve"> </w:t>
+      </w:r>
+      <w:r>
+        <w:t>(Google AI 2026)</w:t>
+      </w:r>
+      <w:r>
+        <w:t>.</w:t>
+      </w:r>
+      <w:r>
+        <w:t xml:space="preserve"> Hơn nữa, khi nội tệ mất giá tức lượng nội tệ dôi dư quá mức cần thiết, nếu người dân đổ xô đổi nội tệ mua ngoại hối (USD, vàng) thì khiến lượng vốn đầu tư cho sản xuất trên toàn xã hội sụt giảm nghiêm trọng</w:t>
+      </w:r>
+      <w:r>
+        <w:t xml:space="preserve"> (Google AI 2026)</w:t>
+      </w:r>
+      <w:r>
+        <w:t>.</w:t>
+      </w:r>
+      <w:r>
+        <w:t xml:space="preserve"> Nếu mua ngoại tệ trên </w:t>
+      </w:r>
+      <w:r>
+        <w:rPr>
+          <w:i/>
+        </w:rPr>
+        <w:t xml:space="preserve">thị trường ngoại hối </w:t>
+      </w:r>
+      <w:r>
+        <w:rPr>
+          <w:i/>
+        </w:rPr>
+        <w:t>quốc tế</w:t>
+      </w:r>
+      <w:r>
+        <w:t xml:space="preserve"> </w:t>
+      </w:r>
+      <w:r>
+        <w:t xml:space="preserve">(international </w:t>
+      </w:r>
+      <w:r>
+        <w:t xml:space="preserve">foreign </w:t>
+      </w:r>
+      <w:r>
+        <w:t>e</w:t>
+      </w:r>
+      <w:r>
+        <w:t>xchange market</w:t>
+      </w:r>
+      <w:r>
+        <w:t xml:space="preserve">) </w:t>
+      </w:r>
+      <w:r>
+        <w:t xml:space="preserve">đúng </w:t>
+      </w:r>
+      <w:r>
+        <w:t>bằng lượng tiền thừa dùng để đầu tư ra nước ngoài thay vì mua ngoại tệ trong thị trường nội địa thì cũng gây ra lạm phát.</w:t>
+      </w:r>
+      <w:r>
+        <w:t xml:space="preserve"> Trước khi tìm hiểu thị trường ngoại hối quốc tế, ta hãy tìm hiểu hệ thống thanh toán liên ngân hàng giữa các quốc gia.</w:t>
+      </w:r>
+      <w:r>
+        <w:t xml:space="preserve"> </w:t>
+      </w:r>
+      <w:r>
+        <w:t xml:space="preserve">Trong thanh toán liên ngân hàng quốc tế, hai ngân hàng trung ương của hai quốc gia, giả sử là A và B, đều mở tài khoản lẫn nhau ở mỗi bên, cụ thể ngân hàng A mở một tài khoản tại ngân hàng B được gọi là tài khoản </w:t>
+      </w:r>
+      <w:r>
+        <w:rPr>
+          <w:i/>
+        </w:rPr>
+        <w:t>Nostro</w:t>
+      </w:r>
+      <w:r>
+        <w:t xml:space="preserve"> </w:t>
+      </w:r>
+      <w:r>
+        <w:rPr>
+          <w:i/>
+        </w:rPr>
+        <w:t>A-B</w:t>
+      </w:r>
+      <w:r>
+        <w:t xml:space="preserve"> và ngân hàng B mở một tài khoản tại ngân hàng A được gọi là </w:t>
+      </w:r>
+      <w:r>
+        <w:rPr>
+          <w:i/>
+        </w:rPr>
+        <w:t>Nostro B-A</w:t>
+      </w:r>
+      <w:r>
+        <w:t xml:space="preserve">, theo đó </w:t>
+      </w:r>
+      <w:r>
+        <w:t>Nostro A-B</w:t>
+      </w:r>
+      <w:r>
+        <w:t xml:space="preserve"> nghĩa </w:t>
+      </w:r>
+      <w:r>
+        <w:t xml:space="preserve">là </w:t>
+      </w:r>
+      <w:r>
+        <w:t xml:space="preserve">tài tài khoản của A tại B và </w:t>
+      </w:r>
+      <w:r>
+        <w:t>Nostro B-A</w:t>
+      </w:r>
+      <w:r>
+        <w:t xml:space="preserve"> là tài khoản của B tại A</w:t>
+      </w:r>
+      <w:r>
+        <w:t xml:space="preserve">. </w:t>
+      </w:r>
+      <w:r>
+        <w:t xml:space="preserve">Lưu ý, theo bên B thì tài khoản </w:t>
+      </w:r>
+      <w:r>
+        <w:t>Nostro A-B</w:t>
+      </w:r>
+      <w:r>
+        <w:t xml:space="preserve"> được gọi là tài khoản </w:t>
+      </w:r>
+      <w:r>
+        <w:rPr>
+          <w:i/>
+        </w:rPr>
+        <w:t>Vostro</w:t>
+      </w:r>
+      <w:r>
+        <w:t xml:space="preserve"> của A và theo bên A thì tài khoản </w:t>
+      </w:r>
+      <w:r>
+        <w:t xml:space="preserve">Nostro </w:t>
+      </w:r>
+      <w:r>
+        <w:t>B</w:t>
+      </w:r>
+      <w:r>
+        <w:t>-</w:t>
+      </w:r>
+      <w:r>
+        <w:t>A được gọi là tài khoản Vostro của B.</w:t>
+      </w:r>
+      <w:r>
+        <w:t xml:space="preserve"> </w:t>
+      </w:r>
+      <w:r>
+        <w:t xml:space="preserve">Hệ thống thanh toán liên ngân hàng quốc tế được hiện thực hóa thông qua </w:t>
+      </w:r>
+      <w:r>
+        <w:rPr>
+          <w:i/>
+        </w:rPr>
+        <w:t>SWIFT</w:t>
+      </w:r>
+      <w:r>
+        <w:t xml:space="preserve">, viết tắt của </w:t>
+      </w:r>
+      <w:r>
+        <w:t>Society for Worldwide Interbank Financi</w:t>
+      </w:r>
+      <w:r>
+        <w:t xml:space="preserve">al Telecommunication, là </w:t>
+      </w:r>
+      <w:r>
+        <w:t>một mạng lưới nhắn tin bảo mật giữa các ngân hàng</w:t>
+      </w:r>
+      <w:r>
+        <w:t xml:space="preserve"> </w:t>
+      </w:r>
+      <w:r>
+        <w:t>quốc tế</w:t>
+      </w:r>
+      <w:r>
+        <w:t>.</w:t>
+      </w:r>
+      <w:r>
+        <w:t xml:space="preserve"> Giả sử ngân hàng trung ương A cần mua 1 tỷ USD từ quốc gia B thì A nhắn </w:t>
+      </w:r>
+      <w:r>
+        <w:t xml:space="preserve">đến B </w:t>
+      </w:r>
+      <w:r>
+        <w:t xml:space="preserve">một tin </w:t>
+      </w:r>
+      <w:r>
+        <w:t xml:space="preserve">nhắn </w:t>
+      </w:r>
+      <w:r>
+        <w:t xml:space="preserve">“chuyển khoản 1 tỷ USD vào ngân hàng </w:t>
+      </w:r>
+      <w:r>
+        <w:t>A</w:t>
+      </w:r>
+      <w:r>
+        <w:t>” qua mạng lưới SWIFT, khi nhận được tin nhắn</w:t>
+      </w:r>
+      <w:r>
+        <w:t xml:space="preserve"> thì</w:t>
+      </w:r>
+      <w:r>
+        <w:t xml:space="preserve"> B </w:t>
+      </w:r>
+      <w:r>
+        <w:t xml:space="preserve">chuyển 1 tỷ USD vào </w:t>
+      </w:r>
+      <w:r>
+        <w:t xml:space="preserve">tài khoản </w:t>
+      </w:r>
+      <w:r>
+        <w:t>Nostro A-B</w:t>
+      </w:r>
+      <w:r>
+        <w:t xml:space="preserve"> </w:t>
       </w:r>
       <w:r>
         <w:t>(</w:t>
       </w:r>
-      <w:proofErr w:type="gramEnd"/>
-      <w:r>
-        <w:t>Google AI 2026)</w:t>
+      <w:r>
+        <w:t xml:space="preserve">theo </w:t>
+      </w:r>
+      <w:r>
+        <w:t>USD)</w:t>
+      </w:r>
+      <w:r>
+        <w:t xml:space="preserve"> </w:t>
+      </w:r>
+      <w:r>
+        <w:t xml:space="preserve">đồng thời trừ đi </w:t>
+      </w:r>
+      <w:r>
+        <w:t xml:space="preserve">tài khoản </w:t>
+      </w:r>
+      <w:r>
+        <w:t>dự trữ ngoại hối của B 1 tỷ USD</w:t>
       </w:r>
       <w:r>
         <w:t>.</w:t>
       </w:r>
       <w:r>
-        <w:t xml:space="preserve"> Hơn nữa, khi nội tệ mất giá tức lượng nội tệ dôi dư quá mức cần thiết, nếu người dân đổ xô đổi nội tệ mua ngoại hối (USD, vàng) thì khiến lượng vốn đầu tư cho sản xuất trên toàn xã hội sụt giảm nghiêm trọng</w:t>
-      </w:r>
-      <w:r>
-        <w:t xml:space="preserve"> (Google AI 2026)</w:t>
-      </w:r>
-      <w:r>
-        <w:t>.</w:t>
-      </w:r>
-      <w:r>
-        <w:t xml:space="preserve"> Nếu mua ngoại tệ trên </w:t>
-      </w:r>
-      <w:r>
-        <w:rPr>
-          <w:i/>
-        </w:rPr>
-        <w:t xml:space="preserve">thị trường ngoại hối </w:t>
-      </w:r>
-      <w:r>
-        <w:rPr>
-          <w:i/>
-        </w:rPr>
-        <w:t>quốc tế</w:t>
-      </w:r>
-      <w:r>
-        <w:t xml:space="preserve"> </w:t>
-      </w:r>
-      <w:r>
-        <w:t xml:space="preserve">(international </w:t>
-      </w:r>
-      <w:r>
-        <w:t xml:space="preserve">foreign </w:t>
-      </w:r>
-      <w:r>
-        <w:t>e</w:t>
-      </w:r>
-      <w:r>
-        <w:t>xchange market</w:t>
-      </w:r>
-      <w:r>
-        <w:t xml:space="preserve">) </w:t>
-      </w:r>
-      <w:r>
-        <w:t xml:space="preserve">đúng </w:t>
-      </w:r>
-      <w:r>
-        <w:t>bằng lượng tiền thừa dùng để đầu tư ra nước ngoài thay vì mua ngoại tệ trong thị trường nội địa thì cũng gây ra lạm phát.</w:t>
-      </w:r>
-      <w:r>
-        <w:t xml:space="preserve"> Trước khi tìm hiểu thị trường ngoại hối quốc tế, ta hãy tìm hiểu hệ thống thanh toán liên ngân hàng giữa các quốc gia.</w:t>
-      </w:r>
-      <w:r>
-        <w:t xml:space="preserve"> </w:t>
-      </w:r>
-      <w:r>
-        <w:t xml:space="preserve">Trong thanh toán liên ngân hàng quốc tế, hai ngân hàng trung ương của hai quốc gia, giả sử là A và B, đều mở tài khoản lẫn nhau ở mỗi bên, cụ thể ngân hàng A mở một tài khoản tại ngân hàng B được gọi là tài khoản </w:t>
-      </w:r>
-      <w:r>
-        <w:rPr>
-          <w:i/>
-        </w:rPr>
-        <w:t>Nostro</w:t>
-      </w:r>
-      <w:r>
-        <w:t xml:space="preserve"> </w:t>
-      </w:r>
-      <w:r>
-        <w:rPr>
-          <w:i/>
-        </w:rPr>
-        <w:t>A-B</w:t>
-      </w:r>
-      <w:r>
-        <w:t xml:space="preserve"> và ngân hàng B mở một tài khoản tại ngân hàng A được gọi là </w:t>
-      </w:r>
-      <w:r>
-        <w:rPr>
-          <w:i/>
-        </w:rPr>
-        <w:t>Nostro B-A</w:t>
-      </w:r>
-      <w:r>
-        <w:t xml:space="preserve">, theo đó </w:t>
-      </w:r>
-      <w:r>
-        <w:t>Nostro A-B</w:t>
-      </w:r>
-      <w:r>
-        <w:t xml:space="preserve"> nghĩa </w:t>
-      </w:r>
-      <w:r>
-        <w:t xml:space="preserve">là </w:t>
-      </w:r>
-      <w:r>
-        <w:t xml:space="preserve">tài tài khoản của A tại B và </w:t>
-      </w:r>
-      <w:r>
-        <w:t>Nostro B-A</w:t>
-      </w:r>
-      <w:r>
-        <w:t xml:space="preserve"> là tài khoản của B tại A</w:t>
-      </w:r>
-      <w:r>
-        <w:t xml:space="preserve">. </w:t>
-      </w:r>
-      <w:r>
-        <w:t xml:space="preserve">Lưu ý, theo bên B thì tài khoản </w:t>
-      </w:r>
-      <w:r>
-        <w:t>Nostro A-B</w:t>
-      </w:r>
-      <w:r>
-        <w:t xml:space="preserve"> được gọi là tài khoản </w:t>
-      </w:r>
-      <w:r>
-        <w:rPr>
-          <w:i/>
-        </w:rPr>
-        <w:t>Vostro</w:t>
-      </w:r>
-      <w:r>
-        <w:t xml:space="preserve"> của A và theo bên A thì tài khoản </w:t>
-      </w:r>
-      <w:r>
-        <w:t xml:space="preserve">Nostro </w:t>
-      </w:r>
-      <w:r>
-        <w:t>B</w:t>
-      </w:r>
-      <w:r>
-        <w:t>-</w:t>
-      </w:r>
-      <w:r>
-        <w:t>A được gọi là tài khoản Vostro của B.</w:t>
-      </w:r>
-      <w:r>
-        <w:t xml:space="preserve"> </w:t>
-      </w:r>
-      <w:r>
-        <w:t xml:space="preserve">Hệ thống thanh toán liên ngân hàng quốc tế được hiện thực hóa thông qua </w:t>
-      </w:r>
-      <w:r>
-        <w:rPr>
-          <w:i/>
-        </w:rPr>
-        <w:t>SWIFT</w:t>
-      </w:r>
-      <w:r>
-        <w:t xml:space="preserve">, viết tắt của </w:t>
-      </w:r>
-      <w:r>
-        <w:t>Society for Worldwide Interbank Financi</w:t>
-      </w:r>
-      <w:r>
-        <w:t xml:space="preserve">al Telecommunication, là </w:t>
-      </w:r>
-      <w:r>
-        <w:t>một mạng lưới nhắn tin bảo mật giữa các ngân hàng</w:t>
-      </w:r>
-      <w:r>
-        <w:t xml:space="preserve"> </w:t>
-      </w:r>
-      <w:r>
-        <w:t>quốc tế</w:t>
-      </w:r>
-      <w:r>
-        <w:t>.</w:t>
-      </w:r>
-      <w:r>
-        <w:t xml:space="preserve"> Giả sử ngân hàng trung ương A cần mua 1 tỷ USD từ quốc gia B thì A nhắn </w:t>
-      </w:r>
-      <w:r>
-        <w:t xml:space="preserve">đến B </w:t>
-      </w:r>
-      <w:r>
-        <w:t xml:space="preserve">một tin </w:t>
-      </w:r>
-      <w:r>
-        <w:t xml:space="preserve">nhắn </w:t>
-      </w:r>
-      <w:r>
-        <w:t xml:space="preserve">“chuyển khoản 1 tỷ USD vào ngân hàng </w:t>
-      </w:r>
-      <w:r>
-        <w:t>A</w:t>
-      </w:r>
-      <w:r>
-        <w:t>” qua mạng lưới SWIFT, khi nhận được tin nhắn</w:t>
-      </w:r>
-      <w:r>
-        <w:t xml:space="preserve"> thì</w:t>
-      </w:r>
-      <w:r>
-        <w:t xml:space="preserve"> B </w:t>
-      </w:r>
-      <w:r>
-        <w:t xml:space="preserve">chuyển 1 tỷ USD vào </w:t>
-      </w:r>
-      <w:r>
-        <w:t xml:space="preserve">tài khoản </w:t>
-      </w:r>
-      <w:r>
-        <w:t>Nostro A-B</w:t>
-      </w:r>
-      <w:r>
-        <w:t xml:space="preserve"> </w:t>
-      </w:r>
-      <w:r>
-        <w:t>(</w:t>
-      </w:r>
-      <w:r>
-        <w:t xml:space="preserve">theo </w:t>
-      </w:r>
-      <w:r>
-        <w:t>USD)</w:t>
-      </w:r>
-      <w:r>
-        <w:t xml:space="preserve"> </w:t>
-      </w:r>
-      <w:r>
-        <w:t xml:space="preserve">đồng thời trừ đi </w:t>
-      </w:r>
-      <w:r>
-        <w:t xml:space="preserve">tài khoản </w:t>
-      </w:r>
-      <w:r>
-        <w:t>dự trữ ngoại hối của B 1 tỷ USD</w:t>
-      </w:r>
-      <w:r>
-        <w:t>.</w:t>
-      </w:r>
-      <w:r>
         <w:t xml:space="preserve"> Lúc này A</w:t>
       </w:r>
       <w:r>
         <w:t xml:space="preserve"> </w:t>
       </w:r>
       <w:r>
-        <w:t>cũng nhắn đến B một tin nhắn “chuyển khoản lượng tiền tương đương 1 tỷ USD vào ngân hàng B”, khi nhận được tin nhắn thì A chuyển chuyển lượng tiền tương được 1 tỷ USD vào tài khoản Nostro B-A (theo nội tệ B).</w:t>
+        <w:t xml:space="preserve">cũng nhắn đến B một tin nhắn “chuyển khoản lượng tiền tương đương 1 tỷ USD vào ngân hàng B”, khi nhận được tin nhắn thì A chuyển chuyển lượng tiền tương </w:t>
+      </w:r>
+      <w:r>
+        <w:t>đương</w:t>
+      </w:r>
+      <w:r>
+        <w:t xml:space="preserve"> 1 tỷ USD vào tài khoản Nostro B-A (theo nội tệ B).</w:t>
       </w:r>
       <w:r>
         <w:t xml:space="preserve"> Lưu ý trong trường hợp này tài khoản </w:t>
@@ -15065,7 +15078,13 @@
         <w:t>n</w:t>
       </w:r>
       <w:r>
-        <w:t xml:space="preserve">) (ghi CÓ), nếu muốn trả lãi huy động phải đối ứng với một tài sản như tài khoản đầu tư công (ghi NỢ) bằng đúng với lượng ngoại tệ B, một lần nữa nếu muốn phát hành một lượng </w:t>
+        <w:t xml:space="preserve">) (ghi CÓ), nếu muốn trả lãi huy động phải đối ứng với một tài sản như tài khoản </w:t>
+      </w:r>
+      <w:r>
+        <w:t xml:space="preserve">tài sản </w:t>
+      </w:r>
+      <w:r>
+        <w:t xml:space="preserve">đầu tư công (ghi NỢ) bằng đúng với lượng ngoại tệ B, một lần nữa nếu muốn phát hành một lượng </w:t>
       </w:r>
       <w:r>
         <w:t>nội tệ</w:t>
@@ -15101,7 +15120,19 @@
         <w:t xml:space="preserve">) </w:t>
       </w:r>
       <w:r>
-        <w:t xml:space="preserve">lượng ngoại tệ B theo tỉ giá hối đoái. Do tài khoản đầu tư công đã cân bằng với tài khoản Nostro B-A nên lượng tiền bút toán sẽ dôi dư và nếu doanh thu đầu tư công không mang lại lợi nhuận lớn hơn tổng lượng tiền bút toán và lãi tiền gởi sẽ gây lạm phát với lượng tiền lạm phát là phần lỗ đầu tư công (lượng nội tệ gây lạm phát = lượng tiền bút toán </w:t>
+        <w:t xml:space="preserve">lượng ngoại tệ B theo tỉ giá hối đoái. Do tài khoản </w:t>
+      </w:r>
+      <w:r>
+        <w:t>tài sản</w:t>
+      </w:r>
+      <w:r>
+        <w:t xml:space="preserve"> công đã cân </w:t>
+      </w:r>
+      <w:r>
+        <w:t>đối</w:t>
+      </w:r>
+      <w:r>
+        <w:t xml:space="preserve"> với tài khoản Nostro B-A nên lượng tiền bút toán sẽ dôi dư và nếu doanh thu đầu tư công không mang lại lợi nhuận lớn hơn tổng lượng tiền bút toán và lãi tiền gởi sẽ gây lạm phát với lượng tiền lạm phát là phần lỗ đầu tư công (lượng nội tệ gây lạm phát = lượng tiền bút toán </w:t>
       </w:r>
       <w:r>
         <w:t>+</w:t>
@@ -15197,7 +15228,16 @@
         <w:t xml:space="preserve">vì thuế doanh nghiệp phải nhỏ hơn doanh thu doanh nghiệp và doanh nghiệp nhận lượng tiền bút toán như doanh thu, </w:t>
       </w:r>
       <w:r>
-        <w:t>nên chắc chắn lạm phát sẽ xảy ra.</w:t>
+        <w:t>nên chắc chắn lạm phát sẽ xảy ra</w:t>
+      </w:r>
+      <w:r>
+        <w:t>, trừ phi tài sản công như cơ sở hạ tầng hỗ trợ rất nhiều doanh nghiệp và người dân trên diện rộng kinh doanh thu lợi nhuận rồi nộp lượng thuế lớn trở lại</w:t>
+      </w:r>
+      <w:r>
+        <w:t xml:space="preserve"> hoặc tài sản công được khai thác rất hiệu quả như thu phí đường bộ đường cao tốc</w:t>
+      </w:r>
+      <w:r>
+        <w:t>.</w:t>
       </w:r>
       <w:r>
         <w:t xml:space="preserve"> Nếu doanh nghiệp vay vốn thì doanh thu bị khấu trừ tiền vay nên thuế thu được ít đi nên lượng nội tệ gây lạm phát tăng.</w:t>
@@ -15385,7 +15425,11 @@
         <w:t>International Monetary Fund</w:t>
       </w:r>
       <w:r>
-        <w:t xml:space="preserve"> – Quỹ Tiền Tệ Quốc Tế)</w:t>
+        <w:t xml:space="preserve"> </w:t>
+      </w:r>
+      <w:r>
+        <w:lastRenderedPageBreak/>
+        <w:t>– Quỹ Tiền Tệ Quốc Tế)</w:t>
       </w:r>
       <w:r>
         <w:t>, và 3) vay từ nguồn nội bộ như vay ngân quỹ nhà nước &amp; các quỹ tài chính.</w:t>
@@ -15394,30 +15438,67 @@
         <w:t xml:space="preserve"> Nợ công luôn cần để phát triển kinh tế và phục vụ phúc lợi xã hội nhưng nợ công luôn song hành với lạm phát, ví dụ, trái phiếu </w:t>
       </w:r>
       <w:r>
-        <w:t xml:space="preserve">(mua) </w:t>
-      </w:r>
-      <w:r>
-        <w:t xml:space="preserve">là nợ được </w:t>
-      </w:r>
-      <w:r>
-        <w:lastRenderedPageBreak/>
-        <w:t xml:space="preserve">kế toán như tăng tài sản, do đó </w:t>
+        <w:t>phát hành</w:t>
+      </w:r>
+      <w:r>
+        <w:t xml:space="preserve"> </w:t>
+      </w:r>
+      <w:r>
+        <w:t xml:space="preserve">được kế toán như tăng </w:t>
+      </w:r>
+      <w:r>
+        <w:t>nợ phải trả</w:t>
+      </w:r>
+      <w:r>
+        <w:t xml:space="preserve"> với lượng tiền đã thu</w:t>
+      </w:r>
+      <w:r>
+        <w:t xml:space="preserve">, do đó </w:t>
       </w:r>
       <w:r>
         <w:t xml:space="preserve">(giả sử) </w:t>
       </w:r>
       <w:r>
-        <w:t xml:space="preserve">một khi tung một lượng </w:t>
-      </w:r>
-      <w:r>
-        <w:t xml:space="preserve">tiền bút toán </w:t>
-      </w:r>
-      <w:r>
-        <w:t xml:space="preserve">(mới) </w:t>
-      </w:r>
-      <w:r>
-        <w:t>để cân đối thì lượng tiền này cần được đầu tư hiệu quả để trả nợ trái phiếu cùng lãi, nếu không lạm phát sẽ chồng lạm phát vì lượng tiền bút toán vốn đã gây lạm phát.</w:t>
-      </w:r>
+        <w:t xml:space="preserve">một khi </w:t>
+      </w:r>
+      <w:r>
+        <w:t>giải ngân</w:t>
+      </w:r>
+      <w:r>
+        <w:t xml:space="preserve"> lượng </w:t>
+      </w:r>
+      <w:r>
+        <w:t xml:space="preserve">tiền </w:t>
+      </w:r>
+      <w:r>
+        <w:t xml:space="preserve">nợ phải trả này </w:t>
+      </w:r>
+      <w:r>
+        <w:t xml:space="preserve">thì lượng tiền này cần được đầu tư hiệu quả </w:t>
+      </w:r>
+      <w:r>
+        <w:t xml:space="preserve">với thuế thu </w:t>
+      </w:r>
+      <w:r>
+        <w:t xml:space="preserve">để trả nợ trái phiếu cùng lãi, nếu không sẽ </w:t>
+      </w:r>
+      <w:r>
+        <w:t>gây</w:t>
+      </w:r>
+      <w:r>
+        <w:t xml:space="preserve"> lạm phát </w:t>
+      </w:r>
+      <w:r>
+        <w:t xml:space="preserve">do lãi </w:t>
+      </w:r>
+      <w:proofErr w:type="gramStart"/>
+      <w:r>
+        <w:t xml:space="preserve">nợ </w:t>
+      </w:r>
+      <w:r>
+        <w:t>.</w:t>
+      </w:r>
+      <w:proofErr w:type="gramEnd"/>
     </w:p>
     <w:p>
       <w:pPr>
@@ -15535,7 +15616,19 @@
         <w:t xml:space="preserve"> </w:t>
       </w:r>
       <w:r>
-        <w:t>giả sử nguồn vốn cũ và lượng tiền cũ đã cân đối / đồng nhất, giải ngân tức bơm lượng tiền, ở đây, là giải ngân vốn mới</w:t>
+        <w:t xml:space="preserve">giả sử nguồn vốn cũ và lượng tiền cũ đã cân đối / đồng nhất, </w:t>
+      </w:r>
+      <w:r>
+        <w:t xml:space="preserve">nếu </w:t>
+      </w:r>
+      <w:r>
+        <w:t>giải ngân tức bơm lượng tiền</w:t>
+      </w:r>
+      <w:r>
+        <w:t xml:space="preserve"> bút toán </w:t>
+      </w:r>
+      <w:r>
+        <w:t>là giải ngân vốn mới</w:t>
       </w:r>
       <w:r>
         <w:t xml:space="preserve"> như giải ngân vốn ODA ngoại tệ</w:t>
@@ -15550,6 +15643,24 @@
         <w:t xml:space="preserve"> vì trong nhiều trường hợp như giải ngân vốn đầu tư công từ trái phiếu phát hành không cần phát hành tiền do trái phiếu phát hành như nợ phải trả (liability) đã là nguồn tiền được hút về từ người mua trái phiếu</w:t>
       </w:r>
       <w:r>
+        <w:t xml:space="preserve">, do đó </w:t>
+      </w:r>
+      <w:r>
+        <w:rPr>
+          <w:i/>
+        </w:rPr>
+        <w:t>lượng tiền bơm</w:t>
+      </w:r>
+      <w:r>
+        <w:t xml:space="preserve"> vào nhà thầu được gọi chung là </w:t>
+      </w:r>
+      <w:r>
+        <w:rPr>
+          <w:i/>
+        </w:rPr>
+        <w:t>lượng tiền giải ngân</w:t>
+      </w:r>
+      <w:r>
         <w:t xml:space="preserve">. </w:t>
       </w:r>
       <w:r>
@@ -15586,7 +15697,13 @@
         <w:t xml:space="preserve"> </w:t>
       </w:r>
       <w:r>
-        <w:t>chuyển lượng tiền bút toán từ ngân hàng trung ương (tài khoản kho bạc nhà nước) đến nhà thầu (</w:t>
+        <w:t xml:space="preserve">chuyển lượng tiền </w:t>
+      </w:r>
+      <w:r>
+        <w:t>giải ngân</w:t>
+      </w:r>
+      <w:r>
+        <w:t xml:space="preserve"> từ ngân hàng trung ương (tài khoản kho bạc nhà nước) đến nhà thầu (</w:t>
       </w:r>
       <w:r>
         <w:t>tài khoản nhà thầu</w:t>
@@ -15876,7 +15993,11 @@
         <w:t>(d</w:t>
       </w:r>
       <w:r>
-        <w:t>isbursement of public investment capital</w:t>
+        <w:t xml:space="preserve">isbursement </w:t>
+      </w:r>
+      <w:r>
+        <w:lastRenderedPageBreak/>
+        <w:t>of public investment capital</w:t>
       </w:r>
       <w:r>
         <w:t xml:space="preserve">) </w:t>
@@ -15918,11 +16039,7 @@
         <w:t xml:space="preserve"> (bidder)</w:t>
       </w:r>
       <w:r>
-        <w:t xml:space="preserve">, bao gồm: cấp hạn mức chi tiêu cho chủ đầu tư công, tạm ứng vốn cho nhà thầu, thanh toán khối lượng công việc cho nhà thầu, chi lượng tiền nghiệm thu </w:t>
-      </w:r>
-      <w:r>
-        <w:lastRenderedPageBreak/>
-        <w:t xml:space="preserve">công trình có khấu trừ vốn tạm ứng. </w:t>
+        <w:t xml:space="preserve">, bao gồm: cấp hạn mức chi tiêu cho chủ đầu tư công, tạm ứng vốn cho nhà thầu, thanh toán khối lượng công việc cho nhà thầu, chi lượng tiền nghiệm thu công trình có khấu trừ vốn tạm ứng. </w:t>
       </w:r>
       <w:r>
         <w:t xml:space="preserve">Với lượng tiền giải ngân đúng bằng </w:t>
@@ -15955,10 +16072,11 @@
         <w:t xml:space="preserve">tức </w:t>
       </w:r>
       <w:r>
-        <w:t>tung lượng tiền bút toán</w:t>
-      </w:r>
-      <w:bookmarkStart w:id="4" w:name="_GoBack"/>
-      <w:bookmarkEnd w:id="4"/>
+        <w:t>bơm</w:t>
+      </w:r>
+      <w:r>
+        <w:t xml:space="preserve"> tiền</w:t>
+      </w:r>
       <w:r>
         <w:t xml:space="preserve">, đồng thời chủ đầu tư kế toán nội bộ bằng cách ghi NỢ chi phí xây dựng dở dang </w:t>
       </w:r>
@@ -16002,10 +16120,7 @@
         <w:t xml:space="preserve">, 2) khi nghiệm thu công trình thì </w:t>
       </w:r>
       <w:r>
-        <w:t>kho bạc thực hiện quyết toán nội bộ đóng hoặc giảm hạn mức chi tiêu của chủ đầu tư</w:t>
-      </w:r>
-      <w:r>
-        <w:t xml:space="preserve">, </w:t>
+        <w:t xml:space="preserve">kho bạc thực hiện quyết toán nội bộ đóng hoặc giảm hạn mức chi tiêu của chủ đầu tư, </w:t>
       </w:r>
       <w:r>
         <w:t xml:space="preserve">đồng thời </w:t>
@@ -16068,61 +16183,31 @@
         <w:t xml:space="preserve"> ngân hàng trung ương </w:t>
       </w:r>
       <w:r>
-        <w:t>ghi NỢ</w:t>
-      </w:r>
-      <w:r>
-        <w:t xml:space="preserve"> tài khoản kho bạc</w:t>
+        <w:t>ghi NỢ tài khoản kho bạc</w:t>
       </w:r>
       <w:r>
         <w:t xml:space="preserve"> và ghi CÓ tài khoản ngân hàng thương mại</w:t>
       </w:r>
       <w:r>
-        <w:t>,</w:t>
-      </w:r>
-      <w:r>
-        <w:t xml:space="preserve"> </w:t>
-      </w:r>
-      <w:r>
-        <w:t xml:space="preserve">đồng thời kho bạc </w:t>
-      </w:r>
-      <w:r>
-        <w:t>kế</w:t>
-      </w:r>
-      <w:r>
-        <w:t xml:space="preserve"> toán </w:t>
+        <w:t xml:space="preserve">, đồng thời kho bạc kế toán </w:t>
       </w:r>
       <w:r>
         <w:t xml:space="preserve">nội bộ </w:t>
       </w:r>
       <w:r>
-        <w:t xml:space="preserve">bằng cách </w:t>
-      </w:r>
-      <w:r>
-        <w:t>ghi NỢ</w:t>
-      </w:r>
-      <w:r>
-        <w:t xml:space="preserve"> dự toán chi thường xuyên </w:t>
+        <w:t xml:space="preserve">bằng cách ghi NỢ dự toán chi thường xuyên </w:t>
       </w:r>
       <w:r>
         <w:t xml:space="preserve">nội bộ </w:t>
       </w:r>
       <w:r>
-        <w:t xml:space="preserve">và </w:t>
-      </w:r>
-      <w:r>
-        <w:t>ghi CÓ</w:t>
-      </w:r>
-      <w:r>
-        <w:t xml:space="preserve"> tài khoản kho bạc</w:t>
+        <w:t>và ghi CÓ tài khoản kho bạc</w:t>
       </w:r>
       <w:r>
         <w:t xml:space="preserve"> nội bộ</w:t>
       </w:r>
       <w:r>
-        <w:t xml:space="preserve">, đồng thời chủ đầu tư kế toán nội bộ bằng cách </w:t>
-      </w:r>
-      <w:r>
-        <w:t>ghi NỢ chi phí hao mòn hoặc sửa chữa và ghi CÓ hao mòn lũy kế hoặc phải trả dịch vụ sửa chữa</w:t>
+        <w:t>, đồng thời chủ đầu tư kế toán nội bộ bằng cách ghi NỢ chi phí hao mòn hoặc sửa chữa và ghi CÓ hao mòn lũy kế hoặc phải trả dịch vụ sửa chữa</w:t>
       </w:r>
       <w:r>
         <w:t xml:space="preserve">, đồng thời ngân hàng thương mại chuyển </w:t>
@@ -16137,10 +16222,64 @@
         <w:t>tức tăng số dư</w:t>
       </w:r>
       <w:r>
-        <w:t xml:space="preserve"> </w:t>
-      </w:r>
-      <w:r>
-        <w:t>tài khoản nhà thầu</w:t>
+        <w:t xml:space="preserve"> tài khoản nhà thầu.</w:t>
+      </w:r>
+      <w:r>
+        <w:t xml:space="preserve"> Ghi chú, chủ đầu tư công chuyển tài sản (cố định) về sổ cái ngân hàng trung ương bằng </w:t>
+      </w:r>
+      <w:r>
+        <w:t xml:space="preserve">kết hợp </w:t>
+      </w:r>
+      <w:r>
+        <w:t>nghiệp vụ kế toán giữa tài khoản tài sản và tài khoản kho bạc tại ngân hàng trung ương.</w:t>
+      </w:r>
+      <w:r>
+        <w:t xml:space="preserve"> Giả sử lượng tiền giải ngân đã có sẵn không cần bút toán phát hành và giải sử công trình công đảm bảo chất lượng có giá đúng bằng lượng </w:t>
+      </w:r>
+      <w:r>
+        <w:t xml:space="preserve">giải ngân thì lạm phát </w:t>
+      </w:r>
+      <w:r>
+        <w:t xml:space="preserve">vẫn </w:t>
+      </w:r>
+      <w:r>
+        <w:t xml:space="preserve">có khả năng xảy ra do nguồn vốn tức lượng tiền giải ngân là nợ phải trả </w:t>
+      </w:r>
+      <w:r>
+        <w:t xml:space="preserve">có lãi nợ </w:t>
+      </w:r>
+      <w:r>
+        <w:t>như trái phiếu phát hàn</w:t>
+      </w:r>
+      <w:r>
+        <w:t>h</w:t>
+      </w:r>
+      <w:r>
+        <w:t>.</w:t>
+      </w:r>
+      <w:r>
+        <w:t xml:space="preserve"> Nếu lượng tiền giải ngân do bút toán phát hành thì lạm phát chắc chắn xảy ra do thuế nhà thầu luôn thấp hơn doanh thu nhà thầu và doanh thu nhà thầu tương ứng với lượng tiền giải ngân</w:t>
+      </w:r>
+      <w:r>
+        <w:t>, trừ phi công trình công mang lại lợi ích lớn cung ứng nguồn thu thuế rất lớn trên diện rộng vượt ngoài nhà thầu.</w:t>
+      </w:r>
+      <w:r>
+        <w:t xml:space="preserve"> Ghi chú, lượng tiền </w:t>
+      </w:r>
+      <w:r>
+        <w:t>giải ngân</w:t>
+      </w:r>
+      <w:r>
+        <w:t xml:space="preserve"> qua ngân hàng thương mại thường là tín dụng</w:t>
+      </w:r>
+      <w:r>
+        <w:t xml:space="preserve"> vì nhà thầu luôn có xu hướng vay tín dụng</w:t>
+      </w:r>
+      <w:r>
+        <w:t xml:space="preserve"> để giảm áp lực </w:t>
+      </w:r>
+      <w:r>
+        <w:t>nguyên vật liệu</w:t>
       </w:r>
       <w:r>
         <w:t>.</w:t>
@@ -16151,9 +16290,6 @@
         <w:ind w:firstLine="360"/>
       </w:pPr>
       <w:r>
-        <w:t xml:space="preserve"> </w:t>
-      </w:r>
-      <w:r>
         <w:t xml:space="preserve">Đầu tư công và chi tiêu công đều là các khoản chi </w:t>
       </w:r>
       <w:r>
@@ -16175,7 +16311,13 @@
         <w:t>bơm</w:t>
       </w:r>
       <w:r>
-        <w:t xml:space="preserve"> lượng tiền bút toán vào thị trường qua hai ngả phổ biến: 1) ngân hàng thương mại cho vay tín dụng và 2) giải ngân vốn đầu tư công từ kho bạc </w:t>
+        <w:t xml:space="preserve"> lượng tiền </w:t>
+      </w:r>
+      <w:r>
+        <w:t xml:space="preserve">(bút toán, giải ngân) </w:t>
+      </w:r>
+      <w:r>
+        <w:t xml:space="preserve">vào thị trường qua hai ngả phổ biến: 1) ngân hàng thương mại cho vay tín dụng và 2) giải ngân vốn đầu tư công từ kho bạc </w:t>
       </w:r>
       <w:r>
         <w:t>&amp;</w:t>
@@ -16193,339 +16335,575 @@
         <w:rPr>
           <w:i/>
         </w:rPr>
-        <w:t>Lượng tiền bút toán phải cân đối</w:t>
-      </w:r>
-      <w:r>
-        <w:rPr>
-          <w:i/>
-        </w:rPr>
+        <w:t xml:space="preserve">Lượng tiền </w:t>
+      </w:r>
+      <w:r>
+        <w:rPr>
+          <w:i/>
+        </w:rPr>
+        <w:t>bơm</w:t>
+      </w:r>
+      <w:r>
+        <w:t xml:space="preserve"> </w:t>
+      </w:r>
+      <w:r>
+        <w:t xml:space="preserve">(tín dụng bơm) </w:t>
+      </w:r>
+      <w:r>
+        <w:t>phải cân đối</w:t>
+      </w:r>
+      <w:r>
         <w:t xml:space="preserve"> với</w:t>
       </w:r>
       <w:r>
-        <w:rPr>
-          <w:i/>
-        </w:rPr>
-        <w:t xml:space="preserve"> </w:t>
-      </w:r>
-      <w:r>
-        <w:rPr>
-          <w:i/>
-        </w:rPr>
+        <w:t xml:space="preserve"> </w:t>
+      </w:r>
+      <w:r>
+        <w:t xml:space="preserve">hoặc là </w:t>
+      </w:r>
+      <w:r>
+        <w:t xml:space="preserve">một phần </w:t>
+      </w:r>
+      <w:r>
+        <w:t xml:space="preserve">trong </w:t>
+      </w:r>
+      <w:r>
+        <w:t>các nguồn vốn</w:t>
+      </w:r>
+      <w:r>
+        <w:t xml:space="preserve"> </w:t>
+      </w:r>
+      <w:r>
+        <w:t xml:space="preserve">(liability, entity) </w:t>
+      </w:r>
+      <w:r>
+        <w:t xml:space="preserve">và các nguồn vốn phải cân đối với tài sản đối ứng. Do đó huy động nguồn vốn </w:t>
+      </w:r>
+      <w:r>
+        <w:t xml:space="preserve">với </w:t>
+      </w:r>
+      <w:r>
+        <w:t xml:space="preserve">hình thức nợ phải </w:t>
+      </w:r>
+      <w:r>
         <w:t>(</w:t>
       </w:r>
       <w:r>
-        <w:rPr>
-          <w:i/>
-        </w:rPr>
-        <w:t>hoặc là</w:t>
-      </w:r>
-      <w:r>
-        <w:rPr>
-          <w:i/>
-        </w:rPr>
+        <w:t>liability</w:t>
+      </w:r>
+      <w:r>
+        <w:t xml:space="preserve">) </w:t>
+      </w:r>
+      <w:r>
+        <w:t>qua phát hành trái phiếu, tín phiế</w:t>
+      </w:r>
+      <w:r>
+        <w:t>u, công trái</w:t>
+      </w:r>
+      <w:r>
+        <w:t xml:space="preserve"> </w:t>
+      </w:r>
+      <w:r>
+        <w:t xml:space="preserve">kém hiệu quả hơn </w:t>
+      </w:r>
+      <w:r>
+        <w:t xml:space="preserve">vay </w:t>
+      </w:r>
+      <w:r>
+        <w:t xml:space="preserve">vốn ODA vì lãi suất trái phiếu là lãi suất huy động cao hơn lãi suất </w:t>
+      </w:r>
+      <w:r>
+        <w:t xml:space="preserve">vay </w:t>
+      </w:r>
+      <w:r>
+        <w:t>vốn ODA</w:t>
+      </w:r>
+      <w:r>
+        <w:t xml:space="preserve"> </w:t>
+      </w:r>
+      <w:r>
+        <w:t>và</w:t>
+      </w:r>
+      <w:r>
+        <w:t xml:space="preserve"> sẽ hiệu quả hơn </w:t>
+      </w:r>
+      <w:r>
+        <w:t xml:space="preserve">nữa </w:t>
+      </w:r>
+      <w:r>
+        <w:t>nếu thúc đẩy thị trường chứng khoán huy động nguồn vốn nhàn rỗi trong dân chúng</w:t>
+      </w:r>
+      <w:r>
+        <w:t xml:space="preserve"> mà chính phủ không cần trả lãi vì lợi nhuận trên thị trường chứng khoán phụ thuộc vào hoạt động hiệu quả của doanh nghiệp trên tổng thể mọi doanh nghiệp, trong khi đó, nếu </w:t>
+      </w:r>
+      <w:r>
+        <w:t xml:space="preserve">một </w:t>
+      </w:r>
+      <w:r>
+        <w:t xml:space="preserve">doanh nghiệp thua lỗ thì </w:t>
+      </w:r>
+      <w:r>
+        <w:t xml:space="preserve">chỉ doanh nghiệp đó </w:t>
+      </w:r>
+      <w:r>
+        <w:t>tự chịu trách nhiệm và không gây ảnh hưởng trên tổng thể nếu thị trường chứng khoán cùng hoạt động doanh nghiệp lành mạnh và minh bạch.</w:t>
+      </w:r>
+      <w:r>
+        <w:t xml:space="preserve"> Vì huy động vốn nhàn rỗi nên thị trường chứng khoán có thể giúp giảm lạm phát</w:t>
+      </w:r>
+      <w:r>
+        <w:t xml:space="preserve"> trong khi hỗ trợ tăng trưởng kinh tế</w:t>
+      </w:r>
+      <w:r>
+        <w:t xml:space="preserve"> nhưng cũng có những rủi ro trong thị trường chứng khoán, đặc biệt với trường hợp thiếu minh bạch</w:t>
+      </w:r>
+      <w:r>
+        <w:t>.</w:t>
+      </w:r>
+      <w:r>
+        <w:t xml:space="preserve"> </w:t>
+      </w:r>
+      <w:r>
+        <w:t xml:space="preserve">Ghi chú, trái phiếu mua được kế toán tăng NỢ tài sản (asset) và trái phiếu phát hành được kế toán tăng CÓ </w:t>
+      </w:r>
+      <w:r>
+        <w:t>nợ phải trả</w:t>
+      </w:r>
+      <w:r>
+        <w:t xml:space="preserve"> (</w:t>
+      </w:r>
+      <w:r>
+        <w:t>liability</w:t>
+      </w:r>
+      <w:r>
         <w:t>)</w:t>
       </w:r>
       <w:r>
-        <w:rPr>
-          <w:i/>
-        </w:rPr>
-        <w:t xml:space="preserve"> </w:t>
-      </w:r>
-      <w:r>
-        <w:rPr>
-          <w:i/>
-        </w:rPr>
-        <w:t xml:space="preserve">một phần </w:t>
-      </w:r>
-      <w:r>
-        <w:rPr>
-          <w:i/>
-        </w:rPr>
-        <w:t xml:space="preserve">trong </w:t>
-      </w:r>
-      <w:r>
-        <w:rPr>
-          <w:i/>
-        </w:rPr>
-        <w:t>các nguồn vốn</w:t>
-      </w:r>
-      <w:r>
-        <w:t xml:space="preserve"> </w:t>
-      </w:r>
-      <w:r>
-        <w:t xml:space="preserve">(liability, entity) </w:t>
-      </w:r>
-      <w:r>
-        <w:t xml:space="preserve">và các nguồn vốn phải cân đối với tài sản đối ứng. Do đó huy động nguồn vốn </w:t>
-      </w:r>
-      <w:r>
-        <w:t xml:space="preserve">với </w:t>
-      </w:r>
-      <w:r>
-        <w:t xml:space="preserve">hình thức nợ phải </w:t>
+        <w:t xml:space="preserve"> nên lượng tiền phát hành (tài khoản ngân hàng thương mại) cân đối với trái phiếu mua &amp; những tài sản khác</w:t>
+      </w:r>
+      <w:r>
+        <w:t>,</w:t>
+      </w:r>
+      <w:r>
+        <w:t xml:space="preserve"> </w:t>
+      </w:r>
+      <w:r>
+        <w:t xml:space="preserve">cũng như, </w:t>
+      </w:r>
+      <w:r>
+        <w:t xml:space="preserve">vốn đầu tư công </w:t>
+      </w:r>
+      <w:r>
+        <w:t xml:space="preserve">(tương </w:t>
+      </w:r>
+      <w:r>
+        <w:lastRenderedPageBreak/>
+        <w:t xml:space="preserve">ứng lượng tiền giải ngân) </w:t>
+      </w:r>
+      <w:r>
+        <w:t>có thể là trái phiếu phát hành</w:t>
+      </w:r>
+      <w:r>
+        <w:t xml:space="preserve">. </w:t>
+      </w:r>
+      <w:r>
+        <w:t>V</w:t>
+      </w:r>
+      <w:r>
+        <w:t>ốn ODA tuy có lãi suất thấp nhưng còn bị ảnh hưởng bởi tỉ giá hối đoái</w:t>
+      </w:r>
+      <w:r>
+        <w:t>, nếu sức mua của nội tệ yếu thì vay vốn ODA sẽ gánh thêm chênh lệch tỉ giá hối đoái giữa nội tệ và ngoại tệ</w:t>
+      </w:r>
+      <w:r>
+        <w:t xml:space="preserve"> khi tung lượng tiền phát hành</w:t>
+      </w:r>
+      <w:r>
+        <w:t xml:space="preserve">. </w:t>
+      </w:r>
+      <w:r>
+        <w:t xml:space="preserve">Mạng lưới thương mại và hộ kinh doanh nhỏ lẻ không cần lượng tiền bút toán mới vì đã tận dụng lượng tiền đang lưu thông (tiền giấy/xu và số dư tài khoản ngân hàng thương mại), nên đồng thời đóng góp nguồn thu thuế và giảm lạm phát. Tận dụng lượng </w:t>
+      </w:r>
+      <w:r>
+        <w:rPr>
+          <w:i/>
+        </w:rPr>
+        <w:t>tiền lưu thông</w:t>
+      </w:r>
+      <w:r>
+        <w:t xml:space="preserve"> vốn đã giảm nguy cơ lạm phát, tăng lượng của cải khi sản xuất hiệu quả cũng giảm lạm phát vì thu hẹp khoảng cách giữa lượng của cải và lượng tiền lưu thông, cần đồng hành với tăng </w:t>
+      </w:r>
+      <w:r>
+        <w:rPr>
+          <w:i/>
+        </w:rPr>
+        <w:t xml:space="preserve">tiêu dùng </w:t>
+      </w:r>
+      <w:r>
+        <w:rPr>
+          <w:i/>
+        </w:rPr>
+        <w:t>nội địa</w:t>
+      </w:r>
+      <w:r>
+        <w:t xml:space="preserve"> </w:t>
+      </w:r>
+      <w:r>
+        <w:t xml:space="preserve">nghĩa là </w:t>
+      </w:r>
+      <w:r>
+        <w:t xml:space="preserve">kích thích tái sản xuất </w:t>
+      </w:r>
+      <w:r>
+        <w:t xml:space="preserve">và/hoặc </w:t>
+      </w:r>
+      <w:r>
+        <w:t xml:space="preserve">đẩy ngược lượng tiền lưu thông trở lại ngân hàng </w:t>
+      </w:r>
+      <w:r>
+        <w:t xml:space="preserve">(thương mại, </w:t>
+      </w:r>
+      <w:r>
+        <w:t>trung ương</w:t>
+      </w:r>
+      <w:r>
+        <w:t>)</w:t>
+      </w:r>
+      <w:r>
+        <w:t xml:space="preserve"> một lần nữa kích thích đầu tư công / phúc lợi</w:t>
+      </w:r>
+      <w:r>
+        <w:t>.</w:t>
+      </w:r>
+      <w:r>
+        <w:t xml:space="preserve"> </w:t>
+      </w:r>
+      <w:r>
+        <w:t>Tiêu dùng nội địa</w:t>
+      </w:r>
+      <w:r>
+        <w:t xml:space="preserve"> </w:t>
+      </w:r>
+      <w:r>
+        <w:t xml:space="preserve">(domestic consumption) </w:t>
+      </w:r>
+      <w:r>
+        <w:t xml:space="preserve">cũng tăng vòng quay tiền (hỗ trợ kéo dài vừa đủ chu kỳ sản xuất) và </w:t>
+      </w:r>
+      <w:r>
+        <w:t xml:space="preserve">cũng là một hình thức huy động vốn nhàn rỗi như </w:t>
+      </w:r>
+      <w:r>
+        <w:rPr>
+          <w:i/>
+        </w:rPr>
+        <w:t>thị trường chứng khoán</w:t>
+      </w:r>
+      <w:r>
+        <w:t xml:space="preserve"> (stock market)</w:t>
+      </w:r>
+      <w:r>
+        <w:t>.</w:t>
+      </w:r>
+      <w:r>
+        <w:t xml:space="preserve"> </w:t>
+      </w:r>
+      <w:r>
+        <w:t>Thế nên doanh nghiệp tư nhân nhỏ lẻ trên bức tranh tổng thể toàn dân số không hề nhỏ lẻ.</w:t>
+      </w:r>
+      <w:r>
+        <w:t xml:space="preserve"> Vấn đề cốt lõi </w:t>
+      </w:r>
+      <w:r>
+        <w:t>giàu có</w:t>
+      </w:r>
+      <w:r>
+        <w:t xml:space="preserve"> quốc gia là tăng lượng của cải, tức tăng tài sản ròng – tăng vốn chủ sở hữu theo nghiệp vụ kế toán</w:t>
+      </w:r>
+      <w:r>
+        <w:t xml:space="preserve"> (accounting)</w:t>
+      </w:r>
+      <w:r>
+        <w:t>, nhưng trạng thái lý tưởng này luôn bị nhiễu bởi tăng nguồn vốn chứa nợ phải trả tức lạm phát</w:t>
+      </w:r>
+      <w:r>
+        <w:t xml:space="preserve">, một lần nữa nhưng, nếu không có nhiễu lạm phát </w:t>
+      </w:r>
+      <w:r>
+        <w:t>xúc tác</w:t>
+      </w:r>
+      <w:r>
+        <w:t xml:space="preserve"> thì ngay cả tiệm cận trạng thái lý tưởng cũng không </w:t>
+      </w:r>
+      <w:r>
+        <w:t xml:space="preserve">thể </w:t>
+      </w:r>
+      <w:r>
+        <w:t>tiệm cận. Quan điểm tự do kinh tế chấp nhận lạm phát vì càng quá mức ngăn cản lạm phát thì lạm phát càng có xu hướng nghi</w:t>
+      </w:r>
+      <w:r>
+        <w:t>ê</w:t>
+      </w:r>
+      <w:r>
+        <w:t>m trọng</w:t>
+      </w:r>
+      <w:r>
+        <w:t xml:space="preserve"> theo tỉ trọng nền kinh tế</w:t>
+      </w:r>
+      <w:r>
+        <w:t xml:space="preserve"> v</w:t>
+      </w:r>
+      <w:r>
+        <w:t>ì</w:t>
+      </w:r>
+      <w:r>
+        <w:t xml:space="preserve"> thiếu đi chất xúc tác </w:t>
+      </w:r>
+      <w:r>
+        <w:t>cho</w:t>
+      </w:r>
+      <w:r>
+        <w:t xml:space="preserve"> phản ứng dây chuyền trong mạng lưới kinh tế phức hợp</w:t>
+      </w:r>
+      <w:r>
+        <w:t>.</w:t>
+      </w:r>
+      <w:r>
+        <w:t xml:space="preserve"> Tiêu dùng nội địa tăng đến một lúc nào đó sẽ bị giới hạn – hấp thu năng lượng sản xuất </w:t>
+      </w:r>
+      <w:r>
+        <w:t xml:space="preserve">&amp; đầu tư </w:t>
+      </w:r>
+      <w:r>
+        <w:t>đến giới hạn, thì bánh xe kinh tế sẽ đình trệ nếu không có nguồn vốn tung vào kịp lúc và</w:t>
+      </w:r>
+      <w:r>
+        <w:t xml:space="preserve"> khi nguồn vốn</w:t>
+      </w:r>
+      <w:r>
+        <w:t xml:space="preserve"> </w:t>
+      </w:r>
+      <w:r>
+        <w:t xml:space="preserve">đẩy vào, </w:t>
+      </w:r>
+      <w:r>
+        <w:t>lạm phát lại xảy ra.</w:t>
+      </w:r>
+      <w:r>
+        <w:t xml:space="preserve"> Huy động tiền gởi, thị trường chứng khoán và tiêu dùng nội địa là những kênh tận dụng vốn nhà rỗi bên cạnh những chức năng quan trọng của chúng (ví dụ, thị trường chứng khoán còn huy động nguồn vốn nước ngoài), trong đó, áp lực của huy động tiền gởi là ngân hàng phải đầu tư có lợi nhuận để trả lãi, áp lực giám sát đối với thị trường chứng khoán, áp lực của tiêu dùng nội địa là khuyến khích người dân mua hàng nội địa, </w:t>
+      </w:r>
+      <w:r>
+        <w:t>nếu</w:t>
+      </w:r>
+      <w:r>
+        <w:t xml:space="preserve"> ngược lại, mua nhiều hàng ngoại không những làm suy yếu sản xuất nội địa mà còn gây lạm phát nhập khẩu (cầu hàng ngoại tăng </w:t>
+      </w:r>
+      <w:r>
+        <w:rPr>
+          <w:rFonts w:cs="Times New Roman"/>
+        </w:rPr>
+        <w:t>→</w:t>
+      </w:r>
+      <w:r>
+        <w:t xml:space="preserve"> giá cả hàng ngoại tăng </w:t>
+      </w:r>
+      <w:r>
+        <w:rPr>
+          <w:rFonts w:cs="Times New Roman"/>
+        </w:rPr>
+        <w:t>→</w:t>
+      </w:r>
+      <w:r>
+        <w:t xml:space="preserve"> sức mua của nội tệ </w:t>
+      </w:r>
+      <w:r>
+        <w:t>giảm</w:t>
+      </w:r>
+      <w:r>
+        <w:t>).</w:t>
+      </w:r>
+      <w:r>
+        <w:t xml:space="preserve"> Tăng xuất khẩu để hấp thu năng lượng sản xuất giảm áp lực lạm phát tương tự như tiêu dùng nội địa, hơn nữa sẽ tăng đáng kể GDP, tăng thặng dư thương mại, tích lũy vốn theo một hình thức phát triển vượt mức so với tích lũy kim loại quý thời Smith, nhưng sẽ có rủi ro sau: áp lực tỉ giá hối đoái và hàng rào thuế quan khiến nhà sản xuất giảm giá hàng hóa, giảm lương nhân công và nếu vòng xoáy giảm giá này liên tục khiến cung càng nhiều hơn c</w:t>
+      </w:r>
+      <w:r>
+        <w:t>ầu, lượng hàng bị đình trệ hoặc dội ngược trở lại khiến các doanh nghiệp có nguy cơ phá sản hoặc chẳng thể dễ dàng giải quyết.</w:t>
+      </w:r>
+      <w:r>
+        <w:t xml:space="preserve"> Thế lưỡng nan xảy ra, tăng xuất khẩu giảm áp lực tiêu d</w:t>
+      </w:r>
+      <w:r>
+        <w:t>ù</w:t>
+      </w:r>
+      <w:r>
+        <w:t>ng nội địa nhưng có thể càng tăng áp lực tiêu dùng nội địa</w:t>
+      </w:r>
+      <w:r>
+        <w:t>, tăng tiêu dùng nội địa hạn chế nhược điểm của xuất khẩu nhưng có nguy cơ lạm phát nhập khẩu</w:t>
+      </w:r>
+      <w:r>
+        <w:t xml:space="preserve"> và nếu năng lực sản xuất giảm rủi ro lạm phát nhập khẩu thì có nguy cơ trở lại vấn đề </w:t>
+      </w:r>
+      <w:r>
+        <w:t xml:space="preserve">thặng dư </w:t>
+      </w:r>
+      <w:r>
+        <w:t>hàng hóa.</w:t>
+      </w:r>
+      <w:r>
+        <w:t xml:space="preserve"> Tất cả vấn đề hội tụ trở lại vấn đề cân bằng trình độ sản xuất và phân bổ ngành nghề.</w:t>
+      </w:r>
+      <w:r>
+        <w:t xml:space="preserve"> </w:t>
+      </w:r>
+      <w:r>
+        <w:t xml:space="preserve">Không thể giải quyết triệt để những thế lưỡng nan nhưng có thể giải quyết vấn đề tối ưu có ràng buộc. </w:t>
+      </w:r>
+      <w:r>
+        <w:t xml:space="preserve">Trong toán học, bài toán tối ưu với hàm </w:t>
+      </w:r>
+      <w:r>
+        <w:t>mục tiêu</w:t>
+      </w:r>
+      <w:r>
+        <w:t xml:space="preserve"> </w:t>
       </w:r>
       <w:r>
         <w:t>(</w:t>
       </w:r>
       <w:r>
-        <w:t>liability</w:t>
-      </w:r>
-      <w:r>
-        <w:t xml:space="preserve">) </w:t>
-      </w:r>
-      <w:r>
-        <w:t xml:space="preserve">qua phát hành trái phiếu, tín phiếu </w:t>
-      </w:r>
-      <w:r>
-        <w:t xml:space="preserve">(tài sản đối ứng với nợ phải trả) </w:t>
-      </w:r>
-      <w:r>
-        <w:t xml:space="preserve">kém hiệu quả hơn </w:t>
-      </w:r>
-      <w:r>
-        <w:t xml:space="preserve">vay </w:t>
-      </w:r>
-      <w:r>
-        <w:t xml:space="preserve">vốn ODA vì lãi suất trái phiếu là lãi suất huy động cao hơn lãi suất </w:t>
-      </w:r>
-      <w:r>
-        <w:t xml:space="preserve">vay </w:t>
-      </w:r>
-      <w:r>
-        <w:t>vốn ODA</w:t>
-      </w:r>
-      <w:r>
-        <w:t xml:space="preserve"> </w:t>
-      </w:r>
-      <w:r>
-        <w:t>và</w:t>
-      </w:r>
-      <w:r>
-        <w:t xml:space="preserve"> sẽ hiệu quả hơn </w:t>
-      </w:r>
-      <w:r>
-        <w:t xml:space="preserve">nữa </w:t>
-      </w:r>
-      <w:r>
-        <w:t>nếu thúc đẩy thị trường chứng khoán huy động nguồn vốn nhàn rỗi trong dân chúng</w:t>
-      </w:r>
-      <w:r>
-        <w:t xml:space="preserve"> mà chính phủ không cần trả lãi vì lợi nhuận trên thị trường chứng khoán phụ thuộc vào hoạt động hiệu quả của doanh nghiệp trên tổng thể mọi doanh nghiệp, trong khi đó, nếu </w:t>
-      </w:r>
-      <w:r>
-        <w:t xml:space="preserve">một </w:t>
-      </w:r>
-      <w:r>
-        <w:t xml:space="preserve">doanh nghiệp thua lỗ thì </w:t>
-      </w:r>
-      <w:r>
-        <w:t xml:space="preserve">chỉ doanh nghiệp đó </w:t>
-      </w:r>
-      <w:r>
-        <w:t>tự chịu trách nhiệm và không gây ảnh hưởng trên tổng thể nếu thị trường chứng khoán cùng hoạt động doanh nghiệp lành mạnh và minh bạch.</w:t>
-      </w:r>
-      <w:r>
-        <w:t xml:space="preserve"> Vì huy động vốn nhàn rỗi nên thị trường chứng khoán có thể giúp giảm lạm phát</w:t>
-      </w:r>
-      <w:r>
-        <w:t xml:space="preserve"> trong khi hỗ trợ tăng trưởng kinh tế</w:t>
-      </w:r>
-      <w:r>
-        <w:t xml:space="preserve"> nhưng cũng có những rủi ro trong thị trường chứng khoán, đặc biệt với trường hợp thiếu minh bạch</w:t>
+        <w:t xml:space="preserve">target </w:t>
+      </w:r>
+      <w:r>
+        <w:t xml:space="preserve">function) </w:t>
+      </w:r>
+      <w:r>
+        <w:t>cùng</w:t>
+      </w:r>
+      <w:r>
+        <w:t xml:space="preserve"> những điều kiện </w:t>
+      </w:r>
+      <w:r>
+        <w:t xml:space="preserve">(conditions) </w:t>
+      </w:r>
+      <w:r>
+        <w:t xml:space="preserve">thì hàm Lagrange </w:t>
+      </w:r>
+      <w:r>
+        <w:t xml:space="preserve">(Lagrange duality function) </w:t>
+      </w:r>
+      <w:r>
+        <w:t xml:space="preserve">phối hợp biến </w:t>
+      </w:r>
+      <w:r>
+        <w:t>mục tiêu</w:t>
+      </w:r>
+      <w:r>
+        <w:t xml:space="preserve"> </w:t>
+      </w:r>
+      <w:r>
+        <w:t>(</w:t>
+      </w:r>
+      <w:r>
+        <w:t xml:space="preserve">target </w:t>
+      </w:r>
+      <w:r>
+        <w:t xml:space="preserve">variables) </w:t>
+      </w:r>
+      <w:r>
+        <w:t xml:space="preserve">của hàm </w:t>
+      </w:r>
+      <w:r>
+        <w:t xml:space="preserve">chính </w:t>
+      </w:r>
+      <w:r>
+        <w:t xml:space="preserve">và biến đối ngẫu </w:t>
+      </w:r>
+      <w:r>
+        <w:t xml:space="preserve">(dual variables) </w:t>
+      </w:r>
+      <w:r>
+        <w:t>của các điều kiện</w:t>
+      </w:r>
+      <w:r>
+        <w:t>,</w:t>
+      </w:r>
+      <w:r>
+        <w:t xml:space="preserve"> </w:t>
+      </w:r>
+      <w:r>
+        <w:t xml:space="preserve">và </w:t>
+      </w:r>
+      <w:r>
+        <w:t>hàm Lagrange</w:t>
+      </w:r>
+      <w:r>
+        <w:t xml:space="preserve"> này </w:t>
+      </w:r>
+      <w:r>
+        <w:t xml:space="preserve">có cực trị là điểm yên ngựa </w:t>
+      </w:r>
+      <w:r>
+        <w:t xml:space="preserve">(saddle point) </w:t>
+      </w:r>
+      <w:r>
+        <w:t xml:space="preserve">mà tại đó nếu hàm </w:t>
+      </w:r>
+      <w:r>
+        <w:t>mục tiêu</w:t>
+      </w:r>
+      <w:r>
+        <w:t xml:space="preserve"> đạt cực tiểu (tối ưu) thì các điều kiện </w:t>
+      </w:r>
+      <w:r>
+        <w:t xml:space="preserve">cũng </w:t>
+      </w:r>
+      <w:r>
+        <w:t xml:space="preserve">đạt </w:t>
+      </w:r>
+      <w:r>
+        <w:t xml:space="preserve">cực đại (tối ưu), và ngược lại, </w:t>
+      </w:r>
+      <w:r>
+        <w:t xml:space="preserve">nếu hàm </w:t>
+      </w:r>
+      <w:r>
+        <w:t>mục tiêu</w:t>
+      </w:r>
+      <w:r>
+        <w:t xml:space="preserve"> </w:t>
+      </w:r>
+      <w:r>
+        <w:t xml:space="preserve">đạt cực </w:t>
+      </w:r>
+      <w:r>
+        <w:t>đại</w:t>
+      </w:r>
+      <w:r>
+        <w:t xml:space="preserve"> (tối ưu) thì các điều kiện </w:t>
+      </w:r>
+      <w:r>
+        <w:t xml:space="preserve">cũng </w:t>
+      </w:r>
+      <w:r>
+        <w:t xml:space="preserve">đạt </w:t>
+      </w:r>
+      <w:r>
+        <w:t xml:space="preserve">cực </w:t>
+      </w:r>
+      <w:r>
+        <w:t>tiểu</w:t>
+      </w:r>
+      <w:r>
+        <w:t xml:space="preserve"> (tối ưu)</w:t>
       </w:r>
       <w:r>
         <w:t>.</w:t>
       </w:r>
       <w:r>
-        <w:t xml:space="preserve"> </w:t>
-      </w:r>
-      <w:r>
-        <w:t xml:space="preserve">Ghi chú, trái phiếu mua được kế toán tăng NỢ tài sản (asset) và trái phiếu phát hành được kế toán tăng CÓ </w:t>
-      </w:r>
-      <w:r>
-        <w:t>nợ phải trả</w:t>
-      </w:r>
-      <w:r>
-        <w:t xml:space="preserve"> (</w:t>
-      </w:r>
-      <w:r>
-        <w:t>liability</w:t>
-      </w:r>
-      <w:r>
-        <w:t>)</w:t>
-      </w:r>
-      <w:r>
-        <w:t xml:space="preserve"> nên lượng tiền phát hành (tài khoản ngân hàng thương mại) cân đối với trái phiếu mua &amp; những tài sản khác và vốn đầu tư công có thể là trái phiếu phát hành</w:t>
-      </w:r>
-      <w:r>
-        <w:t xml:space="preserve">. </w:t>
-      </w:r>
-      <w:r>
-        <w:t>Ghi chú, vốn ODA tuy có lãi suất thấp nhưng còn bị ảnh hưởng bởi tỉ giá hối đoái</w:t>
-      </w:r>
-      <w:r>
-        <w:t>, nếu sức mua của nội tệ yếu thì vay vốn ODA sẽ gánh thêm chênh lệch tỉ giá hối đoái giữa nội tệ và ngoại tệ</w:t>
-      </w:r>
-      <w:r>
-        <w:t xml:space="preserve"> khi tung lượng tiền phát hành</w:t>
-      </w:r>
-      <w:r>
-        <w:t xml:space="preserve">. </w:t>
-      </w:r>
-      <w:r>
-        <w:t xml:space="preserve">Mạng lưới thương mại và hộ kinh doanh nhỏ lẻ không cần lượng tiền bút toán mới vì đã tận dụng lượng tiền đang lưu thông (tiền giấy/xu và số dư tài khoản ngân hàng thương mại), nên đồng thời đóng góp nguồn thu thuế và giảm lạm phát. Tận dụng lượng </w:t>
-      </w:r>
-      <w:r>
-        <w:rPr>
-          <w:i/>
-        </w:rPr>
-        <w:t>tiền lưu thông</w:t>
-      </w:r>
-      <w:r>
-        <w:t xml:space="preserve"> vốn đã giảm nguy cơ lạm phát, tăng lượng của cải khi sản xuất hiệu quả cũng giảm lạm phát vì thu hẹp khoảng cách giữa lượng của cải và lượng tiền lưu thông, cần đồng hành với tăng tiêu dùng </w:t>
-      </w:r>
-      <w:r>
-        <w:t xml:space="preserve">nội địa </w:t>
-      </w:r>
-      <w:r>
-        <w:t xml:space="preserve">nghĩa là </w:t>
-      </w:r>
-      <w:r>
-        <w:t xml:space="preserve">kích thích tái sản xuất </w:t>
-      </w:r>
-      <w:r>
-        <w:t xml:space="preserve">và/hoặc </w:t>
-      </w:r>
-      <w:r>
-        <w:t xml:space="preserve">đẩy ngược lượng tiền lưu thông trở lại ngân hàng </w:t>
-      </w:r>
-      <w:r>
-        <w:t xml:space="preserve">(thương mại, </w:t>
-      </w:r>
-      <w:r>
-        <w:t>trung ương</w:t>
-      </w:r>
-      <w:r>
-        <w:t>)</w:t>
-      </w:r>
-      <w:r>
-        <w:t xml:space="preserve"> một lần nữa kích thích đầu tư công / phúc lợi</w:t>
-      </w:r>
-      <w:r>
-        <w:t>.</w:t>
-      </w:r>
-      <w:r>
-        <w:t xml:space="preserve"> </w:t>
-      </w:r>
-      <w:r>
-        <w:rPr>
-          <w:i/>
-        </w:rPr>
-        <w:t>Tiêu dùng nội địa</w:t>
-      </w:r>
-      <w:r>
-        <w:t xml:space="preserve"> </w:t>
-      </w:r>
-      <w:r>
-        <w:t xml:space="preserve">(domestic consumption) </w:t>
-      </w:r>
-      <w:r>
-        <w:t xml:space="preserve">cũng là một hình thức huy động vốn nhàn rỗi như </w:t>
-      </w:r>
-      <w:r>
-        <w:rPr>
-          <w:i/>
-        </w:rPr>
-        <w:t>thị trường chứng khoán</w:t>
-      </w:r>
-      <w:r>
-        <w:t xml:space="preserve"> (stock market)</w:t>
-      </w:r>
-      <w:r>
-        <w:t>.</w:t>
-      </w:r>
-      <w:r>
-        <w:t xml:space="preserve"> </w:t>
-      </w:r>
-      <w:r>
-        <w:t>Thế nên doanh nghiệp tư nhân nhỏ lẻ trên bức tranh tổng thể toàn dân số không hề nhỏ lẻ.</w:t>
-      </w:r>
-      <w:r>
-        <w:t xml:space="preserve"> Vấn đề cốt lõi </w:t>
-      </w:r>
-      <w:r>
-        <w:t>giàu có</w:t>
-      </w:r>
-      <w:r>
-        <w:t xml:space="preserve"> quốc gia là tăng lượng của cải, tức tăng tài sản ròng – tăng vốn chủ sở hữu theo nghiệp vụ kế toán</w:t>
-      </w:r>
-      <w:r>
-        <w:t xml:space="preserve"> </w:t>
-      </w:r>
-      <w:r>
-        <w:lastRenderedPageBreak/>
-        <w:t>(accounting)</w:t>
-      </w:r>
-      <w:r>
-        <w:t>, nhưng trạng thái lý tưởng này luôn bị nhiễu bởi tăng nguồn vốn chứa nợ phải trả tức lạm phát</w:t>
-      </w:r>
-      <w:r>
-        <w:t xml:space="preserve">, một lần nữa nhưng, nếu không có nhiễu lạm phát </w:t>
-      </w:r>
-      <w:r>
-        <w:t>xúc tác</w:t>
-      </w:r>
-      <w:r>
-        <w:t xml:space="preserve"> thì ngay cả tiệm cận trạng thái lý tưởng cũng không </w:t>
-      </w:r>
-      <w:r>
-        <w:t xml:space="preserve">thể </w:t>
-      </w:r>
-      <w:r>
-        <w:t>tiệm cận. Quan điểm tự do kinh tế chấp nhận lạm phát vì càng quá mức ngăn cản lạm phát thì lạm phát càng có xu hướng nghi</w:t>
-      </w:r>
-      <w:r>
-        <w:t>ê</w:t>
-      </w:r>
-      <w:r>
-        <w:t>m trọng</w:t>
-      </w:r>
-      <w:r>
-        <w:t xml:space="preserve"> theo tỉ trọng nền kinh tế</w:t>
-      </w:r>
-      <w:r>
-        <w:t xml:space="preserve"> v</w:t>
-      </w:r>
-      <w:r>
-        <w:t>ì</w:t>
-      </w:r>
-      <w:r>
-        <w:t xml:space="preserve"> thiếu đi chất xúc tác </w:t>
-      </w:r>
-      <w:r>
-        <w:t>cho</w:t>
-      </w:r>
-      <w:r>
-        <w:t xml:space="preserve"> phản ứng dây chuyền trong mạng lưới kinh tế phức hợp</w:t>
-      </w:r>
-      <w:r>
-        <w:t>.</w:t>
-      </w:r>
-      <w:r>
-        <w:t xml:space="preserve"> Tiêu dùng nội địa tăng đến một lúc nào đó sẽ bị giới hạn – hấp thu năng lượng sản xuất </w:t>
-      </w:r>
-      <w:r>
-        <w:t xml:space="preserve">&amp; đầu tư </w:t>
-      </w:r>
-      <w:r>
-        <w:t xml:space="preserve">đến giới hạn, thì bánh xe kinh tế sẽ đình trệ nếu không có nguồn vốn tung vào </w:t>
-      </w:r>
-      <w:r>
-        <w:t xml:space="preserve">đẩy </w:t>
-      </w:r>
-      <w:r>
-        <w:t>kịp lúc và lạm phát lại xảy ra.</w:t>
-      </w:r>
+        <w:t xml:space="preserve"> Đây là vấn đề tối ưu đối ngẫu (duality optimization).</w:t>
+      </w:r>
+      <w:bookmarkStart w:id="4" w:name="_GoBack"/>
+      <w:bookmarkEnd w:id="4"/>
     </w:p>
     <w:p>
       <w:pPr>
@@ -16538,7 +16916,11 @@
         <w:t xml:space="preserve"> (tương tự hoạt động tín dụng cho vay lấy lãi)</w:t>
       </w:r>
       <w:r>
-        <w:t xml:space="preserve">, theo luận điểm thế năng trình độ sản xuất trong bài nghiên cứu – chỉ cần có chênh lệch là có lợi nhuận, mở rộng đến sự hoạt tác rất cần thiết của hoạt động tài chính, đào sâu một lần nữa đến quan năng quay vòng của đồng tiền </w:t>
+        <w:t xml:space="preserve">, theo luận điểm thế năng trình độ sản xuất trong bài nghiên cứu – chỉ cần có chênh lệch là có lợi nhuận, mở rộng đến sự hoạt tác rất cần thiết của hoạt động tài chính, đào sâu một lần nữa đến quan năng quay vòng </w:t>
+      </w:r>
+      <w:r>
+        <w:lastRenderedPageBreak/>
+        <w:t xml:space="preserve">của đồng tiền </w:t>
       </w:r>
       <w:r>
         <w:t xml:space="preserve">liên quan </w:t>
@@ -16840,185 +17222,185 @@
         <w:t>tiền kỹ thuật số</w:t>
       </w:r>
       <w:r>
-        <w:t xml:space="preserve"> (digitial currency) đáp </w:t>
+        <w:t xml:space="preserve"> (digitial currency) đáp ứng yêu cầu thanh khoản nhanh </w:t>
+      </w:r>
+      <w:r>
+        <w:t>với</w:t>
+      </w:r>
+      <w:r>
+        <w:t xml:space="preserve"> số lượng lớn cũng như an toàn. </w:t>
+      </w:r>
+      <w:r>
+        <w:t xml:space="preserve">Ghi chú, </w:t>
+      </w:r>
+      <w:r>
+        <w:t>tiền kỹ thuật số</w:t>
+      </w:r>
+      <w:r>
+        <w:rPr>
+          <w:i/>
+        </w:rPr>
+        <w:t xml:space="preserve"> </w:t>
+      </w:r>
+      <w:r>
+        <w:t xml:space="preserve">có vai trò như tiền mặt giấy/xu. </w:t>
+      </w:r>
+      <w:r>
+        <w:t>Lưu ý, phát hành tiền giấy/xu với số lượng lớn tốn chi phí và không an toàn</w:t>
+      </w:r>
+      <w:r>
+        <w:t xml:space="preserve"> </w:t>
+      </w:r>
+      <w:r>
+        <w:t>cũng như gặp rủi ro như hư hỏng &amp; mất mát</w:t>
+      </w:r>
+      <w:r>
+        <w:t>.</w:t>
+      </w:r>
+      <w:r>
+        <w:t xml:space="preserve"> </w:t>
+      </w:r>
+      <w:r>
+        <w:t>H</w:t>
+      </w:r>
+      <w:r>
+        <w:t xml:space="preserve">iện nay (2026) có hai loại tiền kỹ thuật số là </w:t>
+      </w:r>
+      <w:r>
+        <w:rPr>
+          <w:i/>
+        </w:rPr>
+        <w:t>tiền kỹ thuật số tập trung</w:t>
+      </w:r>
+      <w:r>
+        <w:t xml:space="preserve"> do ngân hàng trung ương phát hành neo vào bản vị pháp định như tiền tiền mặt </w:t>
+      </w:r>
+      <w:r>
+        <w:t>&amp;</w:t>
+      </w:r>
+      <w:r>
+        <w:t xml:space="preserve"> tiền bút toán và </w:t>
+      </w:r>
+      <w:r>
+        <w:rPr>
+          <w:i/>
+        </w:rPr>
+        <w:t>tiền kỹ thuật số phân tán</w:t>
+      </w:r>
+      <w:r>
+        <w:t xml:space="preserve"> mà hình thức phổ biến là </w:t>
+      </w:r>
+      <w:r>
+        <w:rPr>
+          <w:i/>
+        </w:rPr>
+        <w:t>tiền mã hóa</w:t>
+      </w:r>
+      <w:r>
+        <w:t xml:space="preserve"> (c</w:t>
+      </w:r>
+      <w:r>
+        <w:t>ryptocurrency</w:t>
+      </w:r>
+      <w:r>
+        <w:t>) như Bitcoin được phát triển bởi cộng đồng trên internet</w:t>
+      </w:r>
+      <w:r>
+        <w:t xml:space="preserve"> (Google AI 2026)</w:t>
+      </w:r>
+      <w:r>
+        <w:t>.</w:t>
+      </w:r>
+      <w:r>
+        <w:t xml:space="preserve"> Tiền kỹ thuật số </w:t>
+      </w:r>
+      <w:r>
+        <w:t>tập trung do n</w:t>
+      </w:r>
+      <w:r>
+        <w:t xml:space="preserve">gân hàng </w:t>
+      </w:r>
+      <w:r>
+        <w:t>trung ương</w:t>
+      </w:r>
+      <w:r>
+        <w:t xml:space="preserve"> phát hành còn được gọi</w:t>
+      </w:r>
+      <w:r>
+        <w:t xml:space="preserve"> là</w:t>
+      </w:r>
+      <w:r>
+        <w:t xml:space="preserve"> </w:t>
+      </w:r>
+      <w:r>
+        <w:rPr>
+          <w:i/>
+        </w:rPr>
+        <w:t>tiền CBDC</w:t>
+      </w:r>
+      <w:r>
+        <w:t xml:space="preserve"> </w:t>
+      </w:r>
+      <w:r>
+        <w:t>(</w:t>
+      </w:r>
+      <w:r>
+        <w:t>c</w:t>
+      </w:r>
+      <w:r>
+        <w:t xml:space="preserve">entral </w:t>
+      </w:r>
+      <w:r>
+        <w:t>b</w:t>
+      </w:r>
+      <w:r>
+        <w:t xml:space="preserve">ank </w:t>
+      </w:r>
+      <w:r>
+        <w:t>d</w:t>
+      </w:r>
+      <w:r>
+        <w:t xml:space="preserve">igital </w:t>
+      </w:r>
+      <w:r>
+        <w:t>c</w:t>
+      </w:r>
+      <w:r>
+        <w:t>urrency)</w:t>
+      </w:r>
+      <w:r>
+        <w:t xml:space="preserve"> hoàn toàn là tiền pháp định và có tính ổn định cao hơn tiền mã hóa mặc dù có thể chúng áp dùng cùng một công nghệ như </w:t>
+      </w:r>
+      <w:r>
+        <w:rPr>
+          <w:i/>
+        </w:rPr>
+        <w:t>blockchain</w:t>
+      </w:r>
+      <w:r>
+        <w:t xml:space="preserve"> nhưng hiện nay (2026) hình như tiền mã hóa như Bitcoin, E</w:t>
+      </w:r>
+      <w:r>
+        <w:t>thereum</w:t>
+      </w:r>
+      <w:r>
+        <w:t xml:space="preserve"> phổ biến hơn tiền CBDC.</w:t>
+      </w:r>
+      <w:r>
+        <w:t xml:space="preserve"> </w:t>
+      </w:r>
+      <w:r>
+        <w:t xml:space="preserve">Mua bán trên thị trường ngoại hối trước tiên là hoạt động tài chính, nhưng với tiền mã hóa có sự tham gia của cộng đồng với công nghệ </w:t>
+      </w:r>
+      <w:r>
+        <w:t>blockchain</w:t>
+      </w:r>
+      <w:r>
+        <w:t xml:space="preserve"> thì hoạt động mua bán tiền mã hóa có hơi hướng </w:t>
       </w:r>
       <w:r>
         <w:lastRenderedPageBreak/>
-        <w:t xml:space="preserve">ứng yêu cầu thanh khoản nhanh </w:t>
-      </w:r>
-      <w:r>
-        <w:t>với</w:t>
-      </w:r>
-      <w:r>
-        <w:t xml:space="preserve"> số lượng lớn cũng như an toàn. </w:t>
-      </w:r>
-      <w:r>
-        <w:t xml:space="preserve">Ghi chú, </w:t>
-      </w:r>
-      <w:r>
-        <w:t>tiền kỹ thuật số</w:t>
-      </w:r>
-      <w:r>
-        <w:rPr>
-          <w:i/>
-        </w:rPr>
-        <w:t xml:space="preserve"> </w:t>
-      </w:r>
-      <w:r>
-        <w:t xml:space="preserve">có vai trò như tiền mặt giấy/xu. </w:t>
-      </w:r>
-      <w:r>
-        <w:t>Lưu ý, phát hành tiền giấy/xu với số lượng lớn tốn chi phí và không an toàn</w:t>
-      </w:r>
-      <w:r>
-        <w:t xml:space="preserve"> </w:t>
-      </w:r>
-      <w:r>
-        <w:t>cũng như gặp rủi ro như hư hỏng &amp; mất mát</w:t>
-      </w:r>
-      <w:r>
-        <w:t>.</w:t>
-      </w:r>
-      <w:r>
-        <w:t xml:space="preserve"> </w:t>
-      </w:r>
-      <w:r>
-        <w:t>H</w:t>
-      </w:r>
-      <w:r>
-        <w:t xml:space="preserve">iện nay (2026) có hai loại tiền kỹ thuật số là </w:t>
-      </w:r>
-      <w:r>
-        <w:rPr>
-          <w:i/>
-        </w:rPr>
-        <w:t>tiền kỹ thuật số tập trung</w:t>
-      </w:r>
-      <w:r>
-        <w:t xml:space="preserve"> do ngân hàng trung ương phát hành neo vào bản vị pháp định như tiền tiền mặt </w:t>
-      </w:r>
-      <w:r>
-        <w:t>&amp;</w:t>
-      </w:r>
-      <w:r>
-        <w:t xml:space="preserve"> tiền bút toán và </w:t>
-      </w:r>
-      <w:r>
-        <w:rPr>
-          <w:i/>
-        </w:rPr>
-        <w:t>tiền kỹ thuật số phân tán</w:t>
-      </w:r>
-      <w:r>
-        <w:t xml:space="preserve"> mà hình thức phổ biến là </w:t>
-      </w:r>
-      <w:r>
-        <w:rPr>
-          <w:i/>
-        </w:rPr>
-        <w:t>tiền mã hóa</w:t>
-      </w:r>
-      <w:r>
-        <w:t xml:space="preserve"> (c</w:t>
-      </w:r>
-      <w:r>
-        <w:t>ryptocurrency</w:t>
-      </w:r>
-      <w:r>
-        <w:t>) như Bitcoin được phát triển bởi cộng đồng trên internet</w:t>
-      </w:r>
-      <w:r>
-        <w:t xml:space="preserve"> (Google AI 2026)</w:t>
-      </w:r>
-      <w:r>
-        <w:t>.</w:t>
-      </w:r>
-      <w:r>
-        <w:t xml:space="preserve"> Tiền kỹ thuật số </w:t>
-      </w:r>
-      <w:r>
-        <w:t>tập trung do n</w:t>
-      </w:r>
-      <w:r>
-        <w:t xml:space="preserve">gân hàng </w:t>
-      </w:r>
-      <w:r>
-        <w:t>trung ương</w:t>
-      </w:r>
-      <w:r>
-        <w:t xml:space="preserve"> phát hành còn được gọi</w:t>
-      </w:r>
-      <w:r>
-        <w:t xml:space="preserve"> là</w:t>
-      </w:r>
-      <w:r>
-        <w:t xml:space="preserve"> </w:t>
-      </w:r>
-      <w:r>
-        <w:rPr>
-          <w:i/>
-        </w:rPr>
-        <w:t>tiền CBDC</w:t>
-      </w:r>
-      <w:r>
-        <w:t xml:space="preserve"> </w:t>
-      </w:r>
-      <w:r>
-        <w:t>(</w:t>
-      </w:r>
-      <w:r>
-        <w:t>c</w:t>
-      </w:r>
-      <w:r>
-        <w:t xml:space="preserve">entral </w:t>
-      </w:r>
-      <w:r>
-        <w:t>b</w:t>
-      </w:r>
-      <w:r>
-        <w:t xml:space="preserve">ank </w:t>
-      </w:r>
-      <w:r>
-        <w:t>d</w:t>
-      </w:r>
-      <w:r>
-        <w:t xml:space="preserve">igital </w:t>
-      </w:r>
-      <w:r>
-        <w:t>c</w:t>
-      </w:r>
-      <w:r>
-        <w:t>urrency)</w:t>
-      </w:r>
-      <w:r>
-        <w:t xml:space="preserve"> hoàn toàn là tiền pháp định và có tính ổn định cao hơn tiền mã hóa mặc dù có thể chúng áp dùng cùng một công nghệ như </w:t>
-      </w:r>
-      <w:r>
-        <w:rPr>
-          <w:i/>
-        </w:rPr>
-        <w:t>blockchain</w:t>
-      </w:r>
-      <w:r>
-        <w:t xml:space="preserve"> nhưng hiện nay (2026) hình như tiền mã hóa như Bitcoin, E</w:t>
-      </w:r>
-      <w:r>
-        <w:t>thereum</w:t>
-      </w:r>
-      <w:r>
-        <w:t xml:space="preserve"> phổ biến hơn tiền CBDC.</w:t>
-      </w:r>
-      <w:r>
-        <w:t xml:space="preserve"> </w:t>
-      </w:r>
-      <w:r>
-        <w:t xml:space="preserve">Mua bán trên thị trường ngoại hối trước tiên là hoạt động tài chính, nhưng với tiền mã hóa có sự tham gia của cộng đồng với công nghệ </w:t>
-      </w:r>
-      <w:r>
-        <w:t>blockchain</w:t>
-      </w:r>
-      <w:r>
-        <w:t xml:space="preserve"> thì hoạt động mua bán tiền mã hóa có hơi hướng của hoạt động sản xuất, trở lại với nhận xét trước rằng tờ tiền vật lý $1 </w:t>
+        <w:t xml:space="preserve">của hoạt động sản xuất, trở lại với nhận xét trước rằng tờ tiền vật lý $1 </w:t>
       </w:r>
       <w:r>
         <w:t xml:space="preserve">tương ứng với tiền mã hóa </w:t>
@@ -17225,11 +17607,7 @@
         <w:t>ta đã biết, vốn là năng lượng do hàng hóa chuyển hóa thành. Nếu nhà tư bản không đủ vốn thì họ sẽ vay vốn, tạo tiền đề – cơ sở lý luận cho lợi nhuận hợp lý của hoạt động tài chính – cho vay lấy lãi</w:t>
       </w:r>
       <w:r>
-        <w:t xml:space="preserve">, tuy </w:t>
-      </w:r>
-      <w:r>
-        <w:lastRenderedPageBreak/>
-        <w:t>nhiên cũng dẫn đến một hệ lụy tiêu cực của đầu cơ tích trữ như một điều không thể tránh khỏi trong nền kinh tế thị trường</w:t>
+        <w:t>, tuy nhiên cũng dẫn đến một hệ lụy tiêu cực của đầu cơ tích trữ như một điều không thể tránh khỏi trong nền kinh tế thị trường</w:t>
       </w:r>
       <w:r>
         <w:t>.</w:t>
@@ -17338,7 +17716,11 @@
         <w:t xml:space="preserve"> </w:t>
       </w:r>
       <w:r>
-        <w:t xml:space="preserve">Nhắc lại, giá cả tự nhiên của hàng hóa được định nghĩa tổng quát bao gồm: 1) </w:t>
+        <w:t xml:space="preserve">Nhắc </w:t>
+      </w:r>
+      <w:r>
+        <w:lastRenderedPageBreak/>
+        <w:t xml:space="preserve">lại, giá cả tự nhiên của hàng hóa được định nghĩa tổng quát bao gồm: 1) </w:t>
       </w:r>
       <w:r>
         <w:t>tiền công</w:t>
@@ -18375,122 +18757,122 @@
         <w:rPr>
           <w:rFonts w:cs="Times New Roman"/>
         </w:rPr>
-        <w:t xml:space="preserve">Lưu ý, tiền công người lao động góp phần vào </w:t>
+        <w:t xml:space="preserve">Lưu ý, tiền công người lao động góp phần vào GDP theo phương pháp tính GDP bằng </w:t>
+      </w:r>
+      <w:r>
+        <w:rPr>
+          <w:rFonts w:cs="Times New Roman"/>
+        </w:rPr>
+        <w:t>tổng</w:t>
+      </w:r>
+      <w:r>
+        <w:rPr>
+          <w:rFonts w:cs="Times New Roman"/>
+        </w:rPr>
+        <w:t xml:space="preserve"> </w:t>
+      </w:r>
+      <w:r>
+        <w:rPr>
+          <w:rFonts w:cs="Times New Roman"/>
+        </w:rPr>
+        <w:t>thu nhập</w:t>
+      </w:r>
+      <w:r>
+        <w:rPr>
+          <w:rFonts w:cs="Times New Roman"/>
+        </w:rPr>
+        <w:t xml:space="preserve">, hơn nữa tuổi thọ một số công trình cơ sở hạ tầng còn dài hơn một thế hệ (30 năm), khi khấu hao hết thì sẽ tái tạo </w:t>
+      </w:r>
+      <w:r>
+        <w:rPr>
+          <w:rFonts w:cs="Times New Roman"/>
+        </w:rPr>
+        <w:t>công trình</w:t>
+      </w:r>
+      <w:r>
+        <w:rPr>
+          <w:rFonts w:cs="Times New Roman"/>
+        </w:rPr>
+        <w:t xml:space="preserve"> mới cho một thế hệ mới, ví dụ, một số công trình thủy điện chắc chắn đã khấu hao hết giá trị sử dụng, tuy vẫn tồn tại vì nhiều lý do nhưng hoàn toàn có thể dỡ bỏ khi cần thiết, nếu nguồn năng lượng thay thế đã dồi dào hoặc thúc đẩy điều đó</w:t>
+      </w:r>
+      <w:r>
+        <w:rPr>
+          <w:rFonts w:cs="Times New Roman"/>
+        </w:rPr>
+        <w:t xml:space="preserve">. </w:t>
+      </w:r>
+      <w:r>
+        <w:rPr>
+          <w:rFonts w:cs="Times New Roman"/>
+        </w:rPr>
+        <w:t xml:space="preserve">Dạng vốn cố định khác mang lại lợi nhuận được gọi tư bản cố định, không chuyển quyền sở hữu </w:t>
+      </w:r>
+      <w:r>
+        <w:rPr>
+          <w:rFonts w:cs="Times New Roman"/>
+        </w:rPr>
+        <w:t xml:space="preserve">như </w:t>
+      </w:r>
+      <w:r>
+        <w:rPr>
+          <w:rFonts w:cs="Times New Roman"/>
+        </w:rPr>
+        <w:t>nguyên vật liệu (thuộc vốn lưu động) nhưng thiết yếu</w:t>
+      </w:r>
+      <w:r>
+        <w:rPr>
+          <w:rFonts w:cs="Times New Roman"/>
+        </w:rPr>
+        <w:t xml:space="preserve">, </w:t>
+      </w:r>
+      <w:r>
+        <w:rPr>
+          <w:rFonts w:cs="Times New Roman"/>
+        </w:rPr>
+        <w:t>góp phần đáng kể vào tăng trưởng lợi nhuận, đó là nhà xưởng, máy móc, công cụ lao động và cả bất động sản cho thuê.</w:t>
+      </w:r>
+      <w:r>
+        <w:rPr>
+          <w:rFonts w:cs="Times New Roman"/>
+        </w:rPr>
+        <w:t xml:space="preserve"> Dạng vốn cố định thuộc riêng từng cá nhân, </w:t>
+      </w:r>
+      <w:r>
+        <w:rPr>
+          <w:rFonts w:cs="Times New Roman"/>
+        </w:rPr>
+        <w:t xml:space="preserve">quan trọng </w:t>
+      </w:r>
+      <w:r>
+        <w:rPr>
+          <w:rFonts w:cs="Times New Roman"/>
+        </w:rPr>
+        <w:t>đối với từng cá nhân là tay nghề (tài năng) vì một người muốn có t</w:t>
+      </w:r>
+      <w:r>
+        <w:rPr>
+          <w:rFonts w:cs="Times New Roman"/>
+        </w:rPr>
+        <w:t>ay</w:t>
+      </w:r>
+      <w:r>
+        <w:rPr>
+          <w:rFonts w:cs="Times New Roman"/>
+        </w:rPr>
+        <w:t xml:space="preserve"> nghề phải tốn một lượng lao động và/hoặc trả một lượng tiền để học, hơn nữa, tay nghề và tài năng của nhiều người hợp thành, góp phần họp thành trình độ sản xuất của toàn xã hội, nên một lần nữa cần khẳng định vốn là biểu hiện của trình độ sản xuất theo nghĩa tổng quát nhất.</w:t>
+      </w:r>
+      <w:r>
+        <w:rPr>
+          <w:rFonts w:cs="Times New Roman"/>
+        </w:rPr>
+        <w:t xml:space="preserve"> Vốn luân chuyển có đặc điểm </w:t>
       </w:r>
       <w:r>
         <w:rPr>
           <w:rFonts w:cs="Times New Roman"/>
         </w:rPr>
         <w:lastRenderedPageBreak/>
-        <w:t xml:space="preserve">GDP theo phương pháp tính GDP bằng </w:t>
-      </w:r>
-      <w:r>
-        <w:rPr>
-          <w:rFonts w:cs="Times New Roman"/>
-        </w:rPr>
-        <w:t>tổng</w:t>
-      </w:r>
-      <w:r>
-        <w:rPr>
-          <w:rFonts w:cs="Times New Roman"/>
-        </w:rPr>
-        <w:t xml:space="preserve"> </w:t>
-      </w:r>
-      <w:r>
-        <w:rPr>
-          <w:rFonts w:cs="Times New Roman"/>
-        </w:rPr>
-        <w:t>thu nhập</w:t>
-      </w:r>
-      <w:r>
-        <w:rPr>
-          <w:rFonts w:cs="Times New Roman"/>
-        </w:rPr>
-        <w:t xml:space="preserve">, hơn nữa tuổi thọ một số công trình cơ sở hạ tầng còn dài hơn một thế hệ (30 năm), khi khấu hao hết thì sẽ tái tạo </w:t>
-      </w:r>
-      <w:r>
-        <w:rPr>
-          <w:rFonts w:cs="Times New Roman"/>
-        </w:rPr>
-        <w:t>công trình</w:t>
-      </w:r>
-      <w:r>
-        <w:rPr>
-          <w:rFonts w:cs="Times New Roman"/>
-        </w:rPr>
-        <w:t xml:space="preserve"> mới cho một thế hệ mới, ví dụ, một số công trình thủy điện chắc chắn đã khấu hao hết giá trị sử dụng, tuy vẫn tồn tại vì nhiều lý do nhưng hoàn toàn có thể dỡ bỏ khi cần thiết, nếu nguồn năng lượng thay thế đã dồi dào hoặc thúc đẩy điều đó</w:t>
-      </w:r>
-      <w:r>
-        <w:rPr>
-          <w:rFonts w:cs="Times New Roman"/>
-        </w:rPr>
-        <w:t xml:space="preserve">. </w:t>
-      </w:r>
-      <w:r>
-        <w:rPr>
-          <w:rFonts w:cs="Times New Roman"/>
-        </w:rPr>
-        <w:t xml:space="preserve">Dạng vốn cố định khác mang lại lợi nhuận được gọi tư bản cố định, không chuyển quyền sở hữu </w:t>
-      </w:r>
-      <w:r>
-        <w:rPr>
-          <w:rFonts w:cs="Times New Roman"/>
-        </w:rPr>
-        <w:t xml:space="preserve">như </w:t>
-      </w:r>
-      <w:r>
-        <w:rPr>
-          <w:rFonts w:cs="Times New Roman"/>
-        </w:rPr>
-        <w:t>nguyên vật liệu (thuộc vốn lưu động) nhưng thiết yếu</w:t>
-      </w:r>
-      <w:r>
-        <w:rPr>
-          <w:rFonts w:cs="Times New Roman"/>
-        </w:rPr>
-        <w:t xml:space="preserve">, </w:t>
-      </w:r>
-      <w:r>
-        <w:rPr>
-          <w:rFonts w:cs="Times New Roman"/>
-        </w:rPr>
-        <w:t>góp phần đáng kể vào tăng trưởng lợi nhuận, đó là nhà xưởng, máy móc, công cụ lao động và cả bất động sản cho thuê.</w:t>
-      </w:r>
-      <w:r>
-        <w:rPr>
-          <w:rFonts w:cs="Times New Roman"/>
-        </w:rPr>
-        <w:t xml:space="preserve"> Dạng vốn cố định thuộc riêng từng cá nhân, </w:t>
-      </w:r>
-      <w:r>
-        <w:rPr>
-          <w:rFonts w:cs="Times New Roman"/>
-        </w:rPr>
-        <w:t xml:space="preserve">quan trọng </w:t>
-      </w:r>
-      <w:r>
-        <w:rPr>
-          <w:rFonts w:cs="Times New Roman"/>
-        </w:rPr>
-        <w:t>đối với từng cá nhân là tay nghề (tài năng) vì một người muốn có t</w:t>
-      </w:r>
-      <w:r>
-        <w:rPr>
-          <w:rFonts w:cs="Times New Roman"/>
-        </w:rPr>
-        <w:t>ay</w:t>
-      </w:r>
-      <w:r>
-        <w:rPr>
-          <w:rFonts w:cs="Times New Roman"/>
-        </w:rPr>
-        <w:t xml:space="preserve"> nghề phải tốn một lượng lao động và/hoặc trả một lượng tiền để học, hơn nữa, tay nghề và tài năng của nhiều người hợp thành, góp phần họp thành trình độ sản xuất của toàn xã hội, nên một lần nữa cần khẳng định vốn là biểu hiện của trình độ sản xuất theo nghĩa tổng quát nhất.</w:t>
-      </w:r>
-      <w:r>
-        <w:rPr>
-          <w:rFonts w:cs="Times New Roman"/>
-        </w:rPr>
-        <w:t xml:space="preserve"> Vốn luân chuyển có đặc điểm chủ yếu chỉ mang lại lợi nhuận khi luân chuyển hoặc chuyển quyền sở hữu như tiền công hoặc lượng tiền phân phối trong một hệ thống nào đó như vay tín dụng, nguyên vật liệu còn ở dạng thô chưa chế biến thành phẩm, hàng hóa dự trữ hoặc đã thành phẩm đang chờ bán đến người tiêu dùng</w:t>
+        <w:t>chủ yếu chỉ mang lại lợi nhuận khi luân chuyển hoặc chuyển quyền sở hữu như tiền công hoặc lượng tiền phân phối trong một hệ thống nào đó như vay tín dụng, nguyên vật liệu còn ở dạng thô chưa chế biến thành phẩm, hàng hóa dự trữ hoặc đã thành phẩm đang chờ bán đến người tiêu dùng</w:t>
       </w:r>
       <w:sdt>
         <w:sdtPr>
@@ -18867,14 +19249,7 @@
         <w:rPr>
           <w:rFonts w:cs="Times New Roman"/>
         </w:rPr>
-        <w:t xml:space="preserve">Tóm lại, sự khác biệt cơ bản giữa vốn cố định và vốn lưu động rằng vốn lưu động chỉ mang lại lợi nhuận thông qua luân chuyển (chuyển </w:t>
-      </w:r>
-      <w:r>
-        <w:rPr>
-          <w:rFonts w:cs="Times New Roman"/>
-        </w:rPr>
-        <w:lastRenderedPageBreak/>
-        <w:t>quyền sở hữu) và thay đổi hình thái (từ tiền sang hàng hóa và ngược lại), trong khi đó, vốn cố định có thể tạo ra lợi nhuận mà không cần luân chuyển (</w:t>
+        <w:t>Tóm lại, sự khác biệt cơ bản giữa vốn cố định và vốn lưu động rằng vốn lưu động chỉ mang lại lợi nhuận thông qua luân chuyển (chuyển quyền sở hữu) và thay đổi hình thái (từ tiền sang hàng hóa và ngược lại), trong khi đó, vốn cố định có thể tạo ra lợi nhuận mà không cần luân chuyển (</w:t>
       </w:r>
       <w:r>
         <w:rPr>
@@ -19035,7 +19410,11 @@
         <w:t>Google AI 2025</w:t>
       </w:r>
       <w:r>
-        <w:t xml:space="preserve">). Chi phí khấu hao tài sản cố định được cộng vào GDP chứ không phải trừ đi do vốn phải chuyển thành tài sản mới được tính vào GDP và chi phí khấu hao tức tu bổ tài sản cố định tương đương mua mới một lượng tài sản cố định. Tuy nhiên </w:t>
+        <w:t xml:space="preserve">). Chi phí khấu </w:t>
+      </w:r>
+      <w:r>
+        <w:lastRenderedPageBreak/>
+        <w:t xml:space="preserve">hao tài sản cố định được cộng vào GDP chứ không phải trừ đi do vốn phải chuyển thành tài sản mới được tính vào GDP và chi phí khấu hao tức tu bổ tài sản cố định tương đương mua mới một lượng tài sản cố định. Tuy nhiên </w:t>
       </w:r>
       <w:r>
         <w:t xml:space="preserve">không </w:t>
@@ -19214,11 +19593,7 @@
         <w:t>có thuộc tính quan trọng nhất là trao đổi</w:t>
       </w:r>
       <w:r>
-        <w:t xml:space="preserve"> và trao đổi là hoạt động “giao hợp” của </w:t>
-      </w:r>
-      <w:r>
-        <w:lastRenderedPageBreak/>
-        <w:t>sinh thể kinh tế để sinh sôi của cải</w:t>
+        <w:t xml:space="preserve"> và trao đổi là hoạt động “giao hợp” của sinh thể kinh tế để sinh sôi của cải</w:t>
       </w:r>
       <w:r>
         <w:t xml:space="preserve">. Bất luận thế nào </w:t>
@@ -19336,7 +19711,11 @@
         <w:t xml:space="preserve">. </w:t>
       </w:r>
       <w:r>
-        <w:t>Tuy nhiên, bất luận thế nào, vai trò lưu thông của tiền tệ hay tiền lưu thông luôn thiết yếu</w:t>
+        <w:t xml:space="preserve">Tuy nhiên, bất luận thế nào, vai trò lưu thông của tiền tệ hay </w:t>
+      </w:r>
+      <w:r>
+        <w:lastRenderedPageBreak/>
+        <w:t>tiền lưu thông luôn thiết yếu</w:t>
       </w:r>
       <w:r>
         <w:t xml:space="preserve"> và tất nhiên, tiền lưu thông là một thành phần của vốn lưu động bên cạnh </w:t>
@@ -19649,83 +20028,83 @@
         <w:t xml:space="preserve"> </w:t>
       </w:r>
       <w:r>
-        <w:t xml:space="preserve">4/5 này </w:t>
+        <w:t xml:space="preserve">4/5 này vừa đủ, nếu tỉ lệ tiền giấy lớn hơn 4/5 là lạm phát </w:t>
+      </w:r>
+      <w:r>
+        <w:t xml:space="preserve">(cao) </w:t>
+      </w:r>
+      <w:r>
+        <w:t xml:space="preserve">và nhỏ hơn </w:t>
+      </w:r>
+      <w:r>
+        <w:t>4</w:t>
+      </w:r>
+      <w:r>
+        <w:t>/5 là giảm phát</w:t>
+      </w:r>
+      <w:r>
+        <w:t xml:space="preserve"> (thấp)</w:t>
+      </w:r>
+      <w:r>
+        <w:t xml:space="preserve">. </w:t>
+      </w:r>
+      <w:r>
+        <w:t>Tỉ lệ lạm phát trong trường hợp này, đơn giản là phần bù của tỉ lệ tương ứng tiền tệ</w:t>
+      </w:r>
+      <w:r>
+        <w:t xml:space="preserve"> tức 0.2 = 1/5 = 1 – 4/5, sẽ nhỏ hơn khoảng 10 lần trong nền kinh tế hiện nay tức 2% = 0.2/10. </w:t>
+      </w:r>
+      <w:r>
+        <w:t xml:space="preserve">Ghi chú, Smith dùng thuật ngữ “sụt giảm giá trị tiền tệ” </w:t>
+      </w:r>
+      <w:r>
+        <w:t xml:space="preserve">khi </w:t>
+      </w:r>
+      <w:r>
+        <w:t>đề cập lạm phát.</w:t>
+      </w:r>
+      <w:r>
+        <w:t xml:space="preserve"> </w:t>
+      </w:r>
+      <w:r>
+        <w:t>Tiền giấy lưu thông nội tại tương ứng với tổng thu nhập theo một tỉ lệ nhỏ hơn 1, chứ không phải ngang bằng 1:1 vì lượng tiền lưu thông luôn nhỏ hơn tổng thu nhập do chuyển quyền sở hữu và sự thuận tiện</w:t>
+      </w:r>
+      <w:r>
+        <w:t>, nghĩa là luôn cần có lạm phát</w:t>
+      </w:r>
+      <w:r>
+        <w:t xml:space="preserve"> nhưng lạm phát phải nhỏ hơn tỉ lệ tăng trưởng tổng thu nhập và chỉ có lạm phát vừa đủ để giải phóng nguồn lực dôi dư thông qua vòng quay tiền thì tổng thu nhập mới tăng trưởng</w:t>
+      </w:r>
+      <w:r>
+        <w:t>.</w:t>
+      </w:r>
+      <w:r>
+        <w:t xml:space="preserve"> Tuy nhiên khi đồng tiền vàng được thay bằng tiền pháp định, vấn đề trở nên phức tạp </w:t>
+      </w:r>
+      <w:r>
+        <w:t xml:space="preserve">một chút </w:t>
+      </w:r>
+      <w:r>
+        <w:t>vì dạng vật lý của tiền pháp định là tiền giấy</w:t>
+      </w:r>
+      <w:r>
+        <w:t xml:space="preserve"> nhưng giá trị trao đổi </w:t>
+      </w:r>
+      <w:r>
+        <w:t xml:space="preserve">của </w:t>
+      </w:r>
+      <w:r>
+        <w:t>tiền pháp định là tỉ giá hối đoái.</w:t>
+      </w:r>
+      <w:r>
+        <w:t xml:space="preserve"> </w:t>
+      </w:r>
+      <w:r>
+        <w:t xml:space="preserve">Do vậy tờ tiền vật lý 1$ có một giá trị riêng bởi một loạt hoạt động đầu tư tạo lợi nhuận sau đó và tiền pháp định có giá trị trao đổi là tỉ giá hối đoái dựa trên sức mạnh </w:t>
       </w:r>
       <w:r>
         <w:lastRenderedPageBreak/>
-        <w:t xml:space="preserve">vừa đủ, nếu tỉ lệ tiền giấy lớn hơn 4/5 là lạm phát </w:t>
-      </w:r>
-      <w:r>
-        <w:t xml:space="preserve">(cao) </w:t>
-      </w:r>
-      <w:r>
-        <w:t xml:space="preserve">và nhỏ hơn </w:t>
-      </w:r>
-      <w:r>
-        <w:t>4</w:t>
-      </w:r>
-      <w:r>
-        <w:t>/5 là giảm phát</w:t>
-      </w:r>
-      <w:r>
-        <w:t xml:space="preserve"> (thấp)</w:t>
-      </w:r>
-      <w:r>
-        <w:t xml:space="preserve">. </w:t>
-      </w:r>
-      <w:r>
-        <w:t>Tỉ lệ lạm phát trong trường hợp này, đơn giản là phần bù của tỉ lệ tương ứng tiền tệ</w:t>
-      </w:r>
-      <w:r>
-        <w:t xml:space="preserve"> tức 0.2 = 1/5 = 1 – 4/5, sẽ nhỏ hơn khoảng 10 lần trong nền kinh tế hiện nay tức 2% = 0.2/10. </w:t>
-      </w:r>
-      <w:r>
-        <w:t xml:space="preserve">Ghi chú, Smith dùng thuật ngữ “sụt giảm giá trị tiền tệ” </w:t>
-      </w:r>
-      <w:r>
-        <w:t xml:space="preserve">khi </w:t>
-      </w:r>
-      <w:r>
-        <w:t>đề cập lạm phát.</w:t>
-      </w:r>
-      <w:r>
-        <w:t xml:space="preserve"> </w:t>
-      </w:r>
-      <w:r>
-        <w:t>Tiền giấy lưu thông nội tại tương ứng với tổng thu nhập theo một tỉ lệ nhỏ hơn 1, chứ không phải ngang bằng 1:1 vì lượng tiền lưu thông luôn nhỏ hơn tổng thu nhập do chuyển quyền sở hữu và sự thuận tiện</w:t>
-      </w:r>
-      <w:r>
-        <w:t>, nghĩa là luôn cần có lạm phát</w:t>
-      </w:r>
-      <w:r>
-        <w:t xml:space="preserve"> nhưng lạm phát phải nhỏ hơn tỉ lệ tăng trưởng tổng thu nhập và chỉ có lạm phát vừa đủ để giải phóng nguồn lực dôi dư thông qua vòng quay tiền thì tổng thu nhập mới tăng trưởng</w:t>
-      </w:r>
-      <w:r>
-        <w:t>.</w:t>
-      </w:r>
-      <w:r>
-        <w:t xml:space="preserve"> Tuy nhiên khi đồng tiền vàng được thay bằng tiền pháp định, vấn đề trở nên phức tạp </w:t>
-      </w:r>
-      <w:r>
-        <w:t xml:space="preserve">một chút </w:t>
-      </w:r>
-      <w:r>
-        <w:t>vì dạng vật lý của tiền pháp định là tiền giấy</w:t>
-      </w:r>
-      <w:r>
-        <w:t xml:space="preserve"> nhưng giá trị trao đổi </w:t>
-      </w:r>
-      <w:r>
-        <w:t xml:space="preserve">của </w:t>
-      </w:r>
-      <w:r>
-        <w:t>tiền pháp định là tỉ giá hối đoái.</w:t>
-      </w:r>
-      <w:r>
-        <w:t xml:space="preserve"> </w:t>
-      </w:r>
-      <w:r>
-        <w:t xml:space="preserve">Do vậy tờ tiền vật lý 1$ có một giá trị riêng bởi một loạt hoạt động đầu tư tạo lợi nhuận sau đó và tiền pháp định có giá trị trao đổi là tỉ giá hối đoái dựa trên sức mạnh cứng của quốc gia. </w:t>
+        <w:t xml:space="preserve">cứng của quốc gia. </w:t>
       </w:r>
       <w:r>
         <w:t xml:space="preserve">Trong hệ thống tiền pháp định không có bản vị vàng nên lượng tài sản dôi dư tương ứng với 200,000 đồng tiền vàng, </w:t>
@@ -19976,11 +20355,7 @@
         <w:t xml:space="preserve"> </w:t>
       </w:r>
       <w:r>
-        <w:t xml:space="preserve">Nếu lượng tiền giấy vượt mức như 900,000 thì số lượng thừa 100,000 = 900,000 – 8000,000 sẽ quay trở lại </w:t>
-      </w:r>
-      <w:r>
-        <w:lastRenderedPageBreak/>
-        <w:t xml:space="preserve">ngân hàng do người dân có xu hướng đến ngân hàng đổi tiền giấy thừa để lấy đồng tiền vàng nên buộc ngân hàng phải gánh giữ </w:t>
+        <w:t xml:space="preserve">Nếu lượng tiền giấy vượt mức như 900,000 thì số lượng thừa 100,000 = 900,000 – 8000,000 sẽ quay trở lại ngân hàng do người dân có xu hướng đến ngân hàng đổi tiền giấy thừa để lấy đồng tiền vàng nên buộc ngân hàng phải gánh giữ </w:t>
       </w:r>
       <w:r>
         <w:t xml:space="preserve">thêm </w:t>
@@ -20195,7 +20570,11 @@
         <w:t>V</w:t>
       </w:r>
       <w:r>
-        <w:t xml:space="preserve"> là tốc độ lưu thông tiền tệ tức số lần mà một đơn vị tiền tệ được sử dụng để mua hàng hóa dịch vụ trong một khoảng thời gian, </w:t>
+        <w:t xml:space="preserve"> là tốc độ lưu thông tiền tệ tức số lần mà một đơn vị tiền tệ được sử dụng để mua hàng </w:t>
+      </w:r>
+      <w:r>
+        <w:lastRenderedPageBreak/>
+        <w:t xml:space="preserve">hóa dịch vụ trong một khoảng thời gian, </w:t>
       </w:r>
       <w:r>
         <w:rPr>
@@ -21155,167 +21534,167 @@
         <w:t xml:space="preserve"> GDP danh nghĩa không quan tâm đến lạm phát. </w:t>
       </w:r>
       <w:r>
-        <w:t xml:space="preserve">Lưu ý, </w:t>
+        <w:t xml:space="preserve">Lưu ý, tích </w:t>
+      </w:r>
+      <w:r>
+        <w:rPr>
+          <w:i/>
+        </w:rPr>
+        <w:t>P</w:t>
+      </w:r>
+      <w:r>
+        <w:t>*</w:t>
+      </w:r>
+      <w:r>
+        <w:rPr>
+          <w:i/>
+        </w:rPr>
+        <w:t>Q</w:t>
+      </w:r>
+      <w:r>
+        <w:t xml:space="preserve"> là tổng thu nhập Smith hay thu nhập ròng Smith được lượng giá tương đương với GDP danh nghĩa</w:t>
+      </w:r>
+      <w:r>
+        <w:t xml:space="preserve"> nhưng thực chất tổng thu nhập Smith nhỏ hơn GDP danh nghĩa lẫn GDP thực</w:t>
+      </w:r>
+      <w:r>
+        <w:t xml:space="preserve">. </w:t>
+      </w:r>
+      <w:r>
+        <w:t>V</w:t>
+      </w:r>
+      <w:r>
+        <w:t xml:space="preserve">ới GDP thực </w:t>
+      </w:r>
+      <w:r>
+        <w:t>thì</w:t>
+      </w:r>
+      <w:r>
+        <w:t xml:space="preserve"> tích </w:t>
+      </w:r>
+      <w:r>
+        <w:rPr>
+          <w:i/>
+        </w:rPr>
+        <w:t>P</w:t>
+      </w:r>
+      <w:r>
+        <w:t>*</w:t>
+      </w:r>
+      <w:r>
+        <w:rPr>
+          <w:i/>
+        </w:rPr>
+        <w:t>Q</w:t>
+      </w:r>
+      <w:r>
+        <w:t xml:space="preserve"> được tính với </w:t>
+      </w:r>
+      <w:r>
+        <w:rPr>
+          <w:i/>
+        </w:rPr>
+        <w:t>P</w:t>
+      </w:r>
+      <w:r>
+        <w:t xml:space="preserve"> năm gốc và </w:t>
+      </w:r>
+      <w:r>
+        <w:rPr>
+          <w:i/>
+        </w:rPr>
+        <w:t>Q</w:t>
+      </w:r>
+      <w:r>
+        <w:t xml:space="preserve"> năm nay, nên </w:t>
+      </w:r>
+      <w:r>
+        <w:t xml:space="preserve">GDP thực </w:t>
+      </w:r>
+      <w:r>
+        <w:t>quan tâm đến lạm phát</w:t>
+      </w:r>
+      <w:r>
+        <w:t xml:space="preserve"> (</w:t>
+      </w:r>
+      <w:r>
+        <w:t>Google AI 2026</w:t>
+      </w:r>
+      <w:r>
+        <w:t>)</w:t>
+      </w:r>
+      <w:r>
+        <w:t xml:space="preserve">. Tỉ số giữa GDP danh nghĩa và GDP thực được gọi là </w:t>
+      </w:r>
+      <w:r>
+        <w:rPr>
+          <w:i/>
+        </w:rPr>
+        <w:t>chỉ số khử lạm phát</w:t>
+      </w:r>
+      <w:r>
+        <w:t xml:space="preserve"> </w:t>
+      </w:r>
+      <w:r>
+        <w:t>/ chỉ số giảm phát GDP (</w:t>
+      </w:r>
+      <w:r>
+        <w:t xml:space="preserve">GDP </w:t>
+      </w:r>
+      <w:r>
+        <w:t>d</w:t>
+      </w:r>
+      <w:r>
+        <w:t>eflator</w:t>
+      </w:r>
+      <w:r>
+        <w:t xml:space="preserve">) </w:t>
+      </w:r>
+      <w:r>
+        <w:t>cho biết bao nhiêu phần trăm trong tăng trưởng GDP do giá cả tăng</w:t>
+      </w:r>
+      <w:r>
+        <w:t xml:space="preserve"> chứ không phải do sản xuất tăng</w:t>
+      </w:r>
+      <w:r>
+        <w:t xml:space="preserve"> (</w:t>
+      </w:r>
+      <w:r>
+        <w:t>Google AI 2026</w:t>
+      </w:r>
+      <w:r>
+        <w:t>)</w:t>
+      </w:r>
+      <w:r>
+        <w:t>. Như vậy ta có hai cách hiểu tương đương về lạm phát: 1) lạm phát là lượng tiền lưu thông nhiều hơn lượng hàng hóa trên thị trường, một cách chính xác, lượng tiền lưu thông quá mức cần thiết để hàng hóa trên thị trường trao đổi, 2)</w:t>
+      </w:r>
+      <w:r>
+        <w:t xml:space="preserve"> lạm phát là hiện tượng mà mức giá chung của hàng hóa dịch vụ tăng lên</w:t>
+      </w:r>
+      <w:r>
+        <w:t xml:space="preserve"> liên tục, kéo theo sụt giảm sức mua của đồng tiền (sự sụt giảm giá trị tiền tệ) (</w:t>
+      </w:r>
+      <w:r>
+        <w:t>Google AI 2026</w:t>
+      </w:r>
+      <w:r>
+        <w:t xml:space="preserve">). </w:t>
+      </w:r>
+      <w:r>
+        <w:t xml:space="preserve">Hai cách hiểu này tương đương vì giá cả tăng vọt đòi hỏi lượng tiền lưu thông nhiều hơn cần thiết. </w:t>
+      </w:r>
+      <w:r>
+        <w:t xml:space="preserve">Có ba nguyên nhân chính dẫn đến lạm phát: 1) lạm phát do cầu kéo </w:t>
+      </w:r>
+      <w:r>
+        <w:t xml:space="preserve">tức </w:t>
+      </w:r>
+      <w:r>
+        <w:t xml:space="preserve">cầu vượt </w:t>
       </w:r>
       <w:r>
         <w:lastRenderedPageBreak/>
-        <w:t xml:space="preserve">tích </w:t>
-      </w:r>
-      <w:r>
-        <w:rPr>
-          <w:i/>
-        </w:rPr>
-        <w:t>P</w:t>
-      </w:r>
-      <w:r>
-        <w:t>*</w:t>
-      </w:r>
-      <w:r>
-        <w:rPr>
-          <w:i/>
-        </w:rPr>
-        <w:t>Q</w:t>
-      </w:r>
-      <w:r>
-        <w:t xml:space="preserve"> là tổng thu nhập Smith hay thu nhập ròng Smith được lượng giá tương đương với GDP danh nghĩa</w:t>
-      </w:r>
-      <w:r>
-        <w:t xml:space="preserve"> nhưng thực chất tổng thu nhập Smith nhỏ hơn GDP danh nghĩa lẫn GDP thực</w:t>
-      </w:r>
-      <w:r>
-        <w:t xml:space="preserve">. </w:t>
-      </w:r>
-      <w:r>
-        <w:t>V</w:t>
-      </w:r>
-      <w:r>
-        <w:t xml:space="preserve">ới GDP thực </w:t>
-      </w:r>
-      <w:r>
-        <w:t>thì</w:t>
-      </w:r>
-      <w:r>
-        <w:t xml:space="preserve"> tích </w:t>
-      </w:r>
-      <w:r>
-        <w:rPr>
-          <w:i/>
-        </w:rPr>
-        <w:t>P</w:t>
-      </w:r>
-      <w:r>
-        <w:t>*</w:t>
-      </w:r>
-      <w:r>
-        <w:rPr>
-          <w:i/>
-        </w:rPr>
-        <w:t>Q</w:t>
-      </w:r>
-      <w:r>
-        <w:t xml:space="preserve"> được tính với </w:t>
-      </w:r>
-      <w:r>
-        <w:rPr>
-          <w:i/>
-        </w:rPr>
-        <w:t>P</w:t>
-      </w:r>
-      <w:r>
-        <w:t xml:space="preserve"> năm gốc và </w:t>
-      </w:r>
-      <w:r>
-        <w:rPr>
-          <w:i/>
-        </w:rPr>
-        <w:t>Q</w:t>
-      </w:r>
-      <w:r>
-        <w:t xml:space="preserve"> năm nay, nên </w:t>
-      </w:r>
-      <w:r>
-        <w:t xml:space="preserve">GDP thực </w:t>
-      </w:r>
-      <w:r>
-        <w:t>quan tâm đến lạm phát</w:t>
-      </w:r>
-      <w:r>
-        <w:t xml:space="preserve"> (</w:t>
-      </w:r>
-      <w:r>
-        <w:t>Google AI 2026</w:t>
-      </w:r>
-      <w:r>
-        <w:t>)</w:t>
-      </w:r>
-      <w:r>
-        <w:t xml:space="preserve">. Tỉ số giữa GDP danh nghĩa và GDP thực được gọi là </w:t>
-      </w:r>
-      <w:r>
-        <w:rPr>
-          <w:i/>
-        </w:rPr>
-        <w:t>chỉ số khử lạm phát</w:t>
-      </w:r>
-      <w:r>
-        <w:t xml:space="preserve"> </w:t>
-      </w:r>
-      <w:r>
-        <w:t>/ chỉ số giảm phát GDP (</w:t>
-      </w:r>
-      <w:r>
-        <w:t xml:space="preserve">GDP </w:t>
-      </w:r>
-      <w:r>
-        <w:t>d</w:t>
-      </w:r>
-      <w:r>
-        <w:t>eflator</w:t>
-      </w:r>
-      <w:r>
-        <w:t xml:space="preserve">) </w:t>
-      </w:r>
-      <w:r>
-        <w:t>cho biết bao nhiêu phần trăm trong tăng trưởng GDP do giá cả tăng</w:t>
-      </w:r>
-      <w:r>
-        <w:t xml:space="preserve"> chứ không phải do sản xuất tăng</w:t>
-      </w:r>
-      <w:r>
-        <w:t xml:space="preserve"> (</w:t>
-      </w:r>
-      <w:r>
-        <w:t>Google AI 2026</w:t>
-      </w:r>
-      <w:r>
-        <w:t>)</w:t>
-      </w:r>
-      <w:r>
-        <w:t>. Như vậy ta có hai cách hiểu tương đương về lạm phát: 1) lạm phát là lượng tiền lưu thông nhiều hơn lượng hàng hóa trên thị trường, một cách chính xác, lượng tiền lưu thông quá mức cần thiết để hàng hóa trên thị trường trao đổi, 2)</w:t>
-      </w:r>
-      <w:r>
-        <w:t xml:space="preserve"> lạm phát là hiện tượng mà mức giá chung của hàng hóa dịch vụ tăng lên</w:t>
-      </w:r>
-      <w:r>
-        <w:t xml:space="preserve"> liên tục, kéo theo sụt giảm sức mua của đồng tiền (sự sụt giảm giá trị tiền tệ) (</w:t>
-      </w:r>
-      <w:r>
-        <w:t>Google AI 2026</w:t>
-      </w:r>
-      <w:r>
-        <w:t xml:space="preserve">). </w:t>
-      </w:r>
-      <w:r>
-        <w:t xml:space="preserve">Hai cách hiểu này tương đương vì giá cả tăng vọt đòi hỏi lượng tiền lưu thông nhiều hơn cần thiết. </w:t>
-      </w:r>
-      <w:r>
-        <w:t xml:space="preserve">Có ba nguyên nhân chính dẫn đến lạm phát: 1) lạm phát do cầu kéo </w:t>
-      </w:r>
-      <w:r>
-        <w:t xml:space="preserve">tức </w:t>
-      </w:r>
-      <w:r>
-        <w:t xml:space="preserve">cầu vượt quá cung khiến giá cả leo thang, 2) lạm phát do chi phí đẩy </w:t>
+        <w:t xml:space="preserve">quá cung khiến giá cả leo thang, 2) lạm phát do chi phí đẩy </w:t>
       </w:r>
       <w:r>
         <w:t>khi</w:t>
@@ -21741,14 +22120,7 @@
         <w:rPr>
           <w:noProof/>
         </w:rPr>
-        <w:t xml:space="preserve"> (H. T. Đỗ, T. P. Trần, Eds., &amp; H. T. Đỗ, Trans.) Hanoi, Vietnam (1997): Vietnam Education Publishing House. Retrieved from </w:t>
-      </w:r>
-      <w:r>
-        <w:rPr>
-          <w:noProof/>
-        </w:rPr>
-        <w:lastRenderedPageBreak/>
-        <w:t>https://www.scribd.com/document/633319064/Cua-Cai-Cua-Cac-Dan-Toc-Adam-Smith</w:t>
+        <w:t xml:space="preserve"> (H. T. Đỗ, T. P. Trần, Eds., &amp; H. T. Đỗ, Trans.) Hanoi, Vietnam (1997): Vietnam Education Publishing House. Retrieved from https://www.scribd.com/document/633319064/Cua-Cai-Cua-Cac-Dan-Toc-Adam-Smith</w:t>
       </w:r>
     </w:p>
     <w:p>
@@ -22314,7 +22686,7 @@
           <w:rPr>
             <w:noProof/>
           </w:rPr>
-          <w:t>41</w:t>
+          <w:t>43</w:t>
         </w:r>
         <w:r>
           <w:rPr>
@@ -23425,7 +23797,7 @@
 </file>
 
 <file path=customXml/itemProps1.xml><?xml version="1.0" encoding="utf-8"?>
-<ds:datastoreItem xmlns:ds="http://schemas.openxmlformats.org/officeDocument/2006/customXml" ds:itemID="{0AC15DCA-DE26-4C7F-A69B-E373150AFABC}">
+<ds:datastoreItem xmlns:ds="http://schemas.openxmlformats.org/officeDocument/2006/customXml" ds:itemID="{2E8B8466-DB70-47AF-AD32-C81E27D481C1}">
   <ds:schemaRefs>
     <ds:schemaRef ds:uri="http://schemas.openxmlformats.org/officeDocument/2006/bibliography"/>
   </ds:schemaRefs>

</xml_diff>